<commit_message>
Deutsch 11: Szenen ohne Freeze spielen, Auswertung danach; eigene Ideen mit Notfall-Input; Regieplan
Co-Authored-By: Claude Opus 5.5 <noreply@anthropic.com>
Claude-Session: https://claude.ai/code/session_01Kzh1oWiqhC6W8oSNq8mKnj
</commit_message>
<xml_diff>
--- a/Deutsch_11/Kommunikationsstoerungen_loesen/Arbeitsblatt_Kommunikationsstoerungen_loesen.docx
+++ b/Deutsch_11/Kommunikationsstoerungen_loesen/Arbeitsblatt_Kommunikationsstoerungen_loesen.docx
@@ -1860,7 +1860,7 @@
           <w:sz w:val="18"/>
           <w:szCs w:val="18"/>
         </w:rPr>
-        <w:t xml:space="preserve">AUFGABE 2 · PARTNERARBEIT · 10 MIN.</w:t>
+        <w:t xml:space="preserve">AUFGABE 2 · PARTNERARBEIT · 8 MIN.</w:t>
       </w:r>
     </w:p>
     <w:p>
@@ -3076,7 +3076,7 @@
           <w:sz w:val="18"/>
           <w:szCs w:val="18"/>
         </w:rPr>
-        <w:t xml:space="preserve">AUFGABE 3 · GRUPPENPUZZLE · 20 MIN.</w:t>
+        <w:t xml:space="preserve">AUFGABE 3 · GRUPPENPUZZLE · 17 MIN.</w:t>
       </w:r>
     </w:p>
     <w:p>
@@ -3157,7 +3157,7 @@
           <w:sz w:val="22"/>
           <w:szCs w:val="22"/>
         </w:rPr>
-        <w:t xml:space="preserve"> ihre Expertenkarte (5 Min.).</w:t>
+        <w:t xml:space="preserve"> ihre Expertenkarte (4 Min.).</w:t>
       </w:r>
     </w:p>
     <w:p>
@@ -3193,7 +3193,7 @@
           <w:sz w:val="22"/>
           <w:szCs w:val="22"/>
         </w:rPr>
-        <w:t xml:space="preserve">höchstens 2 Minuten</w:t>
+        <w:t xml:space="preserve">höchstens 90 Sekunden</w:t>
       </w:r>
       <w:r>
         <w:rPr>
@@ -4940,7 +4940,7 @@
           <w:sz w:val="18"/>
           <w:szCs w:val="18"/>
         </w:rPr>
-        <w:t xml:space="preserve">AUFGABE 4 · GRUPPE · 20 MIN.</w:t>
+        <w:t xml:space="preserve">AUFGABE 4 · GRUPPE · 17 MIN.</w:t>
       </w:r>
     </w:p>
     <w:p>
@@ -5040,13 +5040,47 @@
       <w:r>
         <w:rPr>
           <w:rFonts w:ascii="Calibri" w:cs="Calibri" w:eastAsia="Calibri" w:hAnsi="Calibri"/>
+          <w:color w:val="000000"/>
+          <w:sz w:val="22"/>
+          <w:szCs w:val="22"/>
+        </w:rPr>
+        <w:t xml:space="preserve">Denkt euch die Situation </w:t>
+      </w:r>
+      <w:r>
+        <w:rPr>
+          <w:rFonts w:ascii="Calibri" w:cs="Calibri" w:eastAsia="Calibri" w:hAnsi="Calibri"/>
           <w:b/>
           <w:bCs/>
           <w:color w:val="000000"/>
           <w:sz w:val="22"/>
           <w:szCs w:val="22"/>
         </w:rPr>
-        <w:t xml:space="preserve">Keine Idee? </w:t>
+        <w:t xml:space="preserve">selbst</w:t>
+      </w:r>
+      <w:r>
+        <w:rPr>
+          <w:rFonts w:ascii="Calibri" w:cs="Calibri" w:eastAsia="Calibri" w:hAnsi="Calibri"/>
+          <w:color w:val="000000"/>
+          <w:sz w:val="22"/>
+          <w:szCs w:val="22"/>
+        </w:rPr>
+        <w:t xml:space="preserve"> aus – am besten eine, die ihr so oder ähnlich schon erlebt habt: Familie, Freunde, Schule, Verein, Job, Chat …</w:t>
+      </w:r>
+    </w:p>
+    <w:p>
+      <w:pPr>
+        <w:spacing w:after="60" w:before="0"/>
+      </w:pPr>
+      <w:r>
+        <w:rPr>
+          <w:rFonts w:ascii="Calibri" w:cs="Calibri" w:eastAsia="Calibri" w:hAnsi="Calibri"/>
+          <w:b/>
+          <w:bCs/>
+          <w:color w:val="000000"/>
+          <w:sz w:val="22"/>
+          <w:szCs w:val="22"/>
+        </w:rPr>
+        <w:t xml:space="preserve">Nach 5 Minuten noch keine Idee? </w:t>
       </w:r>
       <w:r>
         <w:rPr>
@@ -5057,7 +5091,7 @@
           <w:sz w:val="22"/>
           <w:szCs w:val="22"/>
         </w:rPr>
-        <w:t xml:space="preserve">Die Material-Person zieht eine Situationskarte.</w:t>
+        <w:t xml:space="preserve">Material-Person holt Tippkarte 1 für Aufgabe 4. Hilft auch die nicht, hat die Lehrkraft eine Notfall-Idee.</w:t>
       </w:r>
     </w:p>
     <w:tbl>
@@ -5119,7 +5153,7 @@
                 <w:sz w:val="20"/>
                 <w:szCs w:val="20"/>
               </w:rPr>
-              <w:t xml:space="preserve">2–4 Rollen · jede Version höchstens 2 Minuten · Text darf auf Karteikarten mitgenommen werden · </w:t>
+              <w:t xml:space="preserve">2–4 Rollen · jede Version höchstens 90 Sekunden · Stichpunkte dürfen auf Karteikarten mit auf die Bühne · </w:t>
             </w:r>
             <w:r>
               <w:rPr>
@@ -6097,7 +6131,7 @@
           <w:sz w:val="18"/>
           <w:szCs w:val="18"/>
         </w:rPr>
-        <w:t xml:space="preserve">AUFGABE 5 · BÜHNE FREI · 30 MIN.</w:t>
+        <w:t xml:space="preserve">AUFGABE 5 · BÜHNE FREI · 25 MIN. + AUSWERTUNG 13 MIN.</w:t>
       </w:r>
     </w:p>
     <w:p>
@@ -6118,7 +6152,7 @@
     </w:p>
     <w:p>
       <w:pPr>
-        <w:spacing w:after="80" w:before="0"/>
+        <w:spacing w:after="60" w:before="0"/>
       </w:pPr>
       <w:r>
         <w:rPr>
@@ -6129,7 +6163,7 @@
           <w:sz w:val="22"/>
           <w:szCs w:val="22"/>
         </w:rPr>
-        <w:t xml:space="preserve">So läuft es: </w:t>
+        <w:t xml:space="preserve">Spielen: </w:t>
       </w:r>
       <w:r>
         <w:rPr>
@@ -6138,7 +6172,7 @@
           <w:sz w:val="22"/>
           <w:szCs w:val="22"/>
         </w:rPr>
-        <w:t xml:space="preserve">Eine Gruppe spielt </w:t>
+        <w:t xml:space="preserve">Jede Gruppe spielt </w:t>
       </w:r>
       <w:r>
         <w:rPr>
@@ -6158,18 +6192,18 @@
           <w:sz w:val="22"/>
           <w:szCs w:val="22"/>
         </w:rPr>
-        <w:t xml:space="preserve">. Sobald du merkst, dass das Gespräch kippt, hältst du deine </w:t>
+        <w:t xml:space="preserve"> und direkt danach </w:t>
       </w:r>
       <w:r>
         <w:rPr>
           <w:rFonts w:ascii="Calibri" w:cs="Calibri" w:eastAsia="Calibri" w:hAnsi="Calibri"/>
           <w:b/>
           <w:bCs/>
-          <w:color w:val="D9534F"/>
+          <w:color w:val="2E9E6B"/>
           <w:sz w:val="22"/>
           <w:szCs w:val="22"/>
         </w:rPr>
-        <w:t xml:space="preserve">STOPP-Karte</w:t>
+        <w:t xml:space="preserve">Version B</w:t>
       </w:r>
       <w:r>
         <w:rPr>
@@ -6178,7 +6212,7 @@
           <w:sz w:val="22"/>
           <w:szCs w:val="22"/>
         </w:rPr>
-        <w:t xml:space="preserve"> hoch. Die Moderation ruft </w:t>
+        <w:t xml:space="preserve"> – ohne Unterbrechung. Nach jeder Gruppe hast du </w:t>
       </w:r>
       <w:r>
         <w:rPr>
@@ -6189,7 +6223,7 @@
           <w:sz w:val="22"/>
           <w:szCs w:val="22"/>
         </w:rPr>
-        <w:t xml:space="preserve">„Freeze!“</w:t>
+        <w:t xml:space="preserve">30 Sekunden</w:t>
       </w:r>
       <w:r>
         <w:rPr>
@@ -6198,18 +6232,23 @@
           <w:sz w:val="22"/>
           <w:szCs w:val="22"/>
         </w:rPr>
-        <w:t xml:space="preserve"> – die Spielenden erstarren. Eine Person mit Karte sagt in einem Satz, was gerade passiert ist. Danach geht es weiter, direkt im Anschluss folgt </w:t>
-      </w:r>
+        <w:t xml:space="preserve">, um die Zeile im Bogen auszufüllen.</w:t>
+      </w:r>
+    </w:p>
+    <w:p>
+      <w:pPr>
+        <w:spacing w:after="60" w:before="0"/>
+      </w:pPr>
       <w:r>
         <w:rPr>
           <w:rFonts w:ascii="Calibri" w:cs="Calibri" w:eastAsia="Calibri" w:hAnsi="Calibri"/>
           <w:b/>
           <w:bCs/>
-          <w:color w:val="2E9E6B"/>
+          <w:color w:val="1E2761"/>
           <w:sz w:val="22"/>
           <w:szCs w:val="22"/>
         </w:rPr>
-        <w:t xml:space="preserve">Version B</w:t>
+        <w:t xml:space="preserve">Patenszene: </w:t>
       </w:r>
       <w:r>
         <w:rPr>
@@ -6218,7 +6257,27 @@
           <w:sz w:val="22"/>
           <w:szCs w:val="22"/>
         </w:rPr>
-        <w:t xml:space="preserve">.</w:t>
+        <w:t xml:space="preserve">Die Gruppe, die </w:t>
+      </w:r>
+      <w:r>
+        <w:rPr>
+          <w:rFonts w:ascii="Calibri" w:cs="Calibri" w:eastAsia="Calibri" w:hAnsi="Calibri"/>
+          <w:b/>
+          <w:bCs/>
+          <w:color w:val="000000"/>
+          <w:sz w:val="22"/>
+          <w:szCs w:val="22"/>
+        </w:rPr>
+        <w:t xml:space="preserve">nach euch</w:t>
+      </w:r>
+      <w:r>
+        <w:rPr>
+          <w:rFonts w:ascii="Calibri" w:cs="Calibri" w:eastAsia="Calibri" w:hAnsi="Calibri"/>
+          <w:color w:val="000000"/>
+          <w:sz w:val="22"/>
+          <w:szCs w:val="22"/>
+        </w:rPr>
+        <w:t xml:space="preserve"> spielt, beobachtet ihr besonders genau (die letzte Gruppe beobachtet Gruppe 1). Zu ihr berichtet ihr in der Auswertung. Markiere sie mit ★.</w:t>
       </w:r>
     </w:p>
     <w:p>
@@ -6228,31 +6287,22 @@
       <w:r>
         <w:rPr>
           <w:rFonts w:ascii="Calibri" w:cs="Calibri" w:eastAsia="Calibri" w:hAnsi="Calibri"/>
+          <w:b/>
+          <w:bCs/>
+          <w:color w:val="1E2761"/>
+          <w:sz w:val="22"/>
+          <w:szCs w:val="22"/>
+        </w:rPr>
+        <w:t xml:space="preserve">Auswertung: </w:t>
+      </w:r>
+      <w:r>
+        <w:rPr>
+          <w:rFonts w:ascii="Calibri" w:cs="Calibri" w:eastAsia="Calibri" w:hAnsi="Calibri"/>
           <w:color w:val="000000"/>
           <w:sz w:val="22"/>
           <w:szCs w:val="22"/>
         </w:rPr>
-        <w:t xml:space="preserve">Notiere während des Spiels in Stichpunkten. Die Moderation übernimmt immer die Gruppe, die als </w:t>
-      </w:r>
-      <w:r>
-        <w:rPr>
-          <w:rFonts w:ascii="Calibri" w:cs="Calibri" w:eastAsia="Calibri" w:hAnsi="Calibri"/>
-          <w:b/>
-          <w:bCs/>
-          <w:color w:val="000000"/>
-          <w:sz w:val="22"/>
-          <w:szCs w:val="22"/>
-        </w:rPr>
-        <w:t xml:space="preserve">nächste</w:t>
-      </w:r>
-      <w:r>
-        <w:rPr>
-          <w:rFonts w:ascii="Calibri" w:cs="Calibri" w:eastAsia="Calibri" w:hAnsi="Calibri"/>
-          <w:color w:val="000000"/>
-          <w:sz w:val="22"/>
-          <w:szCs w:val="22"/>
-        </w:rPr>
-        <w:t xml:space="preserve"> spielt.</w:t>
+        <w:t xml:space="preserve">erst 2 Min. still ergänzen, dann 4 Min. in der Tischgruppe eure Patenszene besprechen, dann 1 Min. Rückmeldung pro Gruppe im Plenum.</w:t>
       </w:r>
     </w:p>
     <w:tbl>
@@ -6312,6 +6362,21 @@
                 <w:szCs w:val="20"/>
               </w:rPr>
               <w:t xml:space="preserve">Gruppe</w:t>
+            </w:r>
+          </w:p>
+          <w:p>
+            <w:pPr>
+              <w:spacing w:after="0" w:before="0"/>
+              <w:jc w:val="center"/>
+            </w:pPr>
+            <w:r>
+              <w:rPr>
+                <w:rFonts w:ascii="Calibri" w:cs="Calibri" w:eastAsia="Calibri" w:hAnsi="Calibri"/>
+                <w:color w:val="FFFFFF"/>
+                <w:sz w:val="15"/>
+                <w:szCs w:val="15"/>
+              </w:rPr>
+              <w:t xml:space="preserve">★ = Pate</w:t>
             </w:r>
           </w:p>
         </w:tc>

</xml_diff>

<commit_message>
Deutsch 11: Impuls EA/PA, danach drei Reihen-Gruppen à 7 (Wand, Mitte, Fenster)
Co-Authored-By: Claude Opus 5.5 <noreply@anthropic.com>
Claude-Session: https://claude.ai/code/session_01Kzh1oWiqhC6W8oSNq8mKnj
</commit_message>
<xml_diff>
--- a/Deutsch_11/Kommunikationsstoerungen_loesen/Arbeitsblatt_Kommunikationsstoerungen_loesen.docx
+++ b/Deutsch_11/Kommunikationsstoerungen_loesen/Arbeitsblatt_Kommunikationsstoerungen_loesen.docx
@@ -1764,7 +1764,7 @@
           <w:sz w:val="26"/>
           <w:szCs w:val="26"/>
         </w:rPr>
-        <w:t xml:space="preserve">Stummer Einstieg · allein, 3 Min.</w:t>
+        <w:t xml:space="preserve">Impuls · erst allein (3 Min.), dann zu zweit (2 Min.)</w:t>
       </w:r>
     </w:p>
     <w:p>
@@ -1834,7 +1834,7 @@
           <w:sz w:val="22"/>
           <w:szCs w:val="22"/>
         </w:rPr>
-        <w:t xml:space="preserve">Danach 2 Min. mit deinem Nachbarn: </w:t>
+        <w:t xml:space="preserve">Danach mit deinem Sitznachbarn: </w:t>
       </w:r>
       <w:r>
         <w:rPr>
@@ -1860,7 +1860,7 @@
           <w:sz w:val="18"/>
           <w:szCs w:val="18"/>
         </w:rPr>
-        <w:t xml:space="preserve">AUFGABE 2 · PARTNERARBEIT · 8 MIN.</w:t>
+        <w:t xml:space="preserve">AUFGABE 2 · PARTNERARBEIT · 10 MIN.</w:t>
       </w:r>
     </w:p>
     <w:p>
@@ -2025,7 +2025,7 @@
           <w:sz w:val="22"/>
           <w:szCs w:val="22"/>
         </w:rPr>
-        <w:t xml:space="preserve">Vergleicht mit dem Lösungsblatt am Pult (Material-Person holt es). Ergänzt, was euch fehlt, </w:t>
+        <w:t xml:space="preserve">Holt euch das Lösungsblatt vom Pult und vergleicht. Ergänzt, was euch fehlt, </w:t>
       </w:r>
       <w:r>
         <w:rPr>
@@ -3059,7 +3059,7 @@
           <w:sz w:val="20"/>
           <w:szCs w:val="20"/>
         </w:rPr>
-        <w:t xml:space="preserve">Erst in der Gruppe fragen, dann Tippkarte 2 holen.</w:t>
+        <w:t xml:space="preserve">Erst Tippkarte 1, dann Tippkarte 2 vom Pult holen.</w:t>
       </w:r>
     </w:p>
     <w:p>
@@ -3076,7 +3076,7 @@
           <w:sz w:val="18"/>
           <w:szCs w:val="18"/>
         </w:rPr>
-        <w:t xml:space="preserve">AUFGABE 3 · GRUPPENPUZZLE · 17 MIN.</w:t>
+        <w:t xml:space="preserve">AUFGABE 3 · GRUPPENPUZZLE · 3 GRUPPEN À 7 · 20 MIN.</w:t>
       </w:r>
     </w:p>
     <w:p>
@@ -3108,16 +3108,16 @@
           <w:sz w:val="22"/>
           <w:szCs w:val="22"/>
         </w:rPr>
-        <w:t xml:space="preserve">1. </w:t>
-      </w:r>
-      <w:r>
-        <w:rPr>
-          <w:rFonts w:ascii="Calibri" w:cs="Calibri" w:eastAsia="Calibri" w:hAnsi="Calibri"/>
-          <w:color w:val="000000"/>
-          <w:sz w:val="22"/>
-          <w:szCs w:val="22"/>
-        </w:rPr>
-        <w:t xml:space="preserve">Verteilt die Rollenkarten und die Expertenkarten </w:t>
+        <w:t xml:space="preserve">0. </w:t>
+      </w:r>
+      <w:r>
+        <w:rPr>
+          <w:rFonts w:ascii="Calibri" w:cs="Calibri" w:eastAsia="Calibri" w:hAnsi="Calibri"/>
+          <w:color w:val="000000"/>
+          <w:sz w:val="22"/>
+          <w:szCs w:val="22"/>
+        </w:rPr>
+        <w:t xml:space="preserve">Setzt euch in eure </w:t>
       </w:r>
       <w:r>
         <w:rPr>
@@ -3128,36 +3128,16 @@
           <w:sz w:val="22"/>
           <w:szCs w:val="22"/>
         </w:rPr>
-        <w:t xml:space="preserve">A–D</w:t>
-      </w:r>
-      <w:r>
-        <w:rPr>
-          <w:rFonts w:ascii="Calibri" w:cs="Calibri" w:eastAsia="Calibri" w:hAnsi="Calibri"/>
-          <w:color w:val="000000"/>
-          <w:sz w:val="22"/>
-          <w:szCs w:val="22"/>
-        </w:rPr>
-        <w:t xml:space="preserve">. Jede Person liest </w:t>
-      </w:r>
-      <w:r>
-        <w:rPr>
-          <w:rFonts w:ascii="Calibri" w:cs="Calibri" w:eastAsia="Calibri" w:hAnsi="Calibri"/>
-          <w:b/>
-          <w:bCs/>
-          <w:color w:val="000000"/>
-          <w:sz w:val="22"/>
-          <w:szCs w:val="22"/>
-        </w:rPr>
-        <w:t xml:space="preserve">allein</w:t>
-      </w:r>
-      <w:r>
-        <w:rPr>
-          <w:rFonts w:ascii="Calibri" w:cs="Calibri" w:eastAsia="Calibri" w:hAnsi="Calibri"/>
-          <w:color w:val="000000"/>
-          <w:sz w:val="22"/>
-          <w:szCs w:val="22"/>
-        </w:rPr>
-        <w:t xml:space="preserve"> ihre Expertenkarte (4 Min.).</w:t>
+        <w:t xml:space="preserve">Reihen-Gruppe</w:t>
+      </w:r>
+      <w:r>
+        <w:rPr>
+          <w:rFonts w:ascii="Calibri" w:cs="Calibri" w:eastAsia="Calibri" w:hAnsi="Calibri"/>
+          <w:color w:val="000000"/>
+          <w:sz w:val="22"/>
+          <w:szCs w:val="22"/>
+        </w:rPr>
+        <w:t xml:space="preserve"> (Wandreihe, Mittelreihe, Fensterreihe) und öffnet euren Umschlag. Verteilt die vier Rollenkarten.</w:t>
       </w:r>
     </w:p>
     <w:p>
@@ -3173,36 +3153,56 @@
           <w:sz w:val="22"/>
           <w:szCs w:val="22"/>
         </w:rPr>
-        <w:t xml:space="preserve">2. </w:t>
-      </w:r>
-      <w:r>
-        <w:rPr>
-          <w:rFonts w:ascii="Calibri" w:cs="Calibri" w:eastAsia="Calibri" w:hAnsi="Calibri"/>
-          <w:color w:val="000000"/>
-          <w:sz w:val="22"/>
-          <w:szCs w:val="22"/>
-        </w:rPr>
-        <w:t xml:space="preserve">Reihum erklärt jede Person ihre Strategie in </w:t>
+        <w:t xml:space="preserve">1. </w:t>
+      </w:r>
+      <w:r>
+        <w:rPr>
+          <w:rFonts w:ascii="Calibri" w:cs="Calibri" w:eastAsia="Calibri" w:hAnsi="Calibri"/>
+          <w:color w:val="000000"/>
+          <w:sz w:val="22"/>
+          <w:szCs w:val="22"/>
+        </w:rPr>
+        <w:t xml:space="preserve">Verteilt die Expertenkarten: </w:t>
       </w:r>
       <w:r>
         <w:rPr>
           <w:rFonts w:ascii="Calibri" w:cs="Calibri" w:eastAsia="Calibri" w:hAnsi="Calibri"/>
           <w:b/>
           <w:bCs/>
-          <w:color w:val="000000"/>
-          <w:sz w:val="22"/>
-          <w:szCs w:val="22"/>
-        </w:rPr>
-        <w:t xml:space="preserve">höchstens 90 Sekunden</w:t>
-      </w:r>
-      <w:r>
-        <w:rPr>
-          <w:rFonts w:ascii="Calibri" w:cs="Calibri" w:eastAsia="Calibri" w:hAnsi="Calibri"/>
-          <w:color w:val="000000"/>
-          <w:sz w:val="22"/>
-          <w:szCs w:val="22"/>
-        </w:rPr>
-        <w:t xml:space="preserve"> – mit dem Beispiel von der Karte.</w:t>
+          <w:color w:val="3F7CC4"/>
+          <w:sz w:val="22"/>
+          <w:szCs w:val="22"/>
+        </w:rPr>
+        <w:t xml:space="preserve">A</w:t>
+      </w:r>
+      <w:r>
+        <w:rPr>
+          <w:rFonts w:ascii="Calibri" w:cs="Calibri" w:eastAsia="Calibri" w:hAnsi="Calibri"/>
+          <w:color w:val="000000"/>
+          <w:sz w:val="22"/>
+          <w:szCs w:val="22"/>
+        </w:rPr>
+        <w:t xml:space="preserve"> liest eine Person allein, </w:t>
+      </w:r>
+      <w:r>
+        <w:rPr>
+          <w:rFonts w:ascii="Calibri" w:cs="Calibri" w:eastAsia="Calibri" w:hAnsi="Calibri"/>
+          <w:b/>
+          <w:bCs/>
+          <w:color w:val="000000"/>
+          <w:sz w:val="22"/>
+          <w:szCs w:val="22"/>
+        </w:rPr>
+        <w:t xml:space="preserve">B, C und D</w:t>
+      </w:r>
+      <w:r>
+        <w:rPr>
+          <w:rFonts w:ascii="Calibri" w:cs="Calibri" w:eastAsia="Calibri" w:hAnsi="Calibri"/>
+          <w:color w:val="000000"/>
+          <w:sz w:val="22"/>
+          <w:szCs w:val="22"/>
+        </w:rPr>
+        <w:t xml:space="preserve"> lesen je zwei Personen im Tandem (5 Min.).</w:t>
       </w:r>
     </w:p>
     <w:p>
@@ -3218,16 +3218,16 @@
           <w:sz w:val="22"/>
           <w:szCs w:val="22"/>
         </w:rPr>
-        <w:t xml:space="preserve">3. </w:t>
-      </w:r>
-      <w:r>
-        <w:rPr>
-          <w:rFonts w:ascii="Calibri" w:cs="Calibri" w:eastAsia="Calibri" w:hAnsi="Calibri"/>
-          <w:color w:val="000000"/>
-          <w:sz w:val="22"/>
-          <w:szCs w:val="22"/>
-        </w:rPr>
-        <w:t xml:space="preserve">Schreibt den Dialog </w:t>
+        <w:t xml:space="preserve">2. </w:t>
+      </w:r>
+      <w:r>
+        <w:rPr>
+          <w:rFonts w:ascii="Calibri" w:cs="Calibri" w:eastAsia="Calibri" w:hAnsi="Calibri"/>
+          <w:color w:val="000000"/>
+          <w:sz w:val="22"/>
+          <w:szCs w:val="22"/>
+        </w:rPr>
+        <w:t xml:space="preserve">Reihum erklärt jede Expertin, jeder Experte bzw. jedes Tandem die Strategie in </w:t>
       </w:r>
       <w:r>
         <w:rPr>
@@ -3238,6 +3238,51 @@
           <w:sz w:val="22"/>
           <w:szCs w:val="22"/>
         </w:rPr>
+        <w:t xml:space="preserve">höchstens 2 Minuten</w:t>
+      </w:r>
+      <w:r>
+        <w:rPr>
+          <w:rFonts w:ascii="Calibri" w:cs="Calibri" w:eastAsia="Calibri" w:hAnsi="Calibri"/>
+          <w:color w:val="000000"/>
+          <w:sz w:val="22"/>
+          <w:szCs w:val="22"/>
+        </w:rPr>
+        <w:t xml:space="preserve"> – mit dem Beispiel von der Karte (8 Min.).</w:t>
+      </w:r>
+    </w:p>
+    <w:p>
+      <w:pPr>
+        <w:spacing w:after="40" w:before="0"/>
+      </w:pPr>
+      <w:r>
+        <w:rPr>
+          <w:rFonts w:ascii="Calibri" w:cs="Calibri" w:eastAsia="Calibri" w:hAnsi="Calibri"/>
+          <w:b/>
+          <w:bCs/>
+          <w:color w:val="000000"/>
+          <w:sz w:val="22"/>
+          <w:szCs w:val="22"/>
+        </w:rPr>
+        <w:t xml:space="preserve">3. </w:t>
+      </w:r>
+      <w:r>
+        <w:rPr>
+          <w:rFonts w:ascii="Calibri" w:cs="Calibri" w:eastAsia="Calibri" w:hAnsi="Calibri"/>
+          <w:color w:val="000000"/>
+          <w:sz w:val="22"/>
+          <w:szCs w:val="22"/>
+        </w:rPr>
+        <w:t xml:space="preserve">Schreibt den Dialog </w:t>
+      </w:r>
+      <w:r>
+        <w:rPr>
+          <w:rFonts w:ascii="Calibri" w:cs="Calibri" w:eastAsia="Calibri" w:hAnsi="Calibri"/>
+          <w:b/>
+          <w:bCs/>
+          <w:color w:val="000000"/>
+          <w:sz w:val="22"/>
+          <w:szCs w:val="22"/>
+        </w:rPr>
         <w:t xml:space="preserve">ab Zeile 3</w:t>
       </w:r>
       <w:r>
@@ -3247,7 +3292,7 @@
           <w:sz w:val="22"/>
           <w:szCs w:val="22"/>
         </w:rPr>
-        <w:t xml:space="preserve"> neu. Nutzt mindestens drei der vier Strategien und notiert rechts den Buchstaben.</w:t>
+        <w:t xml:space="preserve"> gemeinsam neu – alle schreiben mit. Nutzt mindestens drei der vier Strategien und notiert rechts den Buchstaben (7 Min.).</w:t>
       </w:r>
     </w:p>
     <w:p>
@@ -4940,7 +4985,7 @@
           <w:sz w:val="18"/>
           <w:szCs w:val="18"/>
         </w:rPr>
-        <w:t xml:space="preserve">AUFGABE 4 · GRUPPE · 17 MIN.</w:t>
+        <w:t xml:space="preserve">AUFGABE 4 · REIHEN-GRUPPE · 20 MIN.</w:t>
       </w:r>
     </w:p>
     <w:p>
@@ -4970,7 +5015,27 @@
           <w:sz w:val="22"/>
           <w:szCs w:val="22"/>
         </w:rPr>
-        <w:t xml:space="preserve">Schreibt eine Alltagsszene in </w:t>
+        <w:t xml:space="preserve">Eure Gruppe entwickelt </w:t>
+      </w:r>
+      <w:r>
+        <w:rPr>
+          <w:rFonts w:ascii="Calibri" w:cs="Calibri" w:eastAsia="Calibri" w:hAnsi="Calibri"/>
+          <w:b/>
+          <w:bCs/>
+          <w:color w:val="000000"/>
+          <w:sz w:val="22"/>
+          <w:szCs w:val="22"/>
+        </w:rPr>
+        <w:t xml:space="preserve">eine</w:t>
+      </w:r>
+      <w:r>
+        <w:rPr>
+          <w:rFonts w:ascii="Calibri" w:cs="Calibri" w:eastAsia="Calibri" w:hAnsi="Calibri"/>
+          <w:color w:val="000000"/>
+          <w:sz w:val="22"/>
+          <w:szCs w:val="22"/>
+        </w:rPr>
+        <w:t xml:space="preserve"> Alltagsszene in </w:t>
       </w:r>
       <w:r>
         <w:rPr>
@@ -5153,7 +5218,27 @@
                 <w:sz w:val="20"/>
                 <w:szCs w:val="20"/>
               </w:rPr>
-              <w:t xml:space="preserve">2–4 Rollen · jede Version höchstens 90 Sekunden · Stichpunkte dürfen auf Karteikarten mit auf die Bühne · </w:t>
+              <w:t xml:space="preserve">2–4 Rollen pro Version · jede Version höchstens 2 Minuten · </w:t>
+            </w:r>
+            <w:r>
+              <w:rPr>
+                <w:rFonts w:ascii="Calibri" w:cs="Calibri" w:eastAsia="Calibri" w:hAnsi="Calibri"/>
+                <w:b/>
+                <w:bCs/>
+                <w:color w:val="000000"/>
+                <w:sz w:val="20"/>
+                <w:szCs w:val="20"/>
+              </w:rPr>
+              <w:t xml:space="preserve">Version A und B spielen verschiedene Personen</w:t>
+            </w:r>
+            <w:r>
+              <w:rPr>
+                <w:rFonts w:ascii="Calibri" w:cs="Calibri" w:eastAsia="Calibri" w:hAnsi="Calibri"/>
+                <w:color w:val="000000"/>
+                <w:sz w:val="20"/>
+                <w:szCs w:val="20"/>
+              </w:rPr>
+              <w:t xml:space="preserve"> – wer nicht spielt, führt Regie · Stichpunkte auf Karteikarten sind erlaubt · </w:t>
             </w:r>
             <w:r>
               <w:rPr>
@@ -5292,7 +5377,7 @@
       <w:tr>
         <w:trPr>
           <w:cantSplit/>
-          <w:trHeight w:val="700" w:hRule="atLeast"/>
+          <w:trHeight w:val="600" w:hRule="atLeast"/>
         </w:trPr>
         <w:tc>
           <w:tcPr>
@@ -5325,7 +5410,96 @@
                 <w:sz w:val="20"/>
                 <w:szCs w:val="20"/>
               </w:rPr>
-              <w:t xml:space="preserve">Rollen</w:t>
+              <w:t xml:space="preserve">Besetzung A</w:t>
+            </w:r>
+          </w:p>
+          <w:p>
+            <w:pPr>
+              <w:spacing w:after="0" w:before="0"/>
+            </w:pPr>
+            <w:r>
+              <w:rPr>
+                <w:rFonts w:ascii="Calibri" w:cs="Calibri" w:eastAsia="Calibri" w:hAnsi="Calibri"/>
+                <w:i/>
+                <w:iCs/>
+                <w:color w:val="5B6B8C"/>
+                <w:sz w:val="16"/>
+                <w:szCs w:val="16"/>
+              </w:rPr>
+              <w:t xml:space="preserve">Figur → gespielt von</w:t>
+            </w:r>
+          </w:p>
+        </w:tc>
+        <w:tc>
+          <w:tcPr>
+            <w:tcW w:type="dxa" w:w="7606"/>
+            <w:tcBorders>
+              <w:top w:val="single" w:color="B9C6E8" w:sz="6"/>
+              <w:left w:val="single" w:color="B9C6E8" w:sz="6"/>
+              <w:bottom w:val="single" w:color="B9C6E8" w:sz="6"/>
+              <w:right w:val="single" w:color="B9C6E8" w:sz="6"/>
+            </w:tcBorders>
+            <w:tcMar>
+              <w:top w:type="dxa" w:w="60"/>
+              <w:left w:type="dxa" w:w="100"/>
+              <w:bottom w:type="dxa" w:w="60"/>
+              <w:right w:type="dxa" w:w="100"/>
+            </w:tcMar>
+            <w:vAlign w:val="center"/>
+          </w:tcPr>
+          <w:p>
+            <w:pPr>
+              <w:spacing w:after="100" w:before="0"/>
+            </w:pPr>
+            <w:r>
+              <w:rPr>
+                <w:rFonts w:ascii="Calibri" w:cs="Calibri" w:eastAsia="Calibri" w:hAnsi="Calibri"/>
+                <w:color w:val="000000"/>
+                <w:sz w:val="22"/>
+                <w:szCs w:val="22"/>
+              </w:rPr>
+              <w:t xml:space="preserve"/>
+            </w:r>
+          </w:p>
+        </w:tc>
+      </w:tr>
+      <w:tr>
+        <w:trPr>
+          <w:cantSplit/>
+          <w:trHeight w:val="600" w:hRule="atLeast"/>
+        </w:trPr>
+        <w:tc>
+          <w:tcPr>
+            <w:tcW w:type="dxa" w:w="2600"/>
+            <w:tcBorders>
+              <w:top w:val="single" w:color="B9C6E8" w:sz="6"/>
+              <w:left w:val="single" w:color="B9C6E8" w:sz="6"/>
+              <w:bottom w:val="single" w:color="B9C6E8" w:sz="6"/>
+              <w:right w:val="single" w:color="B9C6E8" w:sz="6"/>
+            </w:tcBorders>
+            <w:shd w:fill="F4F7FD" w:color="auto" w:val="clear"/>
+            <w:tcMar>
+              <w:top w:type="dxa" w:w="60"/>
+              <w:left w:type="dxa" w:w="100"/>
+              <w:bottom w:type="dxa" w:w="60"/>
+              <w:right w:type="dxa" w:w="100"/>
+            </w:tcMar>
+            <w:vAlign w:val="top"/>
+          </w:tcPr>
+          <w:p>
+            <w:pPr>
+              <w:spacing w:after="0" w:before="0"/>
+            </w:pPr>
+            <w:r>
+              <w:rPr>
+                <w:rFonts w:ascii="Calibri" w:cs="Calibri" w:eastAsia="Calibri" w:hAnsi="Calibri"/>
+                <w:b/>
+                <w:bCs/>
+                <w:color w:val="1E2761"/>
+                <w:sz w:val="20"/>
+                <w:szCs w:val="20"/>
+              </w:rPr>
+              <w:t xml:space="preserve">Besetzung B</w:t>
             </w:r>
           </w:p>
           <w:p>
@@ -6131,7 +6305,7 @@
           <w:sz w:val="18"/>
           <w:szCs w:val="18"/>
         </w:rPr>
-        <w:t xml:space="preserve">AUFGABE 5 · BÜHNE FREI · 25 MIN. + AUSWERTUNG 13 MIN.</w:t>
+        <w:t xml:space="preserve">AUFGABE 5 · BÜHNE FREI · 15 MIN. + AUSWERTUNG 13 MIN.</w:t>
       </w:r>
     </w:p>
     <w:p>
@@ -6172,7 +6346,27 @@
           <w:sz w:val="22"/>
           <w:szCs w:val="22"/>
         </w:rPr>
-        <w:t xml:space="preserve">Jede Gruppe spielt </w:t>
+        <w:t xml:space="preserve">Reihenfolge </w:t>
+      </w:r>
+      <w:r>
+        <w:rPr>
+          <w:rFonts w:ascii="Calibri" w:cs="Calibri" w:eastAsia="Calibri" w:hAnsi="Calibri"/>
+          <w:b/>
+          <w:bCs/>
+          <w:color w:val="000000"/>
+          <w:sz w:val="22"/>
+          <w:szCs w:val="22"/>
+        </w:rPr>
+        <w:t xml:space="preserve">Wandreihe → Mittelreihe → Fensterreihe</w:t>
+      </w:r>
+      <w:r>
+        <w:rPr>
+          <w:rFonts w:ascii="Calibri" w:cs="Calibri" w:eastAsia="Calibri" w:hAnsi="Calibri"/>
+          <w:color w:val="000000"/>
+          <w:sz w:val="22"/>
+          <w:szCs w:val="22"/>
+        </w:rPr>
+        <w:t xml:space="preserve">. Jede Gruppe spielt </w:t>
       </w:r>
       <w:r>
         <w:rPr>
@@ -6212,7 +6406,7 @@
           <w:sz w:val="22"/>
           <w:szCs w:val="22"/>
         </w:rPr>
-        <w:t xml:space="preserve"> – ohne Unterbrechung. Nach jeder Gruppe hast du </w:t>
+        <w:t xml:space="preserve"> – ohne Unterbrechung. Danach hast du </w:t>
       </w:r>
       <w:r>
         <w:rPr>
@@ -6232,7 +6426,7 @@
           <w:sz w:val="22"/>
           <w:szCs w:val="22"/>
         </w:rPr>
-        <w:t xml:space="preserve">, um die Zeile im Bogen auszufüllen.</w:t>
+        <w:t xml:space="preserve">, um die Zeile auszufüllen.</w:t>
       </w:r>
     </w:p>
     <w:p>
@@ -6257,27 +6451,7 @@
           <w:sz w:val="22"/>
           <w:szCs w:val="22"/>
         </w:rPr>
-        <w:t xml:space="preserve">Die Gruppe, die </w:t>
-      </w:r>
-      <w:r>
-        <w:rPr>
-          <w:rFonts w:ascii="Calibri" w:cs="Calibri" w:eastAsia="Calibri" w:hAnsi="Calibri"/>
-          <w:b/>
-          <w:bCs/>
-          <w:color w:val="000000"/>
-          <w:sz w:val="22"/>
-          <w:szCs w:val="22"/>
-        </w:rPr>
-        <w:t xml:space="preserve">nach euch</w:t>
-      </w:r>
-      <w:r>
-        <w:rPr>
-          <w:rFonts w:ascii="Calibri" w:cs="Calibri" w:eastAsia="Calibri" w:hAnsi="Calibri"/>
-          <w:color w:val="000000"/>
-          <w:sz w:val="22"/>
-          <w:szCs w:val="22"/>
-        </w:rPr>
-        <w:t xml:space="preserve"> spielt, beobachtet ihr besonders genau (die letzte Gruppe beobachtet Gruppe 1). Zu ihr berichtet ihr in der Auswertung. Markiere sie mit ★.</w:t>
+        <w:t xml:space="preserve">Die Wandreihe beobachtet besonders genau die Mittelreihe, die Mittelreihe die Fensterreihe, die Fensterreihe die Wandreihe. Markiere deine Patenszene mit ★.</w:t>
       </w:r>
     </w:p>
     <w:p>
@@ -6302,7 +6476,7 @@
           <w:sz w:val="22"/>
           <w:szCs w:val="22"/>
         </w:rPr>
-        <w:t xml:space="preserve">erst 2 Min. still ergänzen, dann 4 Min. in der Tischgruppe eure Patenszene besprechen, dann 1 Min. Rückmeldung pro Gruppe im Plenum.</w:t>
+        <w:t xml:space="preserve">2 Min. still ergänzen → 4 Min. in der Gruppe die Patenszene besprechen → im Plenum ca. 2 Min. Rückmeldung pro Gruppe.</w:t>
       </w:r>
     </w:p>
     <w:tbl>
@@ -6318,10 +6492,10 @@
         </w:tblBorders>
       </w:tblPr>
       <w:tblGrid>
-        <w:gridCol w:w="1100"/>
-        <w:gridCol w:w="2700"/>
-        <w:gridCol w:w="2700"/>
-        <w:gridCol w:w="2506"/>
+        <w:gridCol w:w="1800"/>
+        <w:gridCol w:w="2500"/>
+        <w:gridCol w:w="2500"/>
+        <w:gridCol w:w="2206"/>
         <w:gridCol w:w="1200"/>
       </w:tblGrid>
       <w:tr>
@@ -6331,7 +6505,7 @@
         </w:trPr>
         <w:tc>
           <w:tcPr>
-            <w:tcW w:type="dxa" w:w="1100"/>
+            <w:tcW w:type="dxa" w:w="1800"/>
             <w:tcBorders>
               <w:top w:val="single" w:color="B9C6E8" w:sz="6"/>
               <w:left w:val="single" w:color="B9C6E8" w:sz="6"/>
@@ -6376,13 +6550,13 @@
                 <w:sz w:val="15"/>
                 <w:szCs w:val="15"/>
               </w:rPr>
-              <w:t xml:space="preserve">★ = Pate</w:t>
-            </w:r>
-          </w:p>
-        </w:tc>
-        <w:tc>
-          <w:tcPr>
-            <w:tcW w:type="dxa" w:w="2700"/>
+              <w:t xml:space="preserve">★ = Patenszene</w:t>
+            </w:r>
+          </w:p>
+        </w:tc>
+        <w:tc>
+          <w:tcPr>
+            <w:tcW w:type="dxa" w:w="2500"/>
             <w:tcBorders>
               <w:top w:val="single" w:color="B9C6E8" w:sz="6"/>
               <w:left w:val="single" w:color="B9C6E8" w:sz="6"/>
@@ -6433,7 +6607,7 @@
         </w:tc>
         <w:tc>
           <w:tcPr>
-            <w:tcW w:type="dxa" w:w="2700"/>
+            <w:tcW w:type="dxa" w:w="2500"/>
             <w:tcBorders>
               <w:top w:val="single" w:color="B9C6E8" w:sz="6"/>
               <w:left w:val="single" w:color="B9C6E8" w:sz="6"/>
@@ -6484,7 +6658,7 @@
         </w:tc>
         <w:tc>
           <w:tcPr>
-            <w:tcW w:type="dxa" w:w="2506"/>
+            <w:tcW w:type="dxa" w:w="2206"/>
             <w:tcBorders>
               <w:top w:val="single" w:color="B9C6E8" w:sz="6"/>
               <w:left w:val="single" w:color="B9C6E8" w:sz="6"/>
@@ -6588,11 +6762,11 @@
       <w:tr>
         <w:trPr>
           <w:cantSplit/>
-          <w:trHeight w:val="1350" w:hRule="atLeast"/>
+          <w:trHeight w:val="2900" w:hRule="atLeast"/>
         </w:trPr>
         <w:tc>
           <w:tcPr>
-            <w:tcW w:type="dxa" w:w="1100"/>
+            <w:tcW w:type="dxa" w:w="1800"/>
             <w:tcBorders>
               <w:top w:val="single" w:color="B9C6E8" w:sz="6"/>
               <w:left w:val="single" w:color="B9C6E8" w:sz="6"/>
@@ -6610,7 +6784,7 @@
           </w:tcPr>
           <w:p>
             <w:pPr>
-              <w:spacing w:after="0" w:before="0"/>
+              <w:spacing w:after="20" w:before="0"/>
               <w:jc w:val="center"/>
             </w:pPr>
             <w:r>
@@ -6619,30 +6793,12 @@
                 <w:b/>
                 <w:bCs/>
                 <w:color w:val="5B6B8C"/>
-                <w:sz w:val="22"/>
-                <w:szCs w:val="22"/>
+                <w:sz w:val="28"/>
+                <w:szCs w:val="28"/>
               </w:rPr>
               <w:t xml:space="preserve">1</w:t>
             </w:r>
           </w:p>
-        </w:tc>
-        <w:tc>
-          <w:tcPr>
-            <w:tcW w:type="dxa" w:w="2700"/>
-            <w:tcBorders>
-              <w:top w:val="single" w:color="B9C6E8" w:sz="6"/>
-              <w:left w:val="single" w:color="B9C6E8" w:sz="6"/>
-              <w:bottom w:val="single" w:color="B9C6E8" w:sz="6"/>
-              <w:right w:val="single" w:color="B9C6E8" w:sz="6"/>
-            </w:tcBorders>
-            <w:tcMar>
-              <w:top w:type="dxa" w:w="60"/>
-              <w:left w:type="dxa" w:w="100"/>
-              <w:bottom w:type="dxa" w:w="60"/>
-              <w:right w:type="dxa" w:w="100"/>
-            </w:tcMar>
-            <w:vAlign w:val="center"/>
-          </w:tcPr>
           <w:p>
             <w:pPr>
               <w:spacing w:after="0" w:before="0"/>
@@ -6653,7 +6809,39 @@
                 <w:rFonts w:ascii="Calibri" w:cs="Calibri" w:eastAsia="Calibri" w:hAnsi="Calibri"/>
                 <w:b/>
                 <w:bCs/>
-                <w:color w:val="5B6B8C"/>
+                <w:color w:val="1E2761"/>
+                <w:sz w:val="19"/>
+                <w:szCs w:val="19"/>
+              </w:rPr>
+              <w:t xml:space="preserve">Wandreihe</w:t>
+            </w:r>
+          </w:p>
+        </w:tc>
+        <w:tc>
+          <w:tcPr>
+            <w:tcW w:type="dxa" w:w="2500"/>
+            <w:tcBorders>
+              <w:top w:val="single" w:color="B9C6E8" w:sz="6"/>
+              <w:left w:val="single" w:color="B9C6E8" w:sz="6"/>
+              <w:bottom w:val="single" w:color="B9C6E8" w:sz="6"/>
+              <w:right w:val="single" w:color="B9C6E8" w:sz="6"/>
+            </w:tcBorders>
+            <w:tcMar>
+              <w:top w:type="dxa" w:w="60"/>
+              <w:left w:type="dxa" w:w="100"/>
+              <w:bottom w:type="dxa" w:w="60"/>
+              <w:right w:type="dxa" w:w="100"/>
+            </w:tcMar>
+            <w:vAlign w:val="center"/>
+          </w:tcPr>
+          <w:p>
+            <w:pPr>
+              <w:spacing w:after="100" w:before="0"/>
+            </w:pPr>
+            <w:r>
+              <w:rPr>
+                <w:rFonts w:ascii="Calibri" w:cs="Calibri" w:eastAsia="Calibri" w:hAnsi="Calibri"/>
+                <w:color w:val="000000"/>
                 <w:sz w:val="22"/>
                 <w:szCs w:val="22"/>
               </w:rPr>
@@ -6663,32 +6851,29 @@
         </w:tc>
         <w:tc>
           <w:tcPr>
-            <w:tcW w:type="dxa" w:w="2700"/>
-            <w:tcBorders>
-              <w:top w:val="single" w:color="B9C6E8" w:sz="6"/>
-              <w:left w:val="single" w:color="B9C6E8" w:sz="6"/>
-              <w:bottom w:val="single" w:color="B9C6E8" w:sz="6"/>
-              <w:right w:val="single" w:color="B9C6E8" w:sz="6"/>
-            </w:tcBorders>
-            <w:tcMar>
-              <w:top w:type="dxa" w:w="60"/>
-              <w:left w:type="dxa" w:w="100"/>
-              <w:bottom w:type="dxa" w:w="60"/>
-              <w:right w:type="dxa" w:w="100"/>
-            </w:tcMar>
-            <w:vAlign w:val="center"/>
-          </w:tcPr>
-          <w:p>
-            <w:pPr>
-              <w:spacing w:after="0" w:before="0"/>
-              <w:jc w:val="center"/>
-            </w:pPr>
-            <w:r>
-              <w:rPr>
-                <w:rFonts w:ascii="Calibri" w:cs="Calibri" w:eastAsia="Calibri" w:hAnsi="Calibri"/>
-                <w:b/>
-                <w:bCs/>
-                <w:color w:val="5B6B8C"/>
+            <w:tcW w:type="dxa" w:w="2500"/>
+            <w:tcBorders>
+              <w:top w:val="single" w:color="B9C6E8" w:sz="6"/>
+              <w:left w:val="single" w:color="B9C6E8" w:sz="6"/>
+              <w:bottom w:val="single" w:color="B9C6E8" w:sz="6"/>
+              <w:right w:val="single" w:color="B9C6E8" w:sz="6"/>
+            </w:tcBorders>
+            <w:tcMar>
+              <w:top w:type="dxa" w:w="60"/>
+              <w:left w:type="dxa" w:w="100"/>
+              <w:bottom w:type="dxa" w:w="60"/>
+              <w:right w:type="dxa" w:w="100"/>
+            </w:tcMar>
+            <w:vAlign w:val="center"/>
+          </w:tcPr>
+          <w:p>
+            <w:pPr>
+              <w:spacing w:after="100" w:before="0"/>
+            </w:pPr>
+            <w:r>
+              <w:rPr>
+                <w:rFonts w:ascii="Calibri" w:cs="Calibri" w:eastAsia="Calibri" w:hAnsi="Calibri"/>
+                <w:color w:val="000000"/>
                 <w:sz w:val="22"/>
                 <w:szCs w:val="22"/>
               </w:rPr>
@@ -6698,32 +6883,29 @@
         </w:tc>
         <w:tc>
           <w:tcPr>
-            <w:tcW w:type="dxa" w:w="2506"/>
-            <w:tcBorders>
-              <w:top w:val="single" w:color="B9C6E8" w:sz="6"/>
-              <w:left w:val="single" w:color="B9C6E8" w:sz="6"/>
-              <w:bottom w:val="single" w:color="B9C6E8" w:sz="6"/>
-              <w:right w:val="single" w:color="B9C6E8" w:sz="6"/>
-            </w:tcBorders>
-            <w:tcMar>
-              <w:top w:type="dxa" w:w="60"/>
-              <w:left w:type="dxa" w:w="100"/>
-              <w:bottom w:type="dxa" w:w="60"/>
-              <w:right w:type="dxa" w:w="100"/>
-            </w:tcMar>
-            <w:vAlign w:val="center"/>
-          </w:tcPr>
-          <w:p>
-            <w:pPr>
-              <w:spacing w:after="0" w:before="0"/>
-              <w:jc w:val="center"/>
-            </w:pPr>
-            <w:r>
-              <w:rPr>
-                <w:rFonts w:ascii="Calibri" w:cs="Calibri" w:eastAsia="Calibri" w:hAnsi="Calibri"/>
-                <w:b/>
-                <w:bCs/>
-                <w:color w:val="5B6B8C"/>
+            <w:tcW w:type="dxa" w:w="2206"/>
+            <w:tcBorders>
+              <w:top w:val="single" w:color="B9C6E8" w:sz="6"/>
+              <w:left w:val="single" w:color="B9C6E8" w:sz="6"/>
+              <w:bottom w:val="single" w:color="B9C6E8" w:sz="6"/>
+              <w:right w:val="single" w:color="B9C6E8" w:sz="6"/>
+            </w:tcBorders>
+            <w:tcMar>
+              <w:top w:type="dxa" w:w="60"/>
+              <w:left w:type="dxa" w:w="100"/>
+              <w:bottom w:type="dxa" w:w="60"/>
+              <w:right w:type="dxa" w:w="100"/>
+            </w:tcMar>
+            <w:vAlign w:val="center"/>
+          </w:tcPr>
+          <w:p>
+            <w:pPr>
+              <w:spacing w:after="100" w:before="0"/>
+            </w:pPr>
+            <w:r>
+              <w:rPr>
+                <w:rFonts w:ascii="Calibri" w:cs="Calibri" w:eastAsia="Calibri" w:hAnsi="Calibri"/>
+                <w:color w:val="000000"/>
                 <w:sz w:val="22"/>
                 <w:szCs w:val="22"/>
               </w:rPr>
@@ -6750,15 +6932,12 @@
           </w:tcPr>
           <w:p>
             <w:pPr>
-              <w:spacing w:after="0" w:before="0"/>
-              <w:jc w:val="center"/>
-            </w:pPr>
-            <w:r>
-              <w:rPr>
-                <w:rFonts w:ascii="Calibri" w:cs="Calibri" w:eastAsia="Calibri" w:hAnsi="Calibri"/>
-                <w:b/>
-                <w:bCs/>
-                <w:color w:val="5B6B8C"/>
+              <w:spacing w:after="100" w:before="0"/>
+            </w:pPr>
+            <w:r>
+              <w:rPr>
+                <w:rFonts w:ascii="Calibri" w:cs="Calibri" w:eastAsia="Calibri" w:hAnsi="Calibri"/>
+                <w:color w:val="000000"/>
                 <w:sz w:val="22"/>
                 <w:szCs w:val="22"/>
               </w:rPr>
@@ -6770,11 +6949,11 @@
       <w:tr>
         <w:trPr>
           <w:cantSplit/>
-          <w:trHeight w:val="1350" w:hRule="atLeast"/>
+          <w:trHeight w:val="2900" w:hRule="atLeast"/>
         </w:trPr>
         <w:tc>
           <w:tcPr>
-            <w:tcW w:type="dxa" w:w="1100"/>
+            <w:tcW w:type="dxa" w:w="1800"/>
             <w:tcBorders>
               <w:top w:val="single" w:color="B9C6E8" w:sz="6"/>
               <w:left w:val="single" w:color="B9C6E8" w:sz="6"/>
@@ -6792,7 +6971,7 @@
           </w:tcPr>
           <w:p>
             <w:pPr>
-              <w:spacing w:after="0" w:before="0"/>
+              <w:spacing w:after="20" w:before="0"/>
               <w:jc w:val="center"/>
             </w:pPr>
             <w:r>
@@ -6801,30 +6980,12 @@
                 <w:b/>
                 <w:bCs/>
                 <w:color w:val="5B6B8C"/>
-                <w:sz w:val="22"/>
-                <w:szCs w:val="22"/>
+                <w:sz w:val="28"/>
+                <w:szCs w:val="28"/>
               </w:rPr>
               <w:t xml:space="preserve">2</w:t>
             </w:r>
           </w:p>
-        </w:tc>
-        <w:tc>
-          <w:tcPr>
-            <w:tcW w:type="dxa" w:w="2700"/>
-            <w:tcBorders>
-              <w:top w:val="single" w:color="B9C6E8" w:sz="6"/>
-              <w:left w:val="single" w:color="B9C6E8" w:sz="6"/>
-              <w:bottom w:val="single" w:color="B9C6E8" w:sz="6"/>
-              <w:right w:val="single" w:color="B9C6E8" w:sz="6"/>
-            </w:tcBorders>
-            <w:tcMar>
-              <w:top w:type="dxa" w:w="60"/>
-              <w:left w:type="dxa" w:w="100"/>
-              <w:bottom w:type="dxa" w:w="60"/>
-              <w:right w:type="dxa" w:w="100"/>
-            </w:tcMar>
-            <w:vAlign w:val="center"/>
-          </w:tcPr>
           <w:p>
             <w:pPr>
               <w:spacing w:after="0" w:before="0"/>
@@ -6835,7 +6996,39 @@
                 <w:rFonts w:ascii="Calibri" w:cs="Calibri" w:eastAsia="Calibri" w:hAnsi="Calibri"/>
                 <w:b/>
                 <w:bCs/>
-                <w:color w:val="5B6B8C"/>
+                <w:color w:val="1E2761"/>
+                <w:sz w:val="19"/>
+                <w:szCs w:val="19"/>
+              </w:rPr>
+              <w:t xml:space="preserve">Mittelreihe</w:t>
+            </w:r>
+          </w:p>
+        </w:tc>
+        <w:tc>
+          <w:tcPr>
+            <w:tcW w:type="dxa" w:w="2500"/>
+            <w:tcBorders>
+              <w:top w:val="single" w:color="B9C6E8" w:sz="6"/>
+              <w:left w:val="single" w:color="B9C6E8" w:sz="6"/>
+              <w:bottom w:val="single" w:color="B9C6E8" w:sz="6"/>
+              <w:right w:val="single" w:color="B9C6E8" w:sz="6"/>
+            </w:tcBorders>
+            <w:tcMar>
+              <w:top w:type="dxa" w:w="60"/>
+              <w:left w:type="dxa" w:w="100"/>
+              <w:bottom w:type="dxa" w:w="60"/>
+              <w:right w:type="dxa" w:w="100"/>
+            </w:tcMar>
+            <w:vAlign w:val="center"/>
+          </w:tcPr>
+          <w:p>
+            <w:pPr>
+              <w:spacing w:after="100" w:before="0"/>
+            </w:pPr>
+            <w:r>
+              <w:rPr>
+                <w:rFonts w:ascii="Calibri" w:cs="Calibri" w:eastAsia="Calibri" w:hAnsi="Calibri"/>
+                <w:color w:val="000000"/>
                 <w:sz w:val="22"/>
                 <w:szCs w:val="22"/>
               </w:rPr>
@@ -6845,32 +7038,29 @@
         </w:tc>
         <w:tc>
           <w:tcPr>
-            <w:tcW w:type="dxa" w:w="2700"/>
-            <w:tcBorders>
-              <w:top w:val="single" w:color="B9C6E8" w:sz="6"/>
-              <w:left w:val="single" w:color="B9C6E8" w:sz="6"/>
-              <w:bottom w:val="single" w:color="B9C6E8" w:sz="6"/>
-              <w:right w:val="single" w:color="B9C6E8" w:sz="6"/>
-            </w:tcBorders>
-            <w:tcMar>
-              <w:top w:type="dxa" w:w="60"/>
-              <w:left w:type="dxa" w:w="100"/>
-              <w:bottom w:type="dxa" w:w="60"/>
-              <w:right w:type="dxa" w:w="100"/>
-            </w:tcMar>
-            <w:vAlign w:val="center"/>
-          </w:tcPr>
-          <w:p>
-            <w:pPr>
-              <w:spacing w:after="0" w:before="0"/>
-              <w:jc w:val="center"/>
-            </w:pPr>
-            <w:r>
-              <w:rPr>
-                <w:rFonts w:ascii="Calibri" w:cs="Calibri" w:eastAsia="Calibri" w:hAnsi="Calibri"/>
-                <w:b/>
-                <w:bCs/>
-                <w:color w:val="5B6B8C"/>
+            <w:tcW w:type="dxa" w:w="2500"/>
+            <w:tcBorders>
+              <w:top w:val="single" w:color="B9C6E8" w:sz="6"/>
+              <w:left w:val="single" w:color="B9C6E8" w:sz="6"/>
+              <w:bottom w:val="single" w:color="B9C6E8" w:sz="6"/>
+              <w:right w:val="single" w:color="B9C6E8" w:sz="6"/>
+            </w:tcBorders>
+            <w:tcMar>
+              <w:top w:type="dxa" w:w="60"/>
+              <w:left w:type="dxa" w:w="100"/>
+              <w:bottom w:type="dxa" w:w="60"/>
+              <w:right w:type="dxa" w:w="100"/>
+            </w:tcMar>
+            <w:vAlign w:val="center"/>
+          </w:tcPr>
+          <w:p>
+            <w:pPr>
+              <w:spacing w:after="100" w:before="0"/>
+            </w:pPr>
+            <w:r>
+              <w:rPr>
+                <w:rFonts w:ascii="Calibri" w:cs="Calibri" w:eastAsia="Calibri" w:hAnsi="Calibri"/>
+                <w:color w:val="000000"/>
                 <w:sz w:val="22"/>
                 <w:szCs w:val="22"/>
               </w:rPr>
@@ -6880,32 +7070,29 @@
         </w:tc>
         <w:tc>
           <w:tcPr>
-            <w:tcW w:type="dxa" w:w="2506"/>
-            <w:tcBorders>
-              <w:top w:val="single" w:color="B9C6E8" w:sz="6"/>
-              <w:left w:val="single" w:color="B9C6E8" w:sz="6"/>
-              <w:bottom w:val="single" w:color="B9C6E8" w:sz="6"/>
-              <w:right w:val="single" w:color="B9C6E8" w:sz="6"/>
-            </w:tcBorders>
-            <w:tcMar>
-              <w:top w:type="dxa" w:w="60"/>
-              <w:left w:type="dxa" w:w="100"/>
-              <w:bottom w:type="dxa" w:w="60"/>
-              <w:right w:type="dxa" w:w="100"/>
-            </w:tcMar>
-            <w:vAlign w:val="center"/>
-          </w:tcPr>
-          <w:p>
-            <w:pPr>
-              <w:spacing w:after="0" w:before="0"/>
-              <w:jc w:val="center"/>
-            </w:pPr>
-            <w:r>
-              <w:rPr>
-                <w:rFonts w:ascii="Calibri" w:cs="Calibri" w:eastAsia="Calibri" w:hAnsi="Calibri"/>
-                <w:b/>
-                <w:bCs/>
-                <w:color w:val="5B6B8C"/>
+            <w:tcW w:type="dxa" w:w="2206"/>
+            <w:tcBorders>
+              <w:top w:val="single" w:color="B9C6E8" w:sz="6"/>
+              <w:left w:val="single" w:color="B9C6E8" w:sz="6"/>
+              <w:bottom w:val="single" w:color="B9C6E8" w:sz="6"/>
+              <w:right w:val="single" w:color="B9C6E8" w:sz="6"/>
+            </w:tcBorders>
+            <w:tcMar>
+              <w:top w:type="dxa" w:w="60"/>
+              <w:left w:type="dxa" w:w="100"/>
+              <w:bottom w:type="dxa" w:w="60"/>
+              <w:right w:type="dxa" w:w="100"/>
+            </w:tcMar>
+            <w:vAlign w:val="center"/>
+          </w:tcPr>
+          <w:p>
+            <w:pPr>
+              <w:spacing w:after="100" w:before="0"/>
+            </w:pPr>
+            <w:r>
+              <w:rPr>
+                <w:rFonts w:ascii="Calibri" w:cs="Calibri" w:eastAsia="Calibri" w:hAnsi="Calibri"/>
+                <w:color w:val="000000"/>
                 <w:sz w:val="22"/>
                 <w:szCs w:val="22"/>
               </w:rPr>
@@ -6932,15 +7119,12 @@
           </w:tcPr>
           <w:p>
             <w:pPr>
-              <w:spacing w:after="0" w:before="0"/>
-              <w:jc w:val="center"/>
-            </w:pPr>
-            <w:r>
-              <w:rPr>
-                <w:rFonts w:ascii="Calibri" w:cs="Calibri" w:eastAsia="Calibri" w:hAnsi="Calibri"/>
-                <w:b/>
-                <w:bCs/>
-                <w:color w:val="5B6B8C"/>
+              <w:spacing w:after="100" w:before="0"/>
+            </w:pPr>
+            <w:r>
+              <w:rPr>
+                <w:rFonts w:ascii="Calibri" w:cs="Calibri" w:eastAsia="Calibri" w:hAnsi="Calibri"/>
+                <w:color w:val="000000"/>
                 <w:sz w:val="22"/>
                 <w:szCs w:val="22"/>
               </w:rPr>
@@ -6952,11 +7136,11 @@
       <w:tr>
         <w:trPr>
           <w:cantSplit/>
-          <w:trHeight w:val="1350" w:hRule="atLeast"/>
+          <w:trHeight w:val="2900" w:hRule="atLeast"/>
         </w:trPr>
         <w:tc>
           <w:tcPr>
-            <w:tcW w:type="dxa" w:w="1100"/>
+            <w:tcW w:type="dxa" w:w="1800"/>
             <w:tcBorders>
               <w:top w:val="single" w:color="B9C6E8" w:sz="6"/>
               <w:left w:val="single" w:color="B9C6E8" w:sz="6"/>
@@ -6974,7 +7158,7 @@
           </w:tcPr>
           <w:p>
             <w:pPr>
-              <w:spacing w:after="0" w:before="0"/>
+              <w:spacing w:after="20" w:before="0"/>
               <w:jc w:val="center"/>
             </w:pPr>
             <w:r>
@@ -6983,30 +7167,12 @@
                 <w:b/>
                 <w:bCs/>
                 <w:color w:val="5B6B8C"/>
-                <w:sz w:val="22"/>
-                <w:szCs w:val="22"/>
+                <w:sz w:val="28"/>
+                <w:szCs w:val="28"/>
               </w:rPr>
               <w:t xml:space="preserve">3</w:t>
             </w:r>
           </w:p>
-        </w:tc>
-        <w:tc>
-          <w:tcPr>
-            <w:tcW w:type="dxa" w:w="2700"/>
-            <w:tcBorders>
-              <w:top w:val="single" w:color="B9C6E8" w:sz="6"/>
-              <w:left w:val="single" w:color="B9C6E8" w:sz="6"/>
-              <w:bottom w:val="single" w:color="B9C6E8" w:sz="6"/>
-              <w:right w:val="single" w:color="B9C6E8" w:sz="6"/>
-            </w:tcBorders>
-            <w:tcMar>
-              <w:top w:type="dxa" w:w="60"/>
-              <w:left w:type="dxa" w:w="100"/>
-              <w:bottom w:type="dxa" w:w="60"/>
-              <w:right w:type="dxa" w:w="100"/>
-            </w:tcMar>
-            <w:vAlign w:val="center"/>
-          </w:tcPr>
           <w:p>
             <w:pPr>
               <w:spacing w:after="0" w:before="0"/>
@@ -7017,7 +7183,39 @@
                 <w:rFonts w:ascii="Calibri" w:cs="Calibri" w:eastAsia="Calibri" w:hAnsi="Calibri"/>
                 <w:b/>
                 <w:bCs/>
-                <w:color w:val="5B6B8C"/>
+                <w:color w:val="1E2761"/>
+                <w:sz w:val="19"/>
+                <w:szCs w:val="19"/>
+              </w:rPr>
+              <w:t xml:space="preserve">Fensterreihe</w:t>
+            </w:r>
+          </w:p>
+        </w:tc>
+        <w:tc>
+          <w:tcPr>
+            <w:tcW w:type="dxa" w:w="2500"/>
+            <w:tcBorders>
+              <w:top w:val="single" w:color="B9C6E8" w:sz="6"/>
+              <w:left w:val="single" w:color="B9C6E8" w:sz="6"/>
+              <w:bottom w:val="single" w:color="B9C6E8" w:sz="6"/>
+              <w:right w:val="single" w:color="B9C6E8" w:sz="6"/>
+            </w:tcBorders>
+            <w:tcMar>
+              <w:top w:type="dxa" w:w="60"/>
+              <w:left w:type="dxa" w:w="100"/>
+              <w:bottom w:type="dxa" w:w="60"/>
+              <w:right w:type="dxa" w:w="100"/>
+            </w:tcMar>
+            <w:vAlign w:val="center"/>
+          </w:tcPr>
+          <w:p>
+            <w:pPr>
+              <w:spacing w:after="100" w:before="0"/>
+            </w:pPr>
+            <w:r>
+              <w:rPr>
+                <w:rFonts w:ascii="Calibri" w:cs="Calibri" w:eastAsia="Calibri" w:hAnsi="Calibri"/>
+                <w:color w:val="000000"/>
                 <w:sz w:val="22"/>
                 <w:szCs w:val="22"/>
               </w:rPr>
@@ -7027,32 +7225,29 @@
         </w:tc>
         <w:tc>
           <w:tcPr>
-            <w:tcW w:type="dxa" w:w="2700"/>
-            <w:tcBorders>
-              <w:top w:val="single" w:color="B9C6E8" w:sz="6"/>
-              <w:left w:val="single" w:color="B9C6E8" w:sz="6"/>
-              <w:bottom w:val="single" w:color="B9C6E8" w:sz="6"/>
-              <w:right w:val="single" w:color="B9C6E8" w:sz="6"/>
-            </w:tcBorders>
-            <w:tcMar>
-              <w:top w:type="dxa" w:w="60"/>
-              <w:left w:type="dxa" w:w="100"/>
-              <w:bottom w:type="dxa" w:w="60"/>
-              <w:right w:type="dxa" w:w="100"/>
-            </w:tcMar>
-            <w:vAlign w:val="center"/>
-          </w:tcPr>
-          <w:p>
-            <w:pPr>
-              <w:spacing w:after="0" w:before="0"/>
-              <w:jc w:val="center"/>
-            </w:pPr>
-            <w:r>
-              <w:rPr>
-                <w:rFonts w:ascii="Calibri" w:cs="Calibri" w:eastAsia="Calibri" w:hAnsi="Calibri"/>
-                <w:b/>
-                <w:bCs/>
-                <w:color w:val="5B6B8C"/>
+            <w:tcW w:type="dxa" w:w="2500"/>
+            <w:tcBorders>
+              <w:top w:val="single" w:color="B9C6E8" w:sz="6"/>
+              <w:left w:val="single" w:color="B9C6E8" w:sz="6"/>
+              <w:bottom w:val="single" w:color="B9C6E8" w:sz="6"/>
+              <w:right w:val="single" w:color="B9C6E8" w:sz="6"/>
+            </w:tcBorders>
+            <w:tcMar>
+              <w:top w:type="dxa" w:w="60"/>
+              <w:left w:type="dxa" w:w="100"/>
+              <w:bottom w:type="dxa" w:w="60"/>
+              <w:right w:type="dxa" w:w="100"/>
+            </w:tcMar>
+            <w:vAlign w:val="center"/>
+          </w:tcPr>
+          <w:p>
+            <w:pPr>
+              <w:spacing w:after="100" w:before="0"/>
+            </w:pPr>
+            <w:r>
+              <w:rPr>
+                <w:rFonts w:ascii="Calibri" w:cs="Calibri" w:eastAsia="Calibri" w:hAnsi="Calibri"/>
+                <w:color w:val="000000"/>
                 <w:sz w:val="22"/>
                 <w:szCs w:val="22"/>
               </w:rPr>
@@ -7062,32 +7257,29 @@
         </w:tc>
         <w:tc>
           <w:tcPr>
-            <w:tcW w:type="dxa" w:w="2506"/>
-            <w:tcBorders>
-              <w:top w:val="single" w:color="B9C6E8" w:sz="6"/>
-              <w:left w:val="single" w:color="B9C6E8" w:sz="6"/>
-              <w:bottom w:val="single" w:color="B9C6E8" w:sz="6"/>
-              <w:right w:val="single" w:color="B9C6E8" w:sz="6"/>
-            </w:tcBorders>
-            <w:tcMar>
-              <w:top w:type="dxa" w:w="60"/>
-              <w:left w:type="dxa" w:w="100"/>
-              <w:bottom w:type="dxa" w:w="60"/>
-              <w:right w:type="dxa" w:w="100"/>
-            </w:tcMar>
-            <w:vAlign w:val="center"/>
-          </w:tcPr>
-          <w:p>
-            <w:pPr>
-              <w:spacing w:after="0" w:before="0"/>
-              <w:jc w:val="center"/>
-            </w:pPr>
-            <w:r>
-              <w:rPr>
-                <w:rFonts w:ascii="Calibri" w:cs="Calibri" w:eastAsia="Calibri" w:hAnsi="Calibri"/>
-                <w:b/>
-                <w:bCs/>
-                <w:color w:val="5B6B8C"/>
+            <w:tcW w:type="dxa" w:w="2206"/>
+            <w:tcBorders>
+              <w:top w:val="single" w:color="B9C6E8" w:sz="6"/>
+              <w:left w:val="single" w:color="B9C6E8" w:sz="6"/>
+              <w:bottom w:val="single" w:color="B9C6E8" w:sz="6"/>
+              <w:right w:val="single" w:color="B9C6E8" w:sz="6"/>
+            </w:tcBorders>
+            <w:tcMar>
+              <w:top w:type="dxa" w:w="60"/>
+              <w:left w:type="dxa" w:w="100"/>
+              <w:bottom w:type="dxa" w:w="60"/>
+              <w:right w:type="dxa" w:w="100"/>
+            </w:tcMar>
+            <w:vAlign w:val="center"/>
+          </w:tcPr>
+          <w:p>
+            <w:pPr>
+              <w:spacing w:after="100" w:before="0"/>
+            </w:pPr>
+            <w:r>
+              <w:rPr>
+                <w:rFonts w:ascii="Calibri" w:cs="Calibri" w:eastAsia="Calibri" w:hAnsi="Calibri"/>
+                <w:color w:val="000000"/>
                 <w:sz w:val="22"/>
                 <w:szCs w:val="22"/>
               </w:rPr>
@@ -7114,743 +7306,12 @@
           </w:tcPr>
           <w:p>
             <w:pPr>
-              <w:spacing w:after="0" w:before="0"/>
-              <w:jc w:val="center"/>
-            </w:pPr>
-            <w:r>
-              <w:rPr>
-                <w:rFonts w:ascii="Calibri" w:cs="Calibri" w:eastAsia="Calibri" w:hAnsi="Calibri"/>
-                <w:b/>
-                <w:bCs/>
-                <w:color w:val="5B6B8C"/>
-                <w:sz w:val="22"/>
-                <w:szCs w:val="22"/>
-              </w:rPr>
-              <w:t xml:space="preserve"/>
-            </w:r>
-          </w:p>
-        </w:tc>
-      </w:tr>
-      <w:tr>
-        <w:trPr>
-          <w:cantSplit/>
-          <w:trHeight w:val="1350" w:hRule="atLeast"/>
-        </w:trPr>
-        <w:tc>
-          <w:tcPr>
-            <w:tcW w:type="dxa" w:w="1100"/>
-            <w:tcBorders>
-              <w:top w:val="single" w:color="B9C6E8" w:sz="6"/>
-              <w:left w:val="single" w:color="B9C6E8" w:sz="6"/>
-              <w:bottom w:val="single" w:color="B9C6E8" w:sz="6"/>
-              <w:right w:val="single" w:color="B9C6E8" w:sz="6"/>
-            </w:tcBorders>
-            <w:shd w:fill="F4F7FD" w:color="auto" w:val="clear"/>
-            <w:tcMar>
-              <w:top w:type="dxa" w:w="60"/>
-              <w:left w:type="dxa" w:w="100"/>
-              <w:bottom w:type="dxa" w:w="60"/>
-              <w:right w:type="dxa" w:w="100"/>
-            </w:tcMar>
-            <w:vAlign w:val="center"/>
-          </w:tcPr>
-          <w:p>
-            <w:pPr>
-              <w:spacing w:after="0" w:before="0"/>
-              <w:jc w:val="center"/>
-            </w:pPr>
-            <w:r>
-              <w:rPr>
-                <w:rFonts w:ascii="Calibri" w:cs="Calibri" w:eastAsia="Calibri" w:hAnsi="Calibri"/>
-                <w:b/>
-                <w:bCs/>
-                <w:color w:val="5B6B8C"/>
-                <w:sz w:val="22"/>
-                <w:szCs w:val="22"/>
-              </w:rPr>
-              <w:t xml:space="preserve">4</w:t>
-            </w:r>
-          </w:p>
-        </w:tc>
-        <w:tc>
-          <w:tcPr>
-            <w:tcW w:type="dxa" w:w="2700"/>
-            <w:tcBorders>
-              <w:top w:val="single" w:color="B9C6E8" w:sz="6"/>
-              <w:left w:val="single" w:color="B9C6E8" w:sz="6"/>
-              <w:bottom w:val="single" w:color="B9C6E8" w:sz="6"/>
-              <w:right w:val="single" w:color="B9C6E8" w:sz="6"/>
-            </w:tcBorders>
-            <w:tcMar>
-              <w:top w:type="dxa" w:w="60"/>
-              <w:left w:type="dxa" w:w="100"/>
-              <w:bottom w:type="dxa" w:w="60"/>
-              <w:right w:type="dxa" w:w="100"/>
-            </w:tcMar>
-            <w:vAlign w:val="center"/>
-          </w:tcPr>
-          <w:p>
-            <w:pPr>
-              <w:spacing w:after="0" w:before="0"/>
-              <w:jc w:val="center"/>
-            </w:pPr>
-            <w:r>
-              <w:rPr>
-                <w:rFonts w:ascii="Calibri" w:cs="Calibri" w:eastAsia="Calibri" w:hAnsi="Calibri"/>
-                <w:b/>
-                <w:bCs/>
-                <w:color w:val="5B6B8C"/>
-                <w:sz w:val="22"/>
-                <w:szCs w:val="22"/>
-              </w:rPr>
-              <w:t xml:space="preserve"/>
-            </w:r>
-          </w:p>
-        </w:tc>
-        <w:tc>
-          <w:tcPr>
-            <w:tcW w:type="dxa" w:w="2700"/>
-            <w:tcBorders>
-              <w:top w:val="single" w:color="B9C6E8" w:sz="6"/>
-              <w:left w:val="single" w:color="B9C6E8" w:sz="6"/>
-              <w:bottom w:val="single" w:color="B9C6E8" w:sz="6"/>
-              <w:right w:val="single" w:color="B9C6E8" w:sz="6"/>
-            </w:tcBorders>
-            <w:tcMar>
-              <w:top w:type="dxa" w:w="60"/>
-              <w:left w:type="dxa" w:w="100"/>
-              <w:bottom w:type="dxa" w:w="60"/>
-              <w:right w:type="dxa" w:w="100"/>
-            </w:tcMar>
-            <w:vAlign w:val="center"/>
-          </w:tcPr>
-          <w:p>
-            <w:pPr>
-              <w:spacing w:after="0" w:before="0"/>
-              <w:jc w:val="center"/>
-            </w:pPr>
-            <w:r>
-              <w:rPr>
-                <w:rFonts w:ascii="Calibri" w:cs="Calibri" w:eastAsia="Calibri" w:hAnsi="Calibri"/>
-                <w:b/>
-                <w:bCs/>
-                <w:color w:val="5B6B8C"/>
-                <w:sz w:val="22"/>
-                <w:szCs w:val="22"/>
-              </w:rPr>
-              <w:t xml:space="preserve"/>
-            </w:r>
-          </w:p>
-        </w:tc>
-        <w:tc>
-          <w:tcPr>
-            <w:tcW w:type="dxa" w:w="2506"/>
-            <w:tcBorders>
-              <w:top w:val="single" w:color="B9C6E8" w:sz="6"/>
-              <w:left w:val="single" w:color="B9C6E8" w:sz="6"/>
-              <w:bottom w:val="single" w:color="B9C6E8" w:sz="6"/>
-              <w:right w:val="single" w:color="B9C6E8" w:sz="6"/>
-            </w:tcBorders>
-            <w:tcMar>
-              <w:top w:type="dxa" w:w="60"/>
-              <w:left w:type="dxa" w:w="100"/>
-              <w:bottom w:type="dxa" w:w="60"/>
-              <w:right w:type="dxa" w:w="100"/>
-            </w:tcMar>
-            <w:vAlign w:val="center"/>
-          </w:tcPr>
-          <w:p>
-            <w:pPr>
-              <w:spacing w:after="0" w:before="0"/>
-              <w:jc w:val="center"/>
-            </w:pPr>
-            <w:r>
-              <w:rPr>
-                <w:rFonts w:ascii="Calibri" w:cs="Calibri" w:eastAsia="Calibri" w:hAnsi="Calibri"/>
-                <w:b/>
-                <w:bCs/>
-                <w:color w:val="5B6B8C"/>
-                <w:sz w:val="22"/>
-                <w:szCs w:val="22"/>
-              </w:rPr>
-              <w:t xml:space="preserve"/>
-            </w:r>
-          </w:p>
-        </w:tc>
-        <w:tc>
-          <w:tcPr>
-            <w:tcW w:type="dxa" w:w="1200"/>
-            <w:tcBorders>
-              <w:top w:val="single" w:color="B9C6E8" w:sz="6"/>
-              <w:left w:val="single" w:color="B9C6E8" w:sz="6"/>
-              <w:bottom w:val="single" w:color="B9C6E8" w:sz="6"/>
-              <w:right w:val="single" w:color="B9C6E8" w:sz="6"/>
-            </w:tcBorders>
-            <w:tcMar>
-              <w:top w:type="dxa" w:w="60"/>
-              <w:left w:type="dxa" w:w="100"/>
-              <w:bottom w:type="dxa" w:w="60"/>
-              <w:right w:type="dxa" w:w="100"/>
-            </w:tcMar>
-            <w:vAlign w:val="center"/>
-          </w:tcPr>
-          <w:p>
-            <w:pPr>
-              <w:spacing w:after="0" w:before="0"/>
-              <w:jc w:val="center"/>
-            </w:pPr>
-            <w:r>
-              <w:rPr>
-                <w:rFonts w:ascii="Calibri" w:cs="Calibri" w:eastAsia="Calibri" w:hAnsi="Calibri"/>
-                <w:b/>
-                <w:bCs/>
-                <w:color w:val="5B6B8C"/>
-                <w:sz w:val="22"/>
-                <w:szCs w:val="22"/>
-              </w:rPr>
-              <w:t xml:space="preserve"/>
-            </w:r>
-          </w:p>
-        </w:tc>
-      </w:tr>
-      <w:tr>
-        <w:trPr>
-          <w:cantSplit/>
-          <w:trHeight w:val="1350" w:hRule="atLeast"/>
-        </w:trPr>
-        <w:tc>
-          <w:tcPr>
-            <w:tcW w:type="dxa" w:w="1100"/>
-            <w:tcBorders>
-              <w:top w:val="single" w:color="B9C6E8" w:sz="6"/>
-              <w:left w:val="single" w:color="B9C6E8" w:sz="6"/>
-              <w:bottom w:val="single" w:color="B9C6E8" w:sz="6"/>
-              <w:right w:val="single" w:color="B9C6E8" w:sz="6"/>
-            </w:tcBorders>
-            <w:shd w:fill="F4F7FD" w:color="auto" w:val="clear"/>
-            <w:tcMar>
-              <w:top w:type="dxa" w:w="60"/>
-              <w:left w:type="dxa" w:w="100"/>
-              <w:bottom w:type="dxa" w:w="60"/>
-              <w:right w:type="dxa" w:w="100"/>
-            </w:tcMar>
-            <w:vAlign w:val="center"/>
-          </w:tcPr>
-          <w:p>
-            <w:pPr>
-              <w:spacing w:after="0" w:before="0"/>
-              <w:jc w:val="center"/>
-            </w:pPr>
-            <w:r>
-              <w:rPr>
-                <w:rFonts w:ascii="Calibri" w:cs="Calibri" w:eastAsia="Calibri" w:hAnsi="Calibri"/>
-                <w:b/>
-                <w:bCs/>
-                <w:color w:val="5B6B8C"/>
-                <w:sz w:val="22"/>
-                <w:szCs w:val="22"/>
-              </w:rPr>
-              <w:t xml:space="preserve">5</w:t>
-            </w:r>
-          </w:p>
-        </w:tc>
-        <w:tc>
-          <w:tcPr>
-            <w:tcW w:type="dxa" w:w="2700"/>
-            <w:tcBorders>
-              <w:top w:val="single" w:color="B9C6E8" w:sz="6"/>
-              <w:left w:val="single" w:color="B9C6E8" w:sz="6"/>
-              <w:bottom w:val="single" w:color="B9C6E8" w:sz="6"/>
-              <w:right w:val="single" w:color="B9C6E8" w:sz="6"/>
-            </w:tcBorders>
-            <w:tcMar>
-              <w:top w:type="dxa" w:w="60"/>
-              <w:left w:type="dxa" w:w="100"/>
-              <w:bottom w:type="dxa" w:w="60"/>
-              <w:right w:type="dxa" w:w="100"/>
-            </w:tcMar>
-            <w:vAlign w:val="center"/>
-          </w:tcPr>
-          <w:p>
-            <w:pPr>
-              <w:spacing w:after="0" w:before="0"/>
-              <w:jc w:val="center"/>
-            </w:pPr>
-            <w:r>
-              <w:rPr>
-                <w:rFonts w:ascii="Calibri" w:cs="Calibri" w:eastAsia="Calibri" w:hAnsi="Calibri"/>
-                <w:b/>
-                <w:bCs/>
-                <w:color w:val="5B6B8C"/>
-                <w:sz w:val="22"/>
-                <w:szCs w:val="22"/>
-              </w:rPr>
-              <w:t xml:space="preserve"/>
-            </w:r>
-          </w:p>
-        </w:tc>
-        <w:tc>
-          <w:tcPr>
-            <w:tcW w:type="dxa" w:w="2700"/>
-            <w:tcBorders>
-              <w:top w:val="single" w:color="B9C6E8" w:sz="6"/>
-              <w:left w:val="single" w:color="B9C6E8" w:sz="6"/>
-              <w:bottom w:val="single" w:color="B9C6E8" w:sz="6"/>
-              <w:right w:val="single" w:color="B9C6E8" w:sz="6"/>
-            </w:tcBorders>
-            <w:tcMar>
-              <w:top w:type="dxa" w:w="60"/>
-              <w:left w:type="dxa" w:w="100"/>
-              <w:bottom w:type="dxa" w:w="60"/>
-              <w:right w:type="dxa" w:w="100"/>
-            </w:tcMar>
-            <w:vAlign w:val="center"/>
-          </w:tcPr>
-          <w:p>
-            <w:pPr>
-              <w:spacing w:after="0" w:before="0"/>
-              <w:jc w:val="center"/>
-            </w:pPr>
-            <w:r>
-              <w:rPr>
-                <w:rFonts w:ascii="Calibri" w:cs="Calibri" w:eastAsia="Calibri" w:hAnsi="Calibri"/>
-                <w:b/>
-                <w:bCs/>
-                <w:color w:val="5B6B8C"/>
-                <w:sz w:val="22"/>
-                <w:szCs w:val="22"/>
-              </w:rPr>
-              <w:t xml:space="preserve"/>
-            </w:r>
-          </w:p>
-        </w:tc>
-        <w:tc>
-          <w:tcPr>
-            <w:tcW w:type="dxa" w:w="2506"/>
-            <w:tcBorders>
-              <w:top w:val="single" w:color="B9C6E8" w:sz="6"/>
-              <w:left w:val="single" w:color="B9C6E8" w:sz="6"/>
-              <w:bottom w:val="single" w:color="B9C6E8" w:sz="6"/>
-              <w:right w:val="single" w:color="B9C6E8" w:sz="6"/>
-            </w:tcBorders>
-            <w:tcMar>
-              <w:top w:type="dxa" w:w="60"/>
-              <w:left w:type="dxa" w:w="100"/>
-              <w:bottom w:type="dxa" w:w="60"/>
-              <w:right w:type="dxa" w:w="100"/>
-            </w:tcMar>
-            <w:vAlign w:val="center"/>
-          </w:tcPr>
-          <w:p>
-            <w:pPr>
-              <w:spacing w:after="0" w:before="0"/>
-              <w:jc w:val="center"/>
-            </w:pPr>
-            <w:r>
-              <w:rPr>
-                <w:rFonts w:ascii="Calibri" w:cs="Calibri" w:eastAsia="Calibri" w:hAnsi="Calibri"/>
-                <w:b/>
-                <w:bCs/>
-                <w:color w:val="5B6B8C"/>
-                <w:sz w:val="22"/>
-                <w:szCs w:val="22"/>
-              </w:rPr>
-              <w:t xml:space="preserve"/>
-            </w:r>
-          </w:p>
-        </w:tc>
-        <w:tc>
-          <w:tcPr>
-            <w:tcW w:type="dxa" w:w="1200"/>
-            <w:tcBorders>
-              <w:top w:val="single" w:color="B9C6E8" w:sz="6"/>
-              <w:left w:val="single" w:color="B9C6E8" w:sz="6"/>
-              <w:bottom w:val="single" w:color="B9C6E8" w:sz="6"/>
-              <w:right w:val="single" w:color="B9C6E8" w:sz="6"/>
-            </w:tcBorders>
-            <w:tcMar>
-              <w:top w:type="dxa" w:w="60"/>
-              <w:left w:type="dxa" w:w="100"/>
-              <w:bottom w:type="dxa" w:w="60"/>
-              <w:right w:type="dxa" w:w="100"/>
-            </w:tcMar>
-            <w:vAlign w:val="center"/>
-          </w:tcPr>
-          <w:p>
-            <w:pPr>
-              <w:spacing w:after="0" w:before="0"/>
-              <w:jc w:val="center"/>
-            </w:pPr>
-            <w:r>
-              <w:rPr>
-                <w:rFonts w:ascii="Calibri" w:cs="Calibri" w:eastAsia="Calibri" w:hAnsi="Calibri"/>
-                <w:b/>
-                <w:bCs/>
-                <w:color w:val="5B6B8C"/>
-                <w:sz w:val="22"/>
-                <w:szCs w:val="22"/>
-              </w:rPr>
-              <w:t xml:space="preserve"/>
-            </w:r>
-          </w:p>
-        </w:tc>
-      </w:tr>
-      <w:tr>
-        <w:trPr>
-          <w:cantSplit/>
-          <w:trHeight w:val="1350" w:hRule="atLeast"/>
-        </w:trPr>
-        <w:tc>
-          <w:tcPr>
-            <w:tcW w:type="dxa" w:w="1100"/>
-            <w:tcBorders>
-              <w:top w:val="single" w:color="B9C6E8" w:sz="6"/>
-              <w:left w:val="single" w:color="B9C6E8" w:sz="6"/>
-              <w:bottom w:val="single" w:color="B9C6E8" w:sz="6"/>
-              <w:right w:val="single" w:color="B9C6E8" w:sz="6"/>
-            </w:tcBorders>
-            <w:shd w:fill="F4F7FD" w:color="auto" w:val="clear"/>
-            <w:tcMar>
-              <w:top w:type="dxa" w:w="60"/>
-              <w:left w:type="dxa" w:w="100"/>
-              <w:bottom w:type="dxa" w:w="60"/>
-              <w:right w:type="dxa" w:w="100"/>
-            </w:tcMar>
-            <w:vAlign w:val="center"/>
-          </w:tcPr>
-          <w:p>
-            <w:pPr>
-              <w:spacing w:after="0" w:before="0"/>
-              <w:jc w:val="center"/>
-            </w:pPr>
-            <w:r>
-              <w:rPr>
-                <w:rFonts w:ascii="Calibri" w:cs="Calibri" w:eastAsia="Calibri" w:hAnsi="Calibri"/>
-                <w:b/>
-                <w:bCs/>
-                <w:color w:val="5B6B8C"/>
-                <w:sz w:val="22"/>
-                <w:szCs w:val="22"/>
-              </w:rPr>
-              <w:t xml:space="preserve">6</w:t>
-            </w:r>
-          </w:p>
-        </w:tc>
-        <w:tc>
-          <w:tcPr>
-            <w:tcW w:type="dxa" w:w="2700"/>
-            <w:tcBorders>
-              <w:top w:val="single" w:color="B9C6E8" w:sz="6"/>
-              <w:left w:val="single" w:color="B9C6E8" w:sz="6"/>
-              <w:bottom w:val="single" w:color="B9C6E8" w:sz="6"/>
-              <w:right w:val="single" w:color="B9C6E8" w:sz="6"/>
-            </w:tcBorders>
-            <w:tcMar>
-              <w:top w:type="dxa" w:w="60"/>
-              <w:left w:type="dxa" w:w="100"/>
-              <w:bottom w:type="dxa" w:w="60"/>
-              <w:right w:type="dxa" w:w="100"/>
-            </w:tcMar>
-            <w:vAlign w:val="center"/>
-          </w:tcPr>
-          <w:p>
-            <w:pPr>
-              <w:spacing w:after="0" w:before="0"/>
-              <w:jc w:val="center"/>
-            </w:pPr>
-            <w:r>
-              <w:rPr>
-                <w:rFonts w:ascii="Calibri" w:cs="Calibri" w:eastAsia="Calibri" w:hAnsi="Calibri"/>
-                <w:b/>
-                <w:bCs/>
-                <w:color w:val="5B6B8C"/>
-                <w:sz w:val="22"/>
-                <w:szCs w:val="22"/>
-              </w:rPr>
-              <w:t xml:space="preserve"/>
-            </w:r>
-          </w:p>
-        </w:tc>
-        <w:tc>
-          <w:tcPr>
-            <w:tcW w:type="dxa" w:w="2700"/>
-            <w:tcBorders>
-              <w:top w:val="single" w:color="B9C6E8" w:sz="6"/>
-              <w:left w:val="single" w:color="B9C6E8" w:sz="6"/>
-              <w:bottom w:val="single" w:color="B9C6E8" w:sz="6"/>
-              <w:right w:val="single" w:color="B9C6E8" w:sz="6"/>
-            </w:tcBorders>
-            <w:tcMar>
-              <w:top w:type="dxa" w:w="60"/>
-              <w:left w:type="dxa" w:w="100"/>
-              <w:bottom w:type="dxa" w:w="60"/>
-              <w:right w:type="dxa" w:w="100"/>
-            </w:tcMar>
-            <w:vAlign w:val="center"/>
-          </w:tcPr>
-          <w:p>
-            <w:pPr>
-              <w:spacing w:after="0" w:before="0"/>
-              <w:jc w:val="center"/>
-            </w:pPr>
-            <w:r>
-              <w:rPr>
-                <w:rFonts w:ascii="Calibri" w:cs="Calibri" w:eastAsia="Calibri" w:hAnsi="Calibri"/>
-                <w:b/>
-                <w:bCs/>
-                <w:color w:val="5B6B8C"/>
-                <w:sz w:val="22"/>
-                <w:szCs w:val="22"/>
-              </w:rPr>
-              <w:t xml:space="preserve"/>
-            </w:r>
-          </w:p>
-        </w:tc>
-        <w:tc>
-          <w:tcPr>
-            <w:tcW w:type="dxa" w:w="2506"/>
-            <w:tcBorders>
-              <w:top w:val="single" w:color="B9C6E8" w:sz="6"/>
-              <w:left w:val="single" w:color="B9C6E8" w:sz="6"/>
-              <w:bottom w:val="single" w:color="B9C6E8" w:sz="6"/>
-              <w:right w:val="single" w:color="B9C6E8" w:sz="6"/>
-            </w:tcBorders>
-            <w:tcMar>
-              <w:top w:type="dxa" w:w="60"/>
-              <w:left w:type="dxa" w:w="100"/>
-              <w:bottom w:type="dxa" w:w="60"/>
-              <w:right w:type="dxa" w:w="100"/>
-            </w:tcMar>
-            <w:vAlign w:val="center"/>
-          </w:tcPr>
-          <w:p>
-            <w:pPr>
-              <w:spacing w:after="0" w:before="0"/>
-              <w:jc w:val="center"/>
-            </w:pPr>
-            <w:r>
-              <w:rPr>
-                <w:rFonts w:ascii="Calibri" w:cs="Calibri" w:eastAsia="Calibri" w:hAnsi="Calibri"/>
-                <w:b/>
-                <w:bCs/>
-                <w:color w:val="5B6B8C"/>
-                <w:sz w:val="22"/>
-                <w:szCs w:val="22"/>
-              </w:rPr>
-              <w:t xml:space="preserve"/>
-            </w:r>
-          </w:p>
-        </w:tc>
-        <w:tc>
-          <w:tcPr>
-            <w:tcW w:type="dxa" w:w="1200"/>
-            <w:tcBorders>
-              <w:top w:val="single" w:color="B9C6E8" w:sz="6"/>
-              <w:left w:val="single" w:color="B9C6E8" w:sz="6"/>
-              <w:bottom w:val="single" w:color="B9C6E8" w:sz="6"/>
-              <w:right w:val="single" w:color="B9C6E8" w:sz="6"/>
-            </w:tcBorders>
-            <w:tcMar>
-              <w:top w:type="dxa" w:w="60"/>
-              <w:left w:type="dxa" w:w="100"/>
-              <w:bottom w:type="dxa" w:w="60"/>
-              <w:right w:type="dxa" w:w="100"/>
-            </w:tcMar>
-            <w:vAlign w:val="center"/>
-          </w:tcPr>
-          <w:p>
-            <w:pPr>
-              <w:spacing w:after="0" w:before="0"/>
-              <w:jc w:val="center"/>
-            </w:pPr>
-            <w:r>
-              <w:rPr>
-                <w:rFonts w:ascii="Calibri" w:cs="Calibri" w:eastAsia="Calibri" w:hAnsi="Calibri"/>
-                <w:b/>
-                <w:bCs/>
-                <w:color w:val="5B6B8C"/>
-                <w:sz w:val="22"/>
-                <w:szCs w:val="22"/>
-              </w:rPr>
-              <w:t xml:space="preserve"/>
-            </w:r>
-          </w:p>
-        </w:tc>
-      </w:tr>
-      <w:tr>
-        <w:trPr>
-          <w:cantSplit/>
-          <w:trHeight w:val="1350" w:hRule="atLeast"/>
-        </w:trPr>
-        <w:tc>
-          <w:tcPr>
-            <w:tcW w:type="dxa" w:w="1100"/>
-            <w:tcBorders>
-              <w:top w:val="single" w:color="B9C6E8" w:sz="6"/>
-              <w:left w:val="single" w:color="B9C6E8" w:sz="6"/>
-              <w:bottom w:val="single" w:color="B9C6E8" w:sz="6"/>
-              <w:right w:val="single" w:color="B9C6E8" w:sz="6"/>
-            </w:tcBorders>
-            <w:shd w:fill="F4F7FD" w:color="auto" w:val="clear"/>
-            <w:tcMar>
-              <w:top w:type="dxa" w:w="60"/>
-              <w:left w:type="dxa" w:w="100"/>
-              <w:bottom w:type="dxa" w:w="60"/>
-              <w:right w:type="dxa" w:w="100"/>
-            </w:tcMar>
-            <w:vAlign w:val="center"/>
-          </w:tcPr>
-          <w:p>
-            <w:pPr>
-              <w:spacing w:after="0" w:before="0"/>
-              <w:jc w:val="center"/>
-            </w:pPr>
-            <w:r>
-              <w:rPr>
-                <w:rFonts w:ascii="Calibri" w:cs="Calibri" w:eastAsia="Calibri" w:hAnsi="Calibri"/>
-                <w:b/>
-                <w:bCs/>
-                <w:color w:val="5B6B8C"/>
-                <w:sz w:val="22"/>
-                <w:szCs w:val="22"/>
-              </w:rPr>
-              <w:t xml:space="preserve">7</w:t>
-            </w:r>
-          </w:p>
-        </w:tc>
-        <w:tc>
-          <w:tcPr>
-            <w:tcW w:type="dxa" w:w="2700"/>
-            <w:tcBorders>
-              <w:top w:val="single" w:color="B9C6E8" w:sz="6"/>
-              <w:left w:val="single" w:color="B9C6E8" w:sz="6"/>
-              <w:bottom w:val="single" w:color="B9C6E8" w:sz="6"/>
-              <w:right w:val="single" w:color="B9C6E8" w:sz="6"/>
-            </w:tcBorders>
-            <w:tcMar>
-              <w:top w:type="dxa" w:w="60"/>
-              <w:left w:type="dxa" w:w="100"/>
-              <w:bottom w:type="dxa" w:w="60"/>
-              <w:right w:type="dxa" w:w="100"/>
-            </w:tcMar>
-            <w:vAlign w:val="center"/>
-          </w:tcPr>
-          <w:p>
-            <w:pPr>
-              <w:spacing w:after="0" w:before="0"/>
-              <w:jc w:val="center"/>
-            </w:pPr>
-            <w:r>
-              <w:rPr>
-                <w:rFonts w:ascii="Calibri" w:cs="Calibri" w:eastAsia="Calibri" w:hAnsi="Calibri"/>
-                <w:b/>
-                <w:bCs/>
-                <w:color w:val="5B6B8C"/>
-                <w:sz w:val="22"/>
-                <w:szCs w:val="22"/>
-              </w:rPr>
-              <w:t xml:space="preserve"/>
-            </w:r>
-          </w:p>
-        </w:tc>
-        <w:tc>
-          <w:tcPr>
-            <w:tcW w:type="dxa" w:w="2700"/>
-            <w:tcBorders>
-              <w:top w:val="single" w:color="B9C6E8" w:sz="6"/>
-              <w:left w:val="single" w:color="B9C6E8" w:sz="6"/>
-              <w:bottom w:val="single" w:color="B9C6E8" w:sz="6"/>
-              <w:right w:val="single" w:color="B9C6E8" w:sz="6"/>
-            </w:tcBorders>
-            <w:tcMar>
-              <w:top w:type="dxa" w:w="60"/>
-              <w:left w:type="dxa" w:w="100"/>
-              <w:bottom w:type="dxa" w:w="60"/>
-              <w:right w:type="dxa" w:w="100"/>
-            </w:tcMar>
-            <w:vAlign w:val="center"/>
-          </w:tcPr>
-          <w:p>
-            <w:pPr>
-              <w:spacing w:after="0" w:before="0"/>
-              <w:jc w:val="center"/>
-            </w:pPr>
-            <w:r>
-              <w:rPr>
-                <w:rFonts w:ascii="Calibri" w:cs="Calibri" w:eastAsia="Calibri" w:hAnsi="Calibri"/>
-                <w:b/>
-                <w:bCs/>
-                <w:color w:val="5B6B8C"/>
-                <w:sz w:val="22"/>
-                <w:szCs w:val="22"/>
-              </w:rPr>
-              <w:t xml:space="preserve"/>
-            </w:r>
-          </w:p>
-        </w:tc>
-        <w:tc>
-          <w:tcPr>
-            <w:tcW w:type="dxa" w:w="2506"/>
-            <w:tcBorders>
-              <w:top w:val="single" w:color="B9C6E8" w:sz="6"/>
-              <w:left w:val="single" w:color="B9C6E8" w:sz="6"/>
-              <w:bottom w:val="single" w:color="B9C6E8" w:sz="6"/>
-              <w:right w:val="single" w:color="B9C6E8" w:sz="6"/>
-            </w:tcBorders>
-            <w:tcMar>
-              <w:top w:type="dxa" w:w="60"/>
-              <w:left w:type="dxa" w:w="100"/>
-              <w:bottom w:type="dxa" w:w="60"/>
-              <w:right w:type="dxa" w:w="100"/>
-            </w:tcMar>
-            <w:vAlign w:val="center"/>
-          </w:tcPr>
-          <w:p>
-            <w:pPr>
-              <w:spacing w:after="0" w:before="0"/>
-              <w:jc w:val="center"/>
-            </w:pPr>
-            <w:r>
-              <w:rPr>
-                <w:rFonts w:ascii="Calibri" w:cs="Calibri" w:eastAsia="Calibri" w:hAnsi="Calibri"/>
-                <w:b/>
-                <w:bCs/>
-                <w:color w:val="5B6B8C"/>
-                <w:sz w:val="22"/>
-                <w:szCs w:val="22"/>
-              </w:rPr>
-              <w:t xml:space="preserve"/>
-            </w:r>
-          </w:p>
-        </w:tc>
-        <w:tc>
-          <w:tcPr>
-            <w:tcW w:type="dxa" w:w="1200"/>
-            <w:tcBorders>
-              <w:top w:val="single" w:color="B9C6E8" w:sz="6"/>
-              <w:left w:val="single" w:color="B9C6E8" w:sz="6"/>
-              <w:bottom w:val="single" w:color="B9C6E8" w:sz="6"/>
-              <w:right w:val="single" w:color="B9C6E8" w:sz="6"/>
-            </w:tcBorders>
-            <w:tcMar>
-              <w:top w:type="dxa" w:w="60"/>
-              <w:left w:type="dxa" w:w="100"/>
-              <w:bottom w:type="dxa" w:w="60"/>
-              <w:right w:type="dxa" w:w="100"/>
-            </w:tcMar>
-            <w:vAlign w:val="center"/>
-          </w:tcPr>
-          <w:p>
-            <w:pPr>
-              <w:spacing w:after="0" w:before="0"/>
-              <w:jc w:val="center"/>
-            </w:pPr>
-            <w:r>
-              <w:rPr>
-                <w:rFonts w:ascii="Calibri" w:cs="Calibri" w:eastAsia="Calibri" w:hAnsi="Calibri"/>
-                <w:b/>
-                <w:bCs/>
-                <w:color w:val="5B6B8C"/>
+              <w:spacing w:after="100" w:before="0"/>
+            </w:pPr>
+            <w:r>
+              <w:rPr>
+                <w:rFonts w:ascii="Calibri" w:cs="Calibri" w:eastAsia="Calibri" w:hAnsi="Calibri"/>
+                <w:color w:val="000000"/>
                 <w:sz w:val="22"/>
                 <w:szCs w:val="22"/>
               </w:rPr>

</xml_diff>

<commit_message>
Deutsch 11: Lösungen im Unterrichtsgespräch statt Selbstkontrolle, Sicherungsfolien
Co-Authored-By: Claude Opus 5.5 <noreply@anthropic.com>
Claude-Session: https://claude.ai/code/session_01Kzh1oWiqhC6W8oSNq8mKnj
</commit_message>
<xml_diff>
--- a/Deutsch_11/Kommunikationsstoerungen_loesen/Arbeitsblatt_Kommunikationsstoerungen_loesen.docx
+++ b/Deutsch_11/Kommunikationsstoerungen_loesen/Arbeitsblatt_Kommunikationsstoerungen_loesen.docx
@@ -1860,7 +1860,7 @@
           <w:sz w:val="18"/>
           <w:szCs w:val="18"/>
         </w:rPr>
-        <w:t xml:space="preserve">AUFGABE 2 · PARTNERARBEIT · 10 MIN.</w:t>
+        <w:t xml:space="preserve">AUFGABE 2 · PARTNERARBEIT · 8 MIN. + UNTERRICHTSGESPRÄCH 5 MIN.</w:t>
       </w:r>
     </w:p>
     <w:p>
@@ -2025,7 +2025,7 @@
           <w:sz w:val="22"/>
           <w:szCs w:val="22"/>
         </w:rPr>
-        <w:t xml:space="preserve">Holt euch das Lösungsblatt vom Pult und vergleicht. Ergänzt, was euch fehlt, </w:t>
+        <w:t xml:space="preserve">Im anschließenden Unterrichtsgespräch vergleichen wir. Ergänzt, was euch fehlt, </w:t>
       </w:r>
       <w:r>
         <w:rPr>
@@ -3076,7 +3076,7 @@
           <w:sz w:val="18"/>
           <w:szCs w:val="18"/>
         </w:rPr>
-        <w:t xml:space="preserve">AUFGABE 3 · GRUPPENPUZZLE · 3 GRUPPEN À 7 · 20 MIN.</w:t>
+        <w:t xml:space="preserve">AUFGABE 3 · GRUPPENPUZZLE · 3 GRUPPEN À 7 · 17 MIN. + UNTERRICHTSGESPRÄCH 5 MIN.</w:t>
       </w:r>
     </w:p>
     <w:p>
@@ -3202,7 +3202,7 @@
           <w:sz w:val="22"/>
           <w:szCs w:val="22"/>
         </w:rPr>
-        <w:t xml:space="preserve"> lesen je zwei Personen im Tandem (5 Min.).</w:t>
+        <w:t xml:space="preserve"> lesen je zwei Personen im Tandem (4 Min.).</w:t>
       </w:r>
     </w:p>
     <w:p>
@@ -3238,16 +3238,16 @@
           <w:sz w:val="22"/>
           <w:szCs w:val="22"/>
         </w:rPr>
-        <w:t xml:space="preserve">höchstens 2 Minuten</w:t>
-      </w:r>
-      <w:r>
-        <w:rPr>
-          <w:rFonts w:ascii="Calibri" w:cs="Calibri" w:eastAsia="Calibri" w:hAnsi="Calibri"/>
-          <w:color w:val="000000"/>
-          <w:sz w:val="22"/>
-          <w:szCs w:val="22"/>
-        </w:rPr>
-        <w:t xml:space="preserve"> – mit dem Beispiel von der Karte (8 Min.).</w:t>
+        <w:t xml:space="preserve">höchstens 90 Sekunden</w:t>
+      </w:r>
+      <w:r>
+        <w:rPr>
+          <w:rFonts w:ascii="Calibri" w:cs="Calibri" w:eastAsia="Calibri" w:hAnsi="Calibri"/>
+          <w:color w:val="000000"/>
+          <w:sz w:val="22"/>
+          <w:szCs w:val="22"/>
+        </w:rPr>
+        <w:t xml:space="preserve"> – mit dem Beispiel von der Karte (7 Min.).</w:t>
       </w:r>
     </w:p>
     <w:p>
@@ -3292,7 +3292,7 @@
           <w:sz w:val="22"/>
           <w:szCs w:val="22"/>
         </w:rPr>
-        <w:t xml:space="preserve"> gemeinsam neu – alle schreiben mit. Nutzt mindestens drei der vier Strategien und notiert rechts den Buchstaben (7 Min.).</w:t>
+        <w:t xml:space="preserve"> gemeinsam neu – alle schreiben mit. Nutzt mindestens drei der vier Strategien und notiert rechts den Buchstaben (6 Min.).</w:t>
       </w:r>
     </w:p>
     <w:p>
@@ -3317,7 +3317,7 @@
           <w:sz w:val="22"/>
           <w:szCs w:val="22"/>
         </w:rPr>
-        <w:t xml:space="preserve">Prüft eure Version mit der Checkliste. Tragt dann in Aufgabe 2 die letzte Spalte nach.</w:t>
+        <w:t xml:space="preserve">Prüft eure Version mit der Checkliste. Im Unterrichtsgespräch liest die Protokoll-Person eure Version vor. Tragt danach in Aufgabe 2 die letzte Spalte nach.</w:t>
       </w:r>
     </w:p>
     <w:tbl>
@@ -4985,7 +4985,7 @@
           <w:sz w:val="18"/>
           <w:szCs w:val="18"/>
         </w:rPr>
-        <w:t xml:space="preserve">AUFGABE 4 · REIHEN-GRUPPE · 20 MIN.</w:t>
+        <w:t xml:space="preserve">AUFGABE 4 · REIHEN-GRUPPE · 17 MIN.</w:t>
       </w:r>
     </w:p>
     <w:p>
@@ -6305,7 +6305,7 @@
           <w:sz w:val="18"/>
           <w:szCs w:val="18"/>
         </w:rPr>
-        <w:t xml:space="preserve">AUFGABE 5 · BÜHNE FREI · 15 MIN. + AUSWERTUNG 13 MIN.</w:t>
+        <w:t xml:space="preserve">AUFGABE 5 · BÜHNE FREI · 13 MIN. + AUSWERTUNG 13 MIN.</w:t>
       </w:r>
     </w:p>
     <w:p>

</xml_diff>

<commit_message>
Deutsch 11: Merkkasten Werkzeugkasten als Sicherung im Unterrichtsgespräch 2
Co-Authored-By: Claude Opus 5.5 <noreply@anthropic.com>
Claude-Session: https://claude.ai/code/session_01Kzh1oWiqhC6W8oSNq8mKnj
</commit_message>
<xml_diff>
--- a/Deutsch_11/Kommunikationsstoerungen_loesen/Arbeitsblatt_Kommunikationsstoerungen_loesen.docx
+++ b/Deutsch_11/Kommunikationsstoerungen_loesen/Arbeitsblatt_Kommunikationsstoerungen_loesen.docx
@@ -3076,7 +3076,7 @@
           <w:sz w:val="18"/>
           <w:szCs w:val="18"/>
         </w:rPr>
-        <w:t xml:space="preserve">AUFGABE 3 · GRUPPENPUZZLE · 3 GRUPPEN À 7 · 17 MIN. + UNTERRICHTSGESPRÄCH 5 MIN.</w:t>
+        <w:t xml:space="preserve">AUFGABE 3 · GRUPPENPUZZLE · 3 GRUPPEN À 7 · 17 MIN.</w:t>
       </w:r>
     </w:p>
     <w:p>
@@ -3317,7 +3317,7 @@
           <w:sz w:val="22"/>
           <w:szCs w:val="22"/>
         </w:rPr>
-        <w:t xml:space="preserve">Prüft eure Version mit der Checkliste. Im Unterrichtsgespräch liest die Protokoll-Person eure Version vor. Tragt danach in Aufgabe 2 die letzte Spalte nach.</w:t>
+        <w:t xml:space="preserve">Prüft eure Version mit der Checkliste. Im Unterrichtsgespräch liest die Protokoll-Person eure Version vor – dabei füllen alle den Merkkasten auf der nächsten Seite aus.</w:t>
       </w:r>
     </w:p>
     <w:tbl>
@@ -4985,6 +4985,881 @@
           <w:sz w:val="18"/>
           <w:szCs w:val="18"/>
         </w:rPr>
+        <w:t xml:space="preserve">MERKKASTEN · UNTERRICHTSGESPRÄCH 2 · 7 MIN.</w:t>
+      </w:r>
+    </w:p>
+    <w:p>
+      <w:pPr>
+        <w:spacing w:after="60" w:before="0"/>
+      </w:pPr>
+      <w:r>
+        <w:rPr>
+          <w:rFonts w:ascii="Cambria" w:cs="Cambria" w:eastAsia="Cambria" w:hAnsi="Cambria"/>
+          <w:b/>
+          <w:bCs/>
+          <w:color w:val="1E2761"/>
+          <w:sz w:val="40"/>
+          <w:szCs w:val="40"/>
+        </w:rPr>
+        <w:t xml:space="preserve">Unser Werkzeugkasten</w:t>
+      </w:r>
+    </w:p>
+    <w:p>
+      <w:pPr>
+        <w:spacing w:after="60" w:before="0"/>
+      </w:pPr>
+      <w:r>
+        <w:rPr>
+          <w:rFonts w:ascii="Calibri" w:cs="Calibri" w:eastAsia="Calibri" w:hAnsi="Calibri"/>
+          <w:color w:val="000000"/>
+          <w:sz w:val="22"/>
+          <w:szCs w:val="22"/>
+        </w:rPr>
+        <w:t xml:space="preserve">Die Gruppen lesen ihre Version B vor. Hört genau hin: </w:t>
+      </w:r>
+      <w:r>
+        <w:rPr>
+          <w:rFonts w:ascii="Calibri" w:cs="Calibri" w:eastAsia="Calibri" w:hAnsi="Calibri"/>
+          <w:b/>
+          <w:bCs/>
+          <w:color w:val="000000"/>
+          <w:sz w:val="22"/>
+          <w:szCs w:val="22"/>
+        </w:rPr>
+        <w:t xml:space="preserve">Welche Strategie steckt in welcher Formulierung?</w:t>
+      </w:r>
+      <w:r>
+        <w:rPr>
+          <w:rFonts w:ascii="Calibri" w:cs="Calibri" w:eastAsia="Calibri" w:hAnsi="Calibri"/>
+          <w:color w:val="000000"/>
+          <w:sz w:val="22"/>
+          <w:szCs w:val="22"/>
+        </w:rPr>
+        <w:t xml:space="preserve"> Tragt für jede Strategie die Formel und das beste Beispiel ein.</w:t>
+      </w:r>
+    </w:p>
+    <w:p>
+      <w:pPr>
+        <w:spacing w:after="120" w:before="0"/>
+      </w:pPr>
+      <w:r>
+        <w:rPr>
+          <w:rFonts w:ascii="Calibri" w:cs="Calibri" w:eastAsia="Calibri" w:hAnsi="Calibri"/>
+          <w:i/>
+          <w:iCs/>
+          <w:color w:val="5B6B8C"/>
+          <w:sz w:val="22"/>
+          <w:szCs w:val="22"/>
+        </w:rPr>
+        <w:t xml:space="preserve">Diesen Kasten nutzt ihr gleich für eure eigene Szene.</w:t>
+      </w:r>
+    </w:p>
+    <w:tbl>
+      <w:tblPr>
+        <w:tblW w:type="dxa" w:w="10206"/>
+        <w:tblBorders>
+          <w:top w:val="single" w:color="auto" w:sz="4"/>
+          <w:left w:val="single" w:color="auto" w:sz="4"/>
+          <w:bottom w:val="single" w:color="auto" w:sz="4"/>
+          <w:right w:val="single" w:color="auto" w:sz="4"/>
+          <w:insideH w:val="single" w:color="auto" w:sz="4"/>
+          <w:insideV w:val="single" w:color="auto" w:sz="4"/>
+        </w:tblBorders>
+      </w:tblPr>
+      <w:tblGrid>
+        <w:gridCol w:w="2700"/>
+        <w:gridCol w:w="3906"/>
+        <w:gridCol w:w="3600"/>
+      </w:tblGrid>
+      <w:tr>
+        <w:trPr>
+          <w:cantSplit/>
+          <w:trHeight w:val="560" w:hRule="atLeast"/>
+        </w:trPr>
+        <w:tc>
+          <w:tcPr>
+            <w:tcW w:type="dxa" w:w="2700"/>
+            <w:tcBorders>
+              <w:top w:val="single" w:color="B9C6E8" w:sz="6"/>
+              <w:left w:val="single" w:color="B9C6E8" w:sz="6"/>
+              <w:bottom w:val="single" w:color="B9C6E8" w:sz="6"/>
+              <w:right w:val="single" w:color="B9C6E8" w:sz="6"/>
+            </w:tcBorders>
+            <w:shd w:fill="1E2761" w:color="auto" w:val="clear"/>
+            <w:tcMar>
+              <w:top w:type="dxa" w:w="60"/>
+              <w:left w:type="dxa" w:w="100"/>
+              <w:bottom w:type="dxa" w:w="60"/>
+              <w:right w:type="dxa" w:w="100"/>
+            </w:tcMar>
+            <w:vAlign w:val="center"/>
+          </w:tcPr>
+          <w:p>
+            <w:pPr>
+              <w:spacing w:after="0" w:before="0"/>
+              <w:jc w:val="center"/>
+            </w:pPr>
+            <w:r>
+              <w:rPr>
+                <w:rFonts w:ascii="Calibri" w:cs="Calibri" w:eastAsia="Calibri" w:hAnsi="Calibri"/>
+                <w:b/>
+                <w:bCs/>
+                <w:color w:val="FFFFFF"/>
+                <w:sz w:val="20"/>
+                <w:szCs w:val="20"/>
+              </w:rPr>
+              <w:t xml:space="preserve">Strategie</w:t>
+            </w:r>
+          </w:p>
+        </w:tc>
+        <w:tc>
+          <w:tcPr>
+            <w:tcW w:type="dxa" w:w="3906"/>
+            <w:tcBorders>
+              <w:top w:val="single" w:color="B9C6E8" w:sz="6"/>
+              <w:left w:val="single" w:color="B9C6E8" w:sz="6"/>
+              <w:bottom w:val="single" w:color="B9C6E8" w:sz="6"/>
+              <w:right w:val="single" w:color="B9C6E8" w:sz="6"/>
+            </w:tcBorders>
+            <w:shd w:fill="1E2761" w:color="auto" w:val="clear"/>
+            <w:tcMar>
+              <w:top w:type="dxa" w:w="60"/>
+              <w:left w:type="dxa" w:w="100"/>
+              <w:bottom w:type="dxa" w:w="60"/>
+              <w:right w:type="dxa" w:w="100"/>
+            </w:tcMar>
+            <w:vAlign w:val="center"/>
+          </w:tcPr>
+          <w:p>
+            <w:pPr>
+              <w:spacing w:after="0" w:before="0"/>
+              <w:jc w:val="center"/>
+            </w:pPr>
+            <w:r>
+              <w:rPr>
+                <w:rFonts w:ascii="Calibri" w:cs="Calibri" w:eastAsia="Calibri" w:hAnsi="Calibri"/>
+                <w:b/>
+                <w:bCs/>
+                <w:color w:val="FFFFFF"/>
+                <w:sz w:val="20"/>
+                <w:szCs w:val="20"/>
+              </w:rPr>
+              <w:t xml:space="preserve">Formel / So geht’s</w:t>
+            </w:r>
+          </w:p>
+        </w:tc>
+        <w:tc>
+          <w:tcPr>
+            <w:tcW w:type="dxa" w:w="3600"/>
+            <w:tcBorders>
+              <w:top w:val="single" w:color="B9C6E8" w:sz="6"/>
+              <w:left w:val="single" w:color="B9C6E8" w:sz="6"/>
+              <w:bottom w:val="single" w:color="B9C6E8" w:sz="6"/>
+              <w:right w:val="single" w:color="B9C6E8" w:sz="6"/>
+            </w:tcBorders>
+            <w:shd w:fill="1E2761" w:color="auto" w:val="clear"/>
+            <w:tcMar>
+              <w:top w:type="dxa" w:w="60"/>
+              <w:left w:type="dxa" w:w="100"/>
+              <w:bottom w:type="dxa" w:w="60"/>
+              <w:right w:type="dxa" w:w="100"/>
+            </w:tcMar>
+            <w:vAlign w:val="center"/>
+          </w:tcPr>
+          <w:p>
+            <w:pPr>
+              <w:spacing w:after="0" w:before="0"/>
+              <w:jc w:val="center"/>
+            </w:pPr>
+            <w:r>
+              <w:rPr>
+                <w:rFonts w:ascii="Calibri" w:cs="Calibri" w:eastAsia="Calibri" w:hAnsi="Calibri"/>
+                <w:b/>
+                <w:bCs/>
+                <w:color w:val="FFFFFF"/>
+                <w:sz w:val="20"/>
+                <w:szCs w:val="20"/>
+              </w:rPr>
+              <w:t xml:space="preserve">Beispiel</w:t>
+            </w:r>
+          </w:p>
+          <w:p>
+            <w:pPr>
+              <w:spacing w:after="0" w:before="0"/>
+              <w:jc w:val="center"/>
+            </w:pPr>
+            <w:r>
+              <w:rPr>
+                <w:rFonts w:ascii="Calibri" w:cs="Calibri" w:eastAsia="Calibri" w:hAnsi="Calibri"/>
+                <w:color w:val="FFFFFF"/>
+                <w:sz w:val="15"/>
+                <w:szCs w:val="15"/>
+              </w:rPr>
+              <w:t xml:space="preserve">aus einer vorgelesenen Version</w:t>
+            </w:r>
+          </w:p>
+        </w:tc>
+      </w:tr>
+      <w:tr>
+        <w:trPr>
+          <w:cantSplit/>
+          <w:trHeight w:val="2000" w:hRule="atLeast"/>
+        </w:trPr>
+        <w:tc>
+          <w:tcPr>
+            <w:tcW w:type="dxa" w:w="2700"/>
+            <w:tcBorders>
+              <w:top w:val="single" w:color="B9C6E8" w:sz="6"/>
+              <w:left w:val="single" w:color="B9C6E8" w:sz="6"/>
+              <w:bottom w:val="single" w:color="B9C6E8" w:sz="6"/>
+              <w:right w:val="single" w:color="B9C6E8" w:sz="6"/>
+            </w:tcBorders>
+            <w:shd w:fill="3F7CC4" w:color="auto" w:val="clear"/>
+            <w:tcMar>
+              <w:top w:type="dxa" w:w="120"/>
+              <w:left w:type="dxa" w:w="100"/>
+              <w:bottom w:type="dxa" w:w="120"/>
+              <w:right w:type="dxa" w:w="100"/>
+            </w:tcMar>
+            <w:vAlign w:val="top"/>
+          </w:tcPr>
+          <w:p>
+            <w:pPr>
+              <w:spacing w:after="0" w:before="0"/>
+            </w:pPr>
+            <w:r>
+              <w:rPr>
+                <w:rFonts w:ascii="Cambria" w:cs="Cambria" w:eastAsia="Cambria" w:hAnsi="Cambria"/>
+                <w:b/>
+                <w:bCs/>
+                <w:color w:val="FFFFFF"/>
+                <w:sz w:val="40"/>
+                <w:szCs w:val="40"/>
+              </w:rPr>
+              <w:t xml:space="preserve">A</w:t>
+            </w:r>
+          </w:p>
+          <w:p>
+            <w:pPr>
+              <w:spacing w:after="0" w:before="0"/>
+            </w:pPr>
+            <w:r>
+              <w:rPr>
+                <w:rFonts w:ascii="Calibri" w:cs="Calibri" w:eastAsia="Calibri" w:hAnsi="Calibri"/>
+                <w:b/>
+                <w:bCs/>
+                <w:color w:val="FFFFFF"/>
+                <w:sz w:val="20"/>
+                <w:szCs w:val="20"/>
+              </w:rPr>
+              <w:t xml:space="preserve">Ich-Botschaft</w:t>
+            </w:r>
+          </w:p>
+        </w:tc>
+        <w:tc>
+          <w:tcPr>
+            <w:tcW w:type="dxa" w:w="3906"/>
+            <w:tcBorders>
+              <w:top w:val="single" w:color="B9C6E8" w:sz="6"/>
+              <w:left w:val="single" w:color="B9C6E8" w:sz="6"/>
+              <w:bottom w:val="single" w:color="B9C6E8" w:sz="6"/>
+              <w:right w:val="single" w:color="B9C6E8" w:sz="6"/>
+            </w:tcBorders>
+            <w:tcMar>
+              <w:top w:type="dxa" w:w="60"/>
+              <w:left w:type="dxa" w:w="100"/>
+              <w:bottom w:type="dxa" w:w="60"/>
+              <w:right w:type="dxa" w:w="100"/>
+            </w:tcMar>
+            <w:vAlign w:val="center"/>
+          </w:tcPr>
+          <w:p>
+            <w:pPr>
+              <w:spacing w:after="100" w:before="0"/>
+            </w:pPr>
+            <w:r>
+              <w:rPr>
+                <w:rFonts w:ascii="Calibri" w:cs="Calibri" w:eastAsia="Calibri" w:hAnsi="Calibri"/>
+                <w:color w:val="000000"/>
+                <w:sz w:val="22"/>
+                <w:szCs w:val="22"/>
+              </w:rPr>
+              <w:t xml:space="preserve"/>
+            </w:r>
+          </w:p>
+        </w:tc>
+        <w:tc>
+          <w:tcPr>
+            <w:tcW w:type="dxa" w:w="3600"/>
+            <w:tcBorders>
+              <w:top w:val="single" w:color="B9C6E8" w:sz="6"/>
+              <w:left w:val="single" w:color="B9C6E8" w:sz="6"/>
+              <w:bottom w:val="single" w:color="B9C6E8" w:sz="6"/>
+              <w:right w:val="single" w:color="B9C6E8" w:sz="6"/>
+            </w:tcBorders>
+            <w:tcMar>
+              <w:top w:type="dxa" w:w="60"/>
+              <w:left w:type="dxa" w:w="100"/>
+              <w:bottom w:type="dxa" w:w="60"/>
+              <w:right w:type="dxa" w:w="100"/>
+            </w:tcMar>
+            <w:vAlign w:val="center"/>
+          </w:tcPr>
+          <w:p>
+            <w:pPr>
+              <w:spacing w:after="100" w:before="0"/>
+            </w:pPr>
+            <w:r>
+              <w:rPr>
+                <w:rFonts w:ascii="Calibri" w:cs="Calibri" w:eastAsia="Calibri" w:hAnsi="Calibri"/>
+                <w:color w:val="000000"/>
+                <w:sz w:val="22"/>
+                <w:szCs w:val="22"/>
+              </w:rPr>
+              <w:t xml:space="preserve"/>
+            </w:r>
+          </w:p>
+        </w:tc>
+      </w:tr>
+      <w:tr>
+        <w:trPr>
+          <w:cantSplit/>
+          <w:trHeight w:val="2000" w:hRule="atLeast"/>
+        </w:trPr>
+        <w:tc>
+          <w:tcPr>
+            <w:tcW w:type="dxa" w:w="2700"/>
+            <w:tcBorders>
+              <w:top w:val="single" w:color="B9C6E8" w:sz="6"/>
+              <w:left w:val="single" w:color="B9C6E8" w:sz="6"/>
+              <w:bottom w:val="single" w:color="B9C6E8" w:sz="6"/>
+              <w:right w:val="single" w:color="B9C6E8" w:sz="6"/>
+            </w:tcBorders>
+            <w:shd w:fill="2E9E6B" w:color="auto" w:val="clear"/>
+            <w:tcMar>
+              <w:top w:type="dxa" w:w="120"/>
+              <w:left w:type="dxa" w:w="100"/>
+              <w:bottom w:type="dxa" w:w="120"/>
+              <w:right w:type="dxa" w:w="100"/>
+            </w:tcMar>
+            <w:vAlign w:val="top"/>
+          </w:tcPr>
+          <w:p>
+            <w:pPr>
+              <w:spacing w:after="0" w:before="0"/>
+            </w:pPr>
+            <w:r>
+              <w:rPr>
+                <w:rFonts w:ascii="Cambria" w:cs="Cambria" w:eastAsia="Cambria" w:hAnsi="Cambria"/>
+                <w:b/>
+                <w:bCs/>
+                <w:color w:val="FFFFFF"/>
+                <w:sz w:val="40"/>
+                <w:szCs w:val="40"/>
+              </w:rPr>
+              <w:t xml:space="preserve">B</w:t>
+            </w:r>
+          </w:p>
+          <w:p>
+            <w:pPr>
+              <w:spacing w:after="0" w:before="0"/>
+            </w:pPr>
+            <w:r>
+              <w:rPr>
+                <w:rFonts w:ascii="Calibri" w:cs="Calibri" w:eastAsia="Calibri" w:hAnsi="Calibri"/>
+                <w:b/>
+                <w:bCs/>
+                <w:color w:val="FFFFFF"/>
+                <w:sz w:val="20"/>
+                <w:szCs w:val="20"/>
+              </w:rPr>
+              <w:t xml:space="preserve">Empathie</w:t>
+            </w:r>
+          </w:p>
+        </w:tc>
+        <w:tc>
+          <w:tcPr>
+            <w:tcW w:type="dxa" w:w="3906"/>
+            <w:tcBorders>
+              <w:top w:val="single" w:color="B9C6E8" w:sz="6"/>
+              <w:left w:val="single" w:color="B9C6E8" w:sz="6"/>
+              <w:bottom w:val="single" w:color="B9C6E8" w:sz="6"/>
+              <w:right w:val="single" w:color="B9C6E8" w:sz="6"/>
+            </w:tcBorders>
+            <w:tcMar>
+              <w:top w:type="dxa" w:w="60"/>
+              <w:left w:type="dxa" w:w="100"/>
+              <w:bottom w:type="dxa" w:w="60"/>
+              <w:right w:type="dxa" w:w="100"/>
+            </w:tcMar>
+            <w:vAlign w:val="center"/>
+          </w:tcPr>
+          <w:p>
+            <w:pPr>
+              <w:spacing w:after="100" w:before="0"/>
+            </w:pPr>
+            <w:r>
+              <w:rPr>
+                <w:rFonts w:ascii="Calibri" w:cs="Calibri" w:eastAsia="Calibri" w:hAnsi="Calibri"/>
+                <w:color w:val="000000"/>
+                <w:sz w:val="22"/>
+                <w:szCs w:val="22"/>
+              </w:rPr>
+              <w:t xml:space="preserve"/>
+            </w:r>
+          </w:p>
+        </w:tc>
+        <w:tc>
+          <w:tcPr>
+            <w:tcW w:type="dxa" w:w="3600"/>
+            <w:tcBorders>
+              <w:top w:val="single" w:color="B9C6E8" w:sz="6"/>
+              <w:left w:val="single" w:color="B9C6E8" w:sz="6"/>
+              <w:bottom w:val="single" w:color="B9C6E8" w:sz="6"/>
+              <w:right w:val="single" w:color="B9C6E8" w:sz="6"/>
+            </w:tcBorders>
+            <w:tcMar>
+              <w:top w:type="dxa" w:w="60"/>
+              <w:left w:type="dxa" w:w="100"/>
+              <w:bottom w:type="dxa" w:w="60"/>
+              <w:right w:type="dxa" w:w="100"/>
+            </w:tcMar>
+            <w:vAlign w:val="center"/>
+          </w:tcPr>
+          <w:p>
+            <w:pPr>
+              <w:spacing w:after="100" w:before="0"/>
+            </w:pPr>
+            <w:r>
+              <w:rPr>
+                <w:rFonts w:ascii="Calibri" w:cs="Calibri" w:eastAsia="Calibri" w:hAnsi="Calibri"/>
+                <w:color w:val="000000"/>
+                <w:sz w:val="22"/>
+                <w:szCs w:val="22"/>
+              </w:rPr>
+              <w:t xml:space="preserve"/>
+            </w:r>
+          </w:p>
+        </w:tc>
+      </w:tr>
+      <w:tr>
+        <w:trPr>
+          <w:cantSplit/>
+          <w:trHeight w:val="2000" w:hRule="atLeast"/>
+        </w:trPr>
+        <w:tc>
+          <w:tcPr>
+            <w:tcW w:type="dxa" w:w="2700"/>
+            <w:tcBorders>
+              <w:top w:val="single" w:color="B9C6E8" w:sz="6"/>
+              <w:left w:val="single" w:color="B9C6E8" w:sz="6"/>
+              <w:bottom w:val="single" w:color="B9C6E8" w:sz="6"/>
+              <w:right w:val="single" w:color="B9C6E8" w:sz="6"/>
+            </w:tcBorders>
+            <w:shd w:fill="E8A33D" w:color="auto" w:val="clear"/>
+            <w:tcMar>
+              <w:top w:type="dxa" w:w="120"/>
+              <w:left w:type="dxa" w:w="100"/>
+              <w:bottom w:type="dxa" w:w="120"/>
+              <w:right w:type="dxa" w:w="100"/>
+            </w:tcMar>
+            <w:vAlign w:val="top"/>
+          </w:tcPr>
+          <w:p>
+            <w:pPr>
+              <w:spacing w:after="0" w:before="0"/>
+            </w:pPr>
+            <w:r>
+              <w:rPr>
+                <w:rFonts w:ascii="Cambria" w:cs="Cambria" w:eastAsia="Cambria" w:hAnsi="Cambria"/>
+                <w:b/>
+                <w:bCs/>
+                <w:color w:val="FFFFFF"/>
+                <w:sz w:val="40"/>
+                <w:szCs w:val="40"/>
+              </w:rPr>
+              <w:t xml:space="preserve">C</w:t>
+            </w:r>
+          </w:p>
+          <w:p>
+            <w:pPr>
+              <w:spacing w:after="0" w:before="0"/>
+            </w:pPr>
+            <w:r>
+              <w:rPr>
+                <w:rFonts w:ascii="Calibri" w:cs="Calibri" w:eastAsia="Calibri" w:hAnsi="Calibri"/>
+                <w:b/>
+                <w:bCs/>
+                <w:color w:val="FFFFFF"/>
+                <w:sz w:val="20"/>
+                <w:szCs w:val="20"/>
+              </w:rPr>
+              <w:t xml:space="preserve">Wunsch / Bitte</w:t>
+            </w:r>
+          </w:p>
+        </w:tc>
+        <w:tc>
+          <w:tcPr>
+            <w:tcW w:type="dxa" w:w="3906"/>
+            <w:tcBorders>
+              <w:top w:val="single" w:color="B9C6E8" w:sz="6"/>
+              <w:left w:val="single" w:color="B9C6E8" w:sz="6"/>
+              <w:bottom w:val="single" w:color="B9C6E8" w:sz="6"/>
+              <w:right w:val="single" w:color="B9C6E8" w:sz="6"/>
+            </w:tcBorders>
+            <w:tcMar>
+              <w:top w:type="dxa" w:w="60"/>
+              <w:left w:type="dxa" w:w="100"/>
+              <w:bottom w:type="dxa" w:w="60"/>
+              <w:right w:type="dxa" w:w="100"/>
+            </w:tcMar>
+            <w:vAlign w:val="center"/>
+          </w:tcPr>
+          <w:p>
+            <w:pPr>
+              <w:spacing w:after="100" w:before="0"/>
+            </w:pPr>
+            <w:r>
+              <w:rPr>
+                <w:rFonts w:ascii="Calibri" w:cs="Calibri" w:eastAsia="Calibri" w:hAnsi="Calibri"/>
+                <w:color w:val="000000"/>
+                <w:sz w:val="22"/>
+                <w:szCs w:val="22"/>
+              </w:rPr>
+              <w:t xml:space="preserve"/>
+            </w:r>
+          </w:p>
+        </w:tc>
+        <w:tc>
+          <w:tcPr>
+            <w:tcW w:type="dxa" w:w="3600"/>
+            <w:tcBorders>
+              <w:top w:val="single" w:color="B9C6E8" w:sz="6"/>
+              <w:left w:val="single" w:color="B9C6E8" w:sz="6"/>
+              <w:bottom w:val="single" w:color="B9C6E8" w:sz="6"/>
+              <w:right w:val="single" w:color="B9C6E8" w:sz="6"/>
+            </w:tcBorders>
+            <w:tcMar>
+              <w:top w:type="dxa" w:w="60"/>
+              <w:left w:type="dxa" w:w="100"/>
+              <w:bottom w:type="dxa" w:w="60"/>
+              <w:right w:type="dxa" w:w="100"/>
+            </w:tcMar>
+            <w:vAlign w:val="center"/>
+          </w:tcPr>
+          <w:p>
+            <w:pPr>
+              <w:spacing w:after="100" w:before="0"/>
+            </w:pPr>
+            <w:r>
+              <w:rPr>
+                <w:rFonts w:ascii="Calibri" w:cs="Calibri" w:eastAsia="Calibri" w:hAnsi="Calibri"/>
+                <w:color w:val="000000"/>
+                <w:sz w:val="22"/>
+                <w:szCs w:val="22"/>
+              </w:rPr>
+              <w:t xml:space="preserve"/>
+            </w:r>
+          </w:p>
+        </w:tc>
+      </w:tr>
+      <w:tr>
+        <w:trPr>
+          <w:cantSplit/>
+          <w:trHeight w:val="2000" w:hRule="atLeast"/>
+        </w:trPr>
+        <w:tc>
+          <w:tcPr>
+            <w:tcW w:type="dxa" w:w="2700"/>
+            <w:tcBorders>
+              <w:top w:val="single" w:color="B9C6E8" w:sz="6"/>
+              <w:left w:val="single" w:color="B9C6E8" w:sz="6"/>
+              <w:bottom w:val="single" w:color="B9C6E8" w:sz="6"/>
+              <w:right w:val="single" w:color="B9C6E8" w:sz="6"/>
+            </w:tcBorders>
+            <w:shd w:fill="8E5BB5" w:color="auto" w:val="clear"/>
+            <w:tcMar>
+              <w:top w:type="dxa" w:w="120"/>
+              <w:left w:type="dxa" w:w="100"/>
+              <w:bottom w:type="dxa" w:w="120"/>
+              <w:right w:type="dxa" w:w="100"/>
+            </w:tcMar>
+            <w:vAlign w:val="top"/>
+          </w:tcPr>
+          <w:p>
+            <w:pPr>
+              <w:spacing w:after="0" w:before="0"/>
+            </w:pPr>
+            <w:r>
+              <w:rPr>
+                <w:rFonts w:ascii="Cambria" w:cs="Cambria" w:eastAsia="Cambria" w:hAnsi="Cambria"/>
+                <w:b/>
+                <w:bCs/>
+                <w:color w:val="FFFFFF"/>
+                <w:sz w:val="40"/>
+                <w:szCs w:val="40"/>
+              </w:rPr>
+              <w:t xml:space="preserve">D</w:t>
+            </w:r>
+          </w:p>
+          <w:p>
+            <w:pPr>
+              <w:spacing w:after="0" w:before="0"/>
+            </w:pPr>
+            <w:r>
+              <w:rPr>
+                <w:rFonts w:ascii="Calibri" w:cs="Calibri" w:eastAsia="Calibri" w:hAnsi="Calibri"/>
+                <w:b/>
+                <w:bCs/>
+                <w:color w:val="FFFFFF"/>
+                <w:sz w:val="20"/>
+                <w:szCs w:val="20"/>
+              </w:rPr>
+              <w:t xml:space="preserve">Metakommunikation</w:t>
+            </w:r>
+          </w:p>
+        </w:tc>
+        <w:tc>
+          <w:tcPr>
+            <w:tcW w:type="dxa" w:w="3906"/>
+            <w:tcBorders>
+              <w:top w:val="single" w:color="B9C6E8" w:sz="6"/>
+              <w:left w:val="single" w:color="B9C6E8" w:sz="6"/>
+              <w:bottom w:val="single" w:color="B9C6E8" w:sz="6"/>
+              <w:right w:val="single" w:color="B9C6E8" w:sz="6"/>
+            </w:tcBorders>
+            <w:tcMar>
+              <w:top w:type="dxa" w:w="60"/>
+              <w:left w:type="dxa" w:w="100"/>
+              <w:bottom w:type="dxa" w:w="60"/>
+              <w:right w:type="dxa" w:w="100"/>
+            </w:tcMar>
+            <w:vAlign w:val="center"/>
+          </w:tcPr>
+          <w:p>
+            <w:pPr>
+              <w:spacing w:after="100" w:before="0"/>
+            </w:pPr>
+            <w:r>
+              <w:rPr>
+                <w:rFonts w:ascii="Calibri" w:cs="Calibri" w:eastAsia="Calibri" w:hAnsi="Calibri"/>
+                <w:color w:val="000000"/>
+                <w:sz w:val="22"/>
+                <w:szCs w:val="22"/>
+              </w:rPr>
+              <w:t xml:space="preserve"/>
+            </w:r>
+          </w:p>
+        </w:tc>
+        <w:tc>
+          <w:tcPr>
+            <w:tcW w:type="dxa" w:w="3600"/>
+            <w:tcBorders>
+              <w:top w:val="single" w:color="B9C6E8" w:sz="6"/>
+              <w:left w:val="single" w:color="B9C6E8" w:sz="6"/>
+              <w:bottom w:val="single" w:color="B9C6E8" w:sz="6"/>
+              <w:right w:val="single" w:color="B9C6E8" w:sz="6"/>
+            </w:tcBorders>
+            <w:tcMar>
+              <w:top w:type="dxa" w:w="60"/>
+              <w:left w:type="dxa" w:w="100"/>
+              <w:bottom w:type="dxa" w:w="60"/>
+              <w:right w:type="dxa" w:w="100"/>
+            </w:tcMar>
+            <w:vAlign w:val="center"/>
+          </w:tcPr>
+          <w:p>
+            <w:pPr>
+              <w:spacing w:after="100" w:before="0"/>
+            </w:pPr>
+            <w:r>
+              <w:rPr>
+                <w:rFonts w:ascii="Calibri" w:cs="Calibri" w:eastAsia="Calibri" w:hAnsi="Calibri"/>
+                <w:color w:val="000000"/>
+                <w:sz w:val="22"/>
+                <w:szCs w:val="22"/>
+              </w:rPr>
+              <w:t xml:space="preserve"/>
+            </w:r>
+          </w:p>
+        </w:tc>
+      </w:tr>
+    </w:tbl>
+    <w:p>
+      <w:pPr>
+        <w:spacing w:after="160" w:before="0"/>
+      </w:pPr>
+      <w:r>
+        <w:rPr>
+          <w:rFonts w:ascii="Calibri" w:cs="Calibri" w:eastAsia="Calibri" w:hAnsi="Calibri"/>
+          <w:color w:val="000000"/>
+          <w:sz w:val="22"/>
+          <w:szCs w:val="22"/>
+        </w:rPr>
+        <w:t xml:space="preserve"/>
+      </w:r>
+    </w:p>
+    <w:p>
+      <w:pPr>
+        <w:keepNext/>
+        <w:spacing w:after="60" w:before="0"/>
+      </w:pPr>
+      <w:r>
+        <w:rPr>
+          <w:rFonts w:ascii="Cambria" w:cs="Cambria" w:eastAsia="Cambria" w:hAnsi="Cambria"/>
+          <w:b/>
+          <w:bCs/>
+          <w:color w:val="D9534F"/>
+          <w:sz w:val="24"/>
+          <w:szCs w:val="24"/>
+        </w:rPr>
+        <w:t xml:space="preserve">Das macht Gespräche kaputt</w:t>
+      </w:r>
+    </w:p>
+    <w:tbl>
+      <w:tblPr>
+        <w:tblW w:type="dxa" w:w="10206"/>
+        <w:tblBorders>
+          <w:top w:val="single" w:color="auto" w:sz="4"/>
+          <w:left w:val="single" w:color="auto" w:sz="4"/>
+          <w:bottom w:val="single" w:color="auto" w:sz="4"/>
+          <w:right w:val="single" w:color="auto" w:sz="4"/>
+          <w:insideH w:val="single" w:color="auto" w:sz="4"/>
+          <w:insideV w:val="single" w:color="auto" w:sz="4"/>
+        </w:tblBorders>
+      </w:tblPr>
+      <w:tblGrid>
+        <w:gridCol w:w="10206"/>
+      </w:tblGrid>
+      <w:tr>
+        <w:trPr>
+          <w:cantSplit/>
+          <w:trHeight w:val="480" w:hRule="atLeast"/>
+        </w:trPr>
+        <w:tc>
+          <w:tcPr>
+            <w:tcW w:type="dxa" w:w="10206"/>
+            <w:tcBorders>
+              <w:top w:val="none" w:color="FFFFFF" w:sz="0"/>
+              <w:left w:val="none" w:color="FFFFFF" w:sz="0"/>
+              <w:bottom w:val="single" w:color="9AA6C4" w:sz="6"/>
+              <w:right w:val="none" w:color="FFFFFF" w:sz="0"/>
+            </w:tcBorders>
+            <w:tcMar>
+              <w:top w:type="dxa" w:w="60"/>
+              <w:left w:type="dxa" w:w="0"/>
+              <w:bottom w:type="dxa" w:w="60"/>
+              <w:right w:type="dxa" w:w="0"/>
+            </w:tcMar>
+            <w:vAlign w:val="bottom"/>
+          </w:tcPr>
+          <w:p>
+            <w:pPr>
+              <w:spacing w:after="0" w:before="0"/>
+            </w:pPr>
+            <w:r>
+              <w:rPr>
+                <w:rFonts w:ascii="Calibri" w:cs="Calibri" w:eastAsia="Calibri" w:hAnsi="Calibri"/>
+                <w:color w:val="000000"/>
+                <w:sz w:val="22"/>
+                <w:szCs w:val="22"/>
+              </w:rPr>
+              <w:t xml:space="preserve"/>
+            </w:r>
+          </w:p>
+        </w:tc>
+      </w:tr>
+      <w:tr>
+        <w:trPr>
+          <w:cantSplit/>
+          <w:trHeight w:val="480" w:hRule="atLeast"/>
+        </w:trPr>
+        <w:tc>
+          <w:tcPr>
+            <w:tcW w:type="dxa" w:w="10206"/>
+            <w:tcBorders>
+              <w:top w:val="none" w:color="FFFFFF" w:sz="0"/>
+              <w:left w:val="none" w:color="FFFFFF" w:sz="0"/>
+              <w:bottom w:val="single" w:color="9AA6C4" w:sz="6"/>
+              <w:right w:val="none" w:color="FFFFFF" w:sz="0"/>
+            </w:tcBorders>
+            <w:tcMar>
+              <w:top w:type="dxa" w:w="60"/>
+              <w:left w:type="dxa" w:w="0"/>
+              <w:bottom w:type="dxa" w:w="60"/>
+              <w:right w:type="dxa" w:w="0"/>
+            </w:tcMar>
+            <w:vAlign w:val="bottom"/>
+          </w:tcPr>
+          <w:p>
+            <w:pPr>
+              <w:spacing w:after="0" w:before="0"/>
+            </w:pPr>
+            <w:r>
+              <w:rPr>
+                <w:rFonts w:ascii="Calibri" w:cs="Calibri" w:eastAsia="Calibri" w:hAnsi="Calibri"/>
+                <w:color w:val="000000"/>
+                <w:sz w:val="22"/>
+                <w:szCs w:val="22"/>
+              </w:rPr>
+              <w:t xml:space="preserve"/>
+            </w:r>
+          </w:p>
+        </w:tc>
+      </w:tr>
+      <w:tr>
+        <w:trPr>
+          <w:cantSplit/>
+          <w:trHeight w:val="480" w:hRule="atLeast"/>
+        </w:trPr>
+        <w:tc>
+          <w:tcPr>
+            <w:tcW w:type="dxa" w:w="10206"/>
+            <w:tcBorders>
+              <w:top w:val="none" w:color="FFFFFF" w:sz="0"/>
+              <w:left w:val="none" w:color="FFFFFF" w:sz="0"/>
+              <w:bottom w:val="single" w:color="9AA6C4" w:sz="6"/>
+              <w:right w:val="none" w:color="FFFFFF" w:sz="0"/>
+            </w:tcBorders>
+            <w:tcMar>
+              <w:top w:type="dxa" w:w="60"/>
+              <w:left w:type="dxa" w:w="0"/>
+              <w:bottom w:type="dxa" w:w="60"/>
+              <w:right w:type="dxa" w:w="0"/>
+            </w:tcMar>
+            <w:vAlign w:val="bottom"/>
+          </w:tcPr>
+          <w:p>
+            <w:pPr>
+              <w:spacing w:after="0" w:before="0"/>
+            </w:pPr>
+            <w:r>
+              <w:rPr>
+                <w:rFonts w:ascii="Calibri" w:cs="Calibri" w:eastAsia="Calibri" w:hAnsi="Calibri"/>
+                <w:color w:val="000000"/>
+                <w:sz w:val="22"/>
+                <w:szCs w:val="22"/>
+              </w:rPr>
+              <w:t xml:space="preserve"/>
+            </w:r>
+          </w:p>
+        </w:tc>
+      </w:tr>
+    </w:tbl>
+    <w:p>
+      <w:pPr>
+        <w:pageBreakBefore/>
+        <w:spacing w:after="20" w:before="0"/>
+      </w:pPr>
+      <w:r>
+        <w:rPr>
+          <w:rFonts w:ascii="Calibri" w:cs="Calibri" w:eastAsia="Calibri" w:hAnsi="Calibri"/>
+          <w:b/>
+          <w:bCs/>
+          <w:color w:val="5B6B8C"/>
+          <w:sz w:val="18"/>
+          <w:szCs w:val="18"/>
+        </w:rPr>
         <w:t xml:space="preserve">AUFGABE 4 · REIHEN-GRUPPE · 17 MIN.</w:t>
       </w:r>
     </w:p>
@@ -6305,7 +7180,7 @@
           <w:sz w:val="18"/>
           <w:szCs w:val="18"/>
         </w:rPr>
-        <w:t xml:space="preserve">AUFGABE 5 · BÜHNE FREI · 13 MIN. + AUSWERTUNG 13 MIN.</w:t>
+        <w:t xml:space="preserve">AUFGABE 5 · BÜHNE FREI · 13 MIN. + AUSWERTUNG 11 MIN.</w:t>
       </w:r>
     </w:p>
     <w:p>
@@ -6476,7 +7351,7 @@
           <w:sz w:val="22"/>
           <w:szCs w:val="22"/>
         </w:rPr>
-        <w:t xml:space="preserve">2 Min. still ergänzen → 4 Min. in der Gruppe die Patenszene besprechen → im Plenum ca. 2 Min. Rückmeldung pro Gruppe.</w:t>
+        <w:t xml:space="preserve">2 Min. still ergänzen → 3 Min. in der Gruppe die Patenszene besprechen → im Plenum ca. 2 Min. Rückmeldung pro Gruppe.</w:t>
       </w:r>
     </w:p>
     <w:tbl>

</xml_diff>

<commit_message>
Deutsch 11: Techniken gemeinsam nacheinander erarbeiten (Kontrastpaar, Formel, Umformulieren, Daumenprobe)
Co-Authored-By: Claude Opus 5.5 <noreply@anthropic.com>
Claude-Session: https://claude.ai/code/session_01Kzh1oWiqhC6W8oSNq8mKnj
</commit_message>
<xml_diff>
--- a/Deutsch_11/Kommunikationsstoerungen_loesen/Arbeitsblatt_Kommunikationsstoerungen_loesen.docx
+++ b/Deutsch_11/Kommunikationsstoerungen_loesen/Arbeitsblatt_Kommunikationsstoerungen_loesen.docx
@@ -3076,7 +3076,7 @@
           <w:sz w:val="18"/>
           <w:szCs w:val="18"/>
         </w:rPr>
-        <w:t xml:space="preserve">AUFGABE 3 · TECHNIK-TRAINING · ALLEIN · 4 × 4 MIN. + 2 MIN. VERGLEICH</w:t>
+        <w:t xml:space="preserve">AUFGABE 3 · TECHNIK FÜR TECHNIK · GEMEINSAM + ALLEIN · 25 MIN.</w:t>
       </w:r>
     </w:p>
     <w:p>
@@ -3092,7 +3092,7 @@
           <w:sz w:val="40"/>
           <w:szCs w:val="40"/>
         </w:rPr>
-        <w:t xml:space="preserve">Vier Werkzeuge – Schritt für Schritt</w:t>
+        <w:t xml:space="preserve">Vier Werkzeuge – eins nach dem anderen</w:t>
       </w:r>
     </w:p>
     <w:p>
@@ -3106,7 +3106,7 @@
           <w:sz w:val="22"/>
           <w:szCs w:val="22"/>
         </w:rPr>
-        <w:t xml:space="preserve">Arbeite die Techniken </w:t>
+        <w:t xml:space="preserve">Wir gehen die Techniken </w:t>
       </w:r>
       <w:r>
         <w:rPr>
@@ -3126,7 +3126,7 @@
           <w:sz w:val="22"/>
           <w:szCs w:val="22"/>
         </w:rPr>
-        <w:t xml:space="preserve"> durch: </w:t>
+        <w:t xml:space="preserve"> durch, immer im gleichen Takt: </w:t>
       </w:r>
       <w:r>
         <w:rPr>
@@ -3137,7 +3137,7 @@
           <w:sz w:val="22"/>
           <w:szCs w:val="22"/>
         </w:rPr>
-        <w:t xml:space="preserve">lesen → Kipppunkt aus M1 umschreiben → prüfen</w:t>
+        <w:t xml:space="preserve">1 Ansehen</w:t>
       </w:r>
       <w:r>
         <w:rPr>
@@ -3146,7 +3146,47 @@
           <w:sz w:val="22"/>
           <w:szCs w:val="22"/>
         </w:rPr>
-        <w:t xml:space="preserve">. Nach jedem Gong kommt die nächste Technik. Am Ende vergleichst du 2 Minuten mit deinem Sitznachbarn.</w:t>
+        <w:t xml:space="preserve"> (gemeinsam an der Folie) → </w:t>
+      </w:r>
+      <w:r>
+        <w:rPr>
+          <w:rFonts w:ascii="Calibri" w:cs="Calibri" w:eastAsia="Calibri" w:hAnsi="Calibri"/>
+          <w:b/>
+          <w:bCs/>
+          <w:color w:val="000000"/>
+          <w:sz w:val="22"/>
+          <w:szCs w:val="22"/>
+        </w:rPr>
+        <w:t xml:space="preserve">2 Umformulieren</w:t>
+      </w:r>
+      <w:r>
+        <w:rPr>
+          <w:rFonts w:ascii="Calibri" w:cs="Calibri" w:eastAsia="Calibri" w:hAnsi="Calibri"/>
+          <w:color w:val="000000"/>
+          <w:sz w:val="22"/>
+          <w:szCs w:val="22"/>
+        </w:rPr>
+        <w:t xml:space="preserve"> (allein) → </w:t>
+      </w:r>
+      <w:r>
+        <w:rPr>
+          <w:rFonts w:ascii="Calibri" w:cs="Calibri" w:eastAsia="Calibri" w:hAnsi="Calibri"/>
+          <w:b/>
+          <w:bCs/>
+          <w:color w:val="000000"/>
+          <w:sz w:val="22"/>
+          <w:szCs w:val="22"/>
+        </w:rPr>
+        <w:t xml:space="preserve">3 Prüfen</w:t>
+      </w:r>
+      <w:r>
+        <w:rPr>
+          <w:rFonts w:ascii="Calibri" w:cs="Calibri" w:eastAsia="Calibri" w:hAnsi="Calibri"/>
+          <w:color w:val="000000"/>
+          <w:sz w:val="22"/>
+          <w:szCs w:val="22"/>
+        </w:rPr>
+        <w:t xml:space="preserve"> (Daumenprobe). Erst dann kommt die nächste Technik.</w:t>
       </w:r>
     </w:p>
     <w:tbl>
@@ -3218,313 +3258,18 @@
                 <w:b/>
                 <w:bCs/>
                 <w:color w:val="FFFFFF"/>
-                <w:sz w:val="19"/>
-                <w:szCs w:val="19"/>
-              </w:rPr>
-              <w:t xml:space="preserve">   ·   Wenn … fühle ich mich …, weil …</w:t>
-            </w:r>
-          </w:p>
-        </w:tc>
-      </w:tr>
-    </w:tbl>
-    <w:tbl>
-      <w:tblPr>
-        <w:tblW w:type="dxa" w:w="10206"/>
-        <w:tblBorders>
-          <w:top w:val="single" w:color="auto" w:sz="4"/>
-          <w:left w:val="single" w:color="auto" w:sz="4"/>
-          <w:bottom w:val="single" w:color="auto" w:sz="4"/>
-          <w:right w:val="single" w:color="auto" w:sz="4"/>
-          <w:insideH w:val="single" w:color="auto" w:sz="4"/>
-          <w:insideV w:val="single" w:color="auto" w:sz="4"/>
-        </w:tblBorders>
-      </w:tblPr>
-      <w:tblGrid>
-        <w:gridCol w:w="5203"/>
-        <w:gridCol w:w="5003"/>
-      </w:tblGrid>
-      <w:tr>
-        <w:trPr>
-          <w:cantSplit/>
-        </w:trPr>
-        <w:tc>
-          <w:tcPr>
-            <w:tcW w:type="dxa" w:w="5203"/>
-            <w:tcBorders>
-              <w:top w:val="none" w:color="FFFFFF" w:sz="0"/>
-              <w:left w:val="none" w:color="FFFFFF" w:sz="0"/>
-              <w:bottom w:val="none" w:color="FFFFFF" w:sz="0"/>
-              <w:right w:val="none" w:color="FFFFFF" w:sz="0"/>
-            </w:tcBorders>
-            <w:tcMar>
-              <w:top w:type="dxa" w:w="60"/>
-              <w:left w:type="dxa" w:w="100"/>
-              <w:bottom w:type="dxa" w:w="60"/>
-              <w:right w:type="dxa" w:w="100"/>
-            </w:tcMar>
-            <w:vAlign w:val="top"/>
-          </w:tcPr>
-          <w:p>
-            <w:pPr>
-              <w:spacing w:after="20" w:before="0"/>
-            </w:pPr>
-            <w:r>
-              <w:rPr>
-                <w:rFonts w:ascii="Calibri" w:cs="Calibri" w:eastAsia="Calibri" w:hAnsi="Calibri"/>
-                <w:b/>
-                <w:bCs/>
-                <w:color w:val="3F7CC4"/>
-                <w:sz w:val="19"/>
-                <w:szCs w:val="19"/>
-              </w:rPr>
-              <w:t xml:space="preserve">1  Lesen · So geht’s</w:t>
-            </w:r>
-          </w:p>
-          <w:p>
-            <w:pPr>
-              <w:spacing w:after="10" w:before="0"/>
-            </w:pPr>
-            <w:r>
-              <w:rPr>
-                <w:rFonts w:ascii="Calibri" w:cs="Calibri" w:eastAsia="Calibri" w:hAnsi="Calibri"/>
-                <w:b/>
-                <w:bCs/>
-                <w:color w:val="5B6B8C"/>
-                <w:sz w:val="19"/>
-                <w:szCs w:val="19"/>
-              </w:rPr>
-              <w:t xml:space="preserve">•  </w:t>
-            </w:r>
-            <w:r>
-              <w:rPr>
-                <w:rFonts w:ascii="Calibri" w:cs="Calibri" w:eastAsia="Calibri" w:hAnsi="Calibri"/>
-                <w:color w:val="000000"/>
-                <w:sz w:val="19"/>
-                <w:szCs w:val="19"/>
-              </w:rPr>
-              <w:t xml:space="preserve">Beschreibe, was passiert – ohne zu bewerten.</w:t>
-            </w:r>
-          </w:p>
-          <w:p>
-            <w:pPr>
-              <w:spacing w:after="10" w:before="0"/>
-            </w:pPr>
-            <w:r>
-              <w:rPr>
-                <w:rFonts w:ascii="Calibri" w:cs="Calibri" w:eastAsia="Calibri" w:hAnsi="Calibri"/>
-                <w:b/>
-                <w:bCs/>
-                <w:color w:val="5B6B8C"/>
-                <w:sz w:val="19"/>
-                <w:szCs w:val="19"/>
-              </w:rPr>
-              <w:t xml:space="preserve">•  </w:t>
-            </w:r>
-            <w:r>
-              <w:rPr>
-                <w:rFonts w:ascii="Calibri" w:cs="Calibri" w:eastAsia="Calibri" w:hAnsi="Calibri"/>
-                <w:color w:val="000000"/>
-                <w:sz w:val="19"/>
-                <w:szCs w:val="19"/>
-              </w:rPr>
-              <w:t xml:space="preserve">Nenne dein Gefühl (gestresst, enttäuscht, unsicher …) und den Grund.</w:t>
-            </w:r>
-          </w:p>
-          <w:p>
-            <w:pPr>
-              <w:spacing w:after="0" w:before="40"/>
-            </w:pPr>
-            <w:r>
-              <w:rPr>
-                <w:rFonts w:ascii="Calibri" w:cs="Calibri" w:eastAsia="Calibri" w:hAnsi="Calibri"/>
-                <w:b/>
-                <w:bCs/>
-                <w:color w:val="D9534F"/>
-                <w:sz w:val="18"/>
-                <w:szCs w:val="18"/>
-              </w:rPr>
-              <w:t xml:space="preserve">Stolperfalle: </w:t>
-            </w:r>
-            <w:r>
-              <w:rPr>
-                <w:rFonts w:ascii="Calibri" w:cs="Calibri" w:eastAsia="Calibri" w:hAnsi="Calibri"/>
-                <w:color w:val="000000"/>
-                <w:sz w:val="18"/>
-                <w:szCs w:val="18"/>
-              </w:rPr>
-              <w:t xml:space="preserve">„Ich finde, du bist …“ ist eine verkleidete Du-Botschaft.</w:t>
-            </w:r>
-          </w:p>
-        </w:tc>
-        <w:tc>
-          <w:tcPr>
-            <w:tcW w:type="dxa" w:w="5003"/>
-            <w:tcBorders>
-              <w:top w:val="none" w:color="FFFFFF" w:sz="0"/>
-              <w:left w:val="none" w:color="FFFFFF" w:sz="0"/>
-              <w:bottom w:val="none" w:color="FFFFFF" w:sz="0"/>
-              <w:right w:val="none" w:color="FFFFFF" w:sz="0"/>
-            </w:tcBorders>
-            <w:tcMar>
-              <w:top w:type="dxa" w:w="60"/>
-              <w:left w:type="dxa" w:w="100"/>
-              <w:bottom w:type="dxa" w:w="60"/>
-              <w:right w:type="dxa" w:w="100"/>
-            </w:tcMar>
-            <w:vAlign w:val="top"/>
-          </w:tcPr>
-          <w:p>
-            <w:pPr>
-              <w:spacing w:after="20" w:before="0"/>
-            </w:pPr>
-            <w:r>
-              <w:rPr>
-                <w:rFonts w:ascii="Calibri" w:cs="Calibri" w:eastAsia="Calibri" w:hAnsi="Calibri"/>
-                <w:b/>
-                <w:bCs/>
-                <w:color w:val="3F7CC4"/>
-                <w:sz w:val="19"/>
-                <w:szCs w:val="19"/>
-              </w:rPr>
-              <w:t xml:space="preserve">Beispiel aus der WG-Küche</w:t>
-            </w:r>
-          </w:p>
-          <w:tbl>
-            <w:tblPr>
-              <w:tblW w:type="dxa" w:w="5003"/>
-              <w:tblBorders>
-                <w:top w:val="single" w:color="auto" w:sz="4"/>
-                <w:left w:val="single" w:color="auto" w:sz="4"/>
-                <w:bottom w:val="single" w:color="auto" w:sz="4"/>
-                <w:right w:val="single" w:color="auto" w:sz="4"/>
-                <w:insideH w:val="single" w:color="auto" w:sz="4"/>
-                <w:insideV w:val="single" w:color="auto" w:sz="4"/>
-              </w:tblBorders>
-            </w:tblPr>
-            <w:tblGrid>
-              <w:gridCol w:w="5003"/>
-            </w:tblGrid>
-            <w:tr>
-              <w:trPr>
-                <w:cantSplit/>
-              </w:trPr>
-              <w:tc>
-                <w:tcPr>
-                  <w:tcW w:type="dxa" w:w="5003"/>
-                  <w:tcBorders>
-                    <w:top w:val="single" w:color="FFFFFF" w:sz="12"/>
-                    <w:left w:val="single" w:color="FFFFFF" w:sz="12"/>
-                    <w:bottom w:val="single" w:color="FFFFFF" w:sz="12"/>
-                    <w:right w:val="single" w:color="FFFFFF" w:sz="12"/>
-                  </w:tcBorders>
-                  <w:shd w:fill="FBECEB" w:color="auto" w:val="clear"/>
-                  <w:tcMar>
-                    <w:top w:type="dxa" w:w="60"/>
-                    <w:left w:type="dxa" w:w="100"/>
-                    <w:bottom w:type="dxa" w:w="60"/>
-                    <w:right w:type="dxa" w:w="100"/>
-                  </w:tcMar>
-                  <w:vAlign w:val="top"/>
-                </w:tcPr>
-                <w:p>
-                  <w:pPr>
-                    <w:spacing w:after="0" w:before="0"/>
-                  </w:pPr>
-                  <w:r>
-                    <w:rPr>
-                      <w:rFonts w:ascii="Calibri" w:cs="Calibri" w:eastAsia="Calibri" w:hAnsi="Calibri"/>
-                      <w:b/>
-                      <w:bCs/>
-                      <w:color w:val="D9534F"/>
-                      <w:sz w:val="15"/>
-                      <w:szCs w:val="15"/>
-                    </w:rPr>
-                    <w:t xml:space="preserve">statt</w:t>
-                  </w:r>
-                </w:p>
-                <w:p>
-                  <w:pPr>
-                    <w:spacing w:after="0" w:before="0"/>
-                  </w:pPr>
-                  <w:r>
-                    <w:rPr>
-                      <w:rFonts w:ascii="Cambria" w:cs="Cambria" w:eastAsia="Cambria" w:hAnsi="Cambria"/>
-                      <w:i/>
-                      <w:iCs/>
-                      <w:color w:val="000000"/>
-                      <w:sz w:val="19"/>
-                      <w:szCs w:val="19"/>
-                    </w:rPr>
-                    <w:t xml:space="preserve">Du lässt immer alles stehen!</w:t>
-                  </w:r>
-                </w:p>
-              </w:tc>
-            </w:tr>
-            <w:tr>
-              <w:trPr>
-                <w:cantSplit/>
-              </w:trPr>
-              <w:tc>
-                <w:tcPr>
-                  <w:tcW w:type="dxa" w:w="5003"/>
-                  <w:tcBorders>
-                    <w:top w:val="single" w:color="FFFFFF" w:sz="12"/>
-                    <w:left w:val="single" w:color="FFFFFF" w:sz="12"/>
-                    <w:bottom w:val="single" w:color="FFFFFF" w:sz="12"/>
-                    <w:right w:val="single" w:color="FFFFFF" w:sz="12"/>
-                  </w:tcBorders>
-                  <w:shd w:fill="EAF0FA" w:color="auto" w:val="clear"/>
-                  <w:tcMar>
-                    <w:top w:type="dxa" w:w="60"/>
-                    <w:left w:type="dxa" w:w="100"/>
-                    <w:bottom w:type="dxa" w:w="60"/>
-                    <w:right w:type="dxa" w:w="100"/>
-                  </w:tcMar>
-                  <w:vAlign w:val="top"/>
-                </w:tcPr>
-                <w:p>
-                  <w:pPr>
-                    <w:spacing w:after="0" w:before="0"/>
-                  </w:pPr>
-                  <w:r>
-                    <w:rPr>
-                      <w:rFonts w:ascii="Calibri" w:cs="Calibri" w:eastAsia="Calibri" w:hAnsi="Calibri"/>
-                      <w:b/>
-                      <w:bCs/>
-                      <w:color w:val="3F7CC4"/>
-                      <w:sz w:val="15"/>
-                      <w:szCs w:val="15"/>
-                    </w:rPr>
-                    <w:t xml:space="preserve">besser</w:t>
-                  </w:r>
-                </w:p>
-                <w:p>
-                  <w:pPr>
-                    <w:spacing w:after="0" w:before="0"/>
-                  </w:pPr>
-                  <w:r>
-                    <w:rPr>
-                      <w:rFonts w:ascii="Cambria" w:cs="Cambria" w:eastAsia="Cambria" w:hAnsi="Cambria"/>
-                      <w:i/>
-                      <w:iCs/>
-                      <w:color w:val="000000"/>
-                      <w:sz w:val="19"/>
-                      <w:szCs w:val="19"/>
-                    </w:rPr>
-                    <w:t xml:space="preserve">Wenn ich abends in die Küche komme und die Spüle voll ist, ärgere ich mich, weil ich dann erst aufräumen muss.</w:t>
-                  </w:r>
-                </w:p>
-              </w:tc>
-            </w:tr>
-          </w:tbl>
-          <w:p/>
+                <w:sz w:val="20"/>
+                <w:szCs w:val="20"/>
+              </w:rPr>
+              <w:t xml:space="preserve">   →   Zeile 3</w:t>
+            </w:r>
+          </w:p>
         </w:tc>
       </w:tr>
     </w:tbl>
     <w:p>
       <w:pPr>
-        <w:keepNext/>
-        <w:spacing w:after="0" w:before="40"/>
+        <w:spacing w:after="40" w:before="80"/>
       </w:pPr>
       <w:r>
         <w:rPr>
@@ -3535,29 +3280,46 @@
           <w:sz w:val="20"/>
           <w:szCs w:val="20"/>
         </w:rPr>
-        <w:t xml:space="preserve">2  Anwenden · </w:t>
-      </w:r>
-      <w:r>
-        <w:rPr>
-          <w:rFonts w:ascii="Calibri" w:cs="Calibri" w:eastAsia="Calibri" w:hAnsi="Calibri"/>
+        <w:t xml:space="preserve">1  Ansehen </w:t>
+      </w:r>
+      <w:r>
+        <w:rPr>
+          <w:rFonts w:ascii="Calibri" w:cs="Calibri" w:eastAsia="Calibri" w:hAnsi="Calibri"/>
+          <w:color w:val="5B6B8C"/>
+          <w:sz w:val="19"/>
+          <w:szCs w:val="19"/>
+        </w:rPr>
+        <w:t xml:space="preserve">(gemeinsam an der Folie) · Ergänze die Formel:</w:t>
+      </w:r>
+    </w:p>
+    <w:p>
+      <w:pPr>
+        <w:spacing w:after="40" w:before="0"/>
+      </w:pPr>
+      <w:r>
+        <w:rPr>
+          <w:rFonts w:ascii="Cambria" w:cs="Cambria" w:eastAsia="Cambria" w:hAnsi="Cambria"/>
           <w:b/>
           <w:bCs/>
-          <w:color w:val="000000"/>
-          <w:sz w:val="20"/>
-          <w:szCs w:val="20"/>
-        </w:rPr>
-        <w:t xml:space="preserve">Schreibe Zeile 3 (Lena) als Ich-Botschaft: </w:t>
-      </w:r>
-      <w:r>
-        <w:rPr>
-          <w:rFonts w:ascii="Cambria" w:cs="Cambria" w:eastAsia="Cambria" w:hAnsi="Cambria"/>
-          <w:i/>
-          <w:iCs/>
-          <w:color w:val="000000"/>
-          <w:sz w:val="20"/>
-          <w:szCs w:val="20"/>
-        </w:rPr>
-        <w:t xml:space="preserve">„Heute Abend? Du hattest eine ganze Woche Zeit.“</w:t>
+          <w:color w:val="1E2761"/>
+          <w:sz w:val="24"/>
+          <w:szCs w:val="24"/>
+        </w:rPr>
+        <w:t xml:space="preserve">Wenn __________, fühle ich mich __________, weil __________.</w:t>
+      </w:r>
+    </w:p>
+    <w:p>
+      <w:pPr>
+        <w:spacing w:after="0" w:before="0"/>
+      </w:pPr>
+      <w:r>
+        <w:rPr>
+          <w:rFonts w:ascii="Calibri" w:cs="Calibri" w:eastAsia="Calibri" w:hAnsi="Calibri"/>
+          <w:color w:val="5B6B8C"/>
+          <w:sz w:val="19"/>
+          <w:szCs w:val="19"/>
+        </w:rPr>
+        <w:t xml:space="preserve">Das macht den besseren Satz aus:</w:t>
       </w:r>
     </w:p>
     <w:tbl>
@@ -3613,10 +3375,91 @@
           </w:p>
         </w:tc>
       </w:tr>
+    </w:tbl>
+    <w:p>
+      <w:pPr>
+        <w:keepNext/>
+        <w:spacing w:after="0" w:before="100"/>
+      </w:pPr>
+      <w:r>
+        <w:rPr>
+          <w:rFonts w:ascii="Calibri" w:cs="Calibri" w:eastAsia="Calibri" w:hAnsi="Calibri"/>
+          <w:b/>
+          <w:bCs/>
+          <w:color w:val="3F7CC4"/>
+          <w:sz w:val="20"/>
+          <w:szCs w:val="20"/>
+        </w:rPr>
+        <w:t xml:space="preserve">2  Umformulieren </w:t>
+      </w:r>
+      <w:r>
+        <w:rPr>
+          <w:rFonts w:ascii="Calibri" w:cs="Calibri" w:eastAsia="Calibri" w:hAnsi="Calibri"/>
+          <w:color w:val="5B6B8C"/>
+          <w:sz w:val="19"/>
+          <w:szCs w:val="19"/>
+        </w:rPr>
+        <w:t xml:space="preserve">(allein, 2 Min.) · </w:t>
+      </w:r>
+      <w:r>
+        <w:rPr>
+          <w:rFonts w:ascii="Calibri" w:cs="Calibri" w:eastAsia="Calibri" w:hAnsi="Calibri"/>
+          <w:b/>
+          <w:bCs/>
+          <w:color w:val="000000"/>
+          <w:sz w:val="20"/>
+          <w:szCs w:val="20"/>
+        </w:rPr>
+        <w:t xml:space="preserve">Lena sagt stattdessen: </w:t>
+      </w:r>
+      <w:r>
+        <w:rPr>
+          <w:rFonts w:ascii="Cambria" w:cs="Cambria" w:eastAsia="Cambria" w:hAnsi="Cambria"/>
+          <w:i/>
+          <w:iCs/>
+          <w:color w:val="000000"/>
+          <w:sz w:val="20"/>
+          <w:szCs w:val="20"/>
+        </w:rPr>
+        <w:t xml:space="preserve">„Heute Abend? Du hattest eine ganze Woche Zeit.“</w:t>
+      </w:r>
+    </w:p>
+    <w:p>
+      <w:pPr>
+        <w:keepNext/>
+        <w:spacing w:after="0" w:before="0"/>
+      </w:pPr>
+      <w:r>
+        <w:rPr>
+          <w:rFonts w:ascii="Calibri" w:cs="Calibri" w:eastAsia="Calibri" w:hAnsi="Calibri"/>
+          <w:i/>
+          <w:iCs/>
+          <w:color w:val="5B6B8C"/>
+          <w:sz w:val="17"/>
+          <w:szCs w:val="17"/>
+        </w:rPr>
+        <w:t xml:space="preserve">Hilfe, wenn du nicht weiterkommst: „Heute Abend? Ehrlich gesagt werde ich nervös, wenn …, weil …“</w:t>
+      </w:r>
+    </w:p>
+    <w:tbl>
+      <w:tblPr>
+        <w:tblW w:type="dxa" w:w="10206"/>
+        <w:tblBorders>
+          <w:top w:val="single" w:color="auto" w:sz="4"/>
+          <w:left w:val="single" w:color="auto" w:sz="4"/>
+          <w:bottom w:val="single" w:color="auto" w:sz="4"/>
+          <w:right w:val="single" w:color="auto" w:sz="4"/>
+          <w:insideH w:val="single" w:color="auto" w:sz="4"/>
+          <w:insideV w:val="single" w:color="auto" w:sz="4"/>
+        </w:tblBorders>
+      </w:tblPr>
+      <w:tblGrid>
+        <w:gridCol w:w="10206"/>
+      </w:tblGrid>
       <w:tr>
         <w:trPr>
           <w:cantSplit/>
-          <w:trHeight w:val="440" w:hRule="atLeast"/>
+          <w:trHeight w:val="480" w:hRule="atLeast"/>
         </w:trPr>
         <w:tc>
           <w:tcPr>
@@ -3654,7 +3497,7 @@
       <w:tr>
         <w:trPr>
           <w:cantSplit/>
-          <w:trHeight w:val="440" w:hRule="atLeast"/>
+          <w:trHeight w:val="480" w:hRule="atLeast"/>
         </w:trPr>
         <w:tc>
           <w:tcPr>
@@ -3692,7 +3535,7 @@
       <w:tr>
         <w:trPr>
           <w:cantSplit/>
-          <w:trHeight w:val="440" w:hRule="atLeast"/>
+          <w:trHeight w:val="480" w:hRule="atLeast"/>
         </w:trPr>
         <w:tc>
           <w:tcPr>
@@ -3727,10 +3570,48 @@
           </w:p>
         </w:tc>
       </w:tr>
+      <w:tr>
+        <w:trPr>
+          <w:cantSplit/>
+          <w:trHeight w:val="480" w:hRule="atLeast"/>
+        </w:trPr>
+        <w:tc>
+          <w:tcPr>
+            <w:tcW w:type="dxa" w:w="10206"/>
+            <w:tcBorders>
+              <w:top w:val="none" w:color="FFFFFF" w:sz="0"/>
+              <w:left w:val="none" w:color="FFFFFF" w:sz="0"/>
+              <w:bottom w:val="single" w:color="9AA6C4" w:sz="6"/>
+              <w:right w:val="none" w:color="FFFFFF" w:sz="0"/>
+            </w:tcBorders>
+            <w:tcMar>
+              <w:top w:type="dxa" w:w="60"/>
+              <w:left w:type="dxa" w:w="0"/>
+              <w:bottom w:type="dxa" w:w="60"/>
+              <w:right w:type="dxa" w:w="0"/>
+            </w:tcMar>
+            <w:vAlign w:val="bottom"/>
+          </w:tcPr>
+          <w:p>
+            <w:pPr>
+              <w:spacing w:after="0" w:before="0"/>
+            </w:pPr>
+            <w:r>
+              <w:rPr>
+                <w:rFonts w:ascii="Calibri" w:cs="Calibri" w:eastAsia="Calibri" w:hAnsi="Calibri"/>
+                <w:color w:val="000000"/>
+                <w:sz w:val="22"/>
+                <w:szCs w:val="22"/>
+              </w:rPr>
+              <w:t xml:space="preserve"/>
+            </w:r>
+          </w:p>
+        </w:tc>
+      </w:tr>
     </w:tbl>
     <w:p>
       <w:pPr>
-        <w:spacing w:after="0" w:before="60"/>
+        <w:spacing w:after="20" w:before="60"/>
       </w:pPr>
       <w:r>
         <w:rPr>
@@ -3741,7 +3622,16 @@
           <w:sz w:val="19"/>
           <w:szCs w:val="19"/>
         </w:rPr>
-        <w:t xml:space="preserve">3  Prüfen   </w:t>
+        <w:t xml:space="preserve">3  Prüfen </w:t>
+      </w:r>
+      <w:r>
+        <w:rPr>
+          <w:rFonts w:ascii="Calibri" w:cs="Calibri" w:eastAsia="Calibri" w:hAnsi="Calibri"/>
+          <w:color w:val="5B6B8C"/>
+          <w:sz w:val="18"/>
+          <w:szCs w:val="18"/>
+        </w:rPr>
+        <w:t xml:space="preserve">(Daumenprobe)   </w:t>
       </w:r>
       <w:r>
         <w:rPr>
@@ -3764,7 +3654,32 @@
     </w:p>
     <w:p>
       <w:pPr>
-        <w:spacing w:after="160" w:before="0"/>
+        <w:spacing w:after="0" w:before="0"/>
+      </w:pPr>
+      <w:r>
+        <w:rPr>
+          <w:rFonts w:ascii="Calibri" w:cs="Calibri" w:eastAsia="Calibri" w:hAnsi="Calibri"/>
+          <w:b/>
+          <w:bCs/>
+          <w:color w:val="D9534F"/>
+          <w:sz w:val="18"/>
+          <w:szCs w:val="18"/>
+        </w:rPr>
+        <w:t xml:space="preserve">Stolperfalle: </w:t>
+      </w:r>
+      <w:r>
+        <w:rPr>
+          <w:rFonts w:ascii="Calibri" w:cs="Calibri" w:eastAsia="Calibri" w:hAnsi="Calibri"/>
+          <w:color w:val="000000"/>
+          <w:sz w:val="18"/>
+          <w:szCs w:val="18"/>
+        </w:rPr>
+        <w:t xml:space="preserve">„Ich finde, du bist …“ ist eine verkleidete Du-Botschaft.</w:t>
+      </w:r>
+    </w:p>
+    <w:p>
+      <w:pPr>
+        <w:spacing w:after="200" w:before="0"/>
       </w:pPr>
       <w:r>
         <w:rPr>
@@ -3845,313 +3760,18 @@
                 <w:b/>
                 <w:bCs/>
                 <w:color w:val="FFFFFF"/>
-                <w:sz w:val="19"/>
-                <w:szCs w:val="19"/>
-              </w:rPr>
-              <w:t xml:space="preserve">   ·   Du meinst also … ? · Das klingt, als ob du … bist.</w:t>
-            </w:r>
-          </w:p>
-        </w:tc>
-      </w:tr>
-    </w:tbl>
-    <w:tbl>
-      <w:tblPr>
-        <w:tblW w:type="dxa" w:w="10206"/>
-        <w:tblBorders>
-          <w:top w:val="single" w:color="auto" w:sz="4"/>
-          <w:left w:val="single" w:color="auto" w:sz="4"/>
-          <w:bottom w:val="single" w:color="auto" w:sz="4"/>
-          <w:right w:val="single" w:color="auto" w:sz="4"/>
-          <w:insideH w:val="single" w:color="auto" w:sz="4"/>
-          <w:insideV w:val="single" w:color="auto" w:sz="4"/>
-        </w:tblBorders>
-      </w:tblPr>
-      <w:tblGrid>
-        <w:gridCol w:w="5203"/>
-        <w:gridCol w:w="5003"/>
-      </w:tblGrid>
-      <w:tr>
-        <w:trPr>
-          <w:cantSplit/>
-        </w:trPr>
-        <w:tc>
-          <w:tcPr>
-            <w:tcW w:type="dxa" w:w="5203"/>
-            <w:tcBorders>
-              <w:top w:val="none" w:color="FFFFFF" w:sz="0"/>
-              <w:left w:val="none" w:color="FFFFFF" w:sz="0"/>
-              <w:bottom w:val="none" w:color="FFFFFF" w:sz="0"/>
-              <w:right w:val="none" w:color="FFFFFF" w:sz="0"/>
-            </w:tcBorders>
-            <w:tcMar>
-              <w:top w:type="dxa" w:w="60"/>
-              <w:left w:type="dxa" w:w="100"/>
-              <w:bottom w:type="dxa" w:w="60"/>
-              <w:right w:type="dxa" w:w="100"/>
-            </w:tcMar>
-            <w:vAlign w:val="top"/>
-          </w:tcPr>
-          <w:p>
-            <w:pPr>
-              <w:spacing w:after="20" w:before="0"/>
-            </w:pPr>
-            <w:r>
-              <w:rPr>
-                <w:rFonts w:ascii="Calibri" w:cs="Calibri" w:eastAsia="Calibri" w:hAnsi="Calibri"/>
-                <w:b/>
-                <w:bCs/>
-                <w:color w:val="2E9E6B"/>
-                <w:sz w:val="19"/>
-                <w:szCs w:val="19"/>
-              </w:rPr>
-              <w:t xml:space="preserve">1  Lesen · So geht’s</w:t>
-            </w:r>
-          </w:p>
-          <w:p>
-            <w:pPr>
-              <w:spacing w:after="10" w:before="0"/>
-            </w:pPr>
-            <w:r>
-              <w:rPr>
-                <w:rFonts w:ascii="Calibri" w:cs="Calibri" w:eastAsia="Calibri" w:hAnsi="Calibri"/>
-                <w:b/>
-                <w:bCs/>
-                <w:color w:val="5B6B8C"/>
-                <w:sz w:val="19"/>
-                <w:szCs w:val="19"/>
-              </w:rPr>
-              <w:t xml:space="preserve">•  </w:t>
-            </w:r>
-            <w:r>
-              <w:rPr>
-                <w:rFonts w:ascii="Calibri" w:cs="Calibri" w:eastAsia="Calibri" w:hAnsi="Calibri"/>
-                <w:color w:val="000000"/>
-                <w:sz w:val="19"/>
-                <w:szCs w:val="19"/>
-              </w:rPr>
-              <w:t xml:space="preserve">Wiederhole mit eigenen Worten, was du gehört hast.</w:t>
-            </w:r>
-          </w:p>
-          <w:p>
-            <w:pPr>
-              <w:spacing w:after="10" w:before="0"/>
-            </w:pPr>
-            <w:r>
-              <w:rPr>
-                <w:rFonts w:ascii="Calibri" w:cs="Calibri" w:eastAsia="Calibri" w:hAnsi="Calibri"/>
-                <w:b/>
-                <w:bCs/>
-                <w:color w:val="5B6B8C"/>
-                <w:sz w:val="19"/>
-                <w:szCs w:val="19"/>
-              </w:rPr>
-              <w:t xml:space="preserve">•  </w:t>
-            </w:r>
-            <w:r>
-              <w:rPr>
-                <w:rFonts w:ascii="Calibri" w:cs="Calibri" w:eastAsia="Calibri" w:hAnsi="Calibri"/>
-                <w:color w:val="000000"/>
-                <w:sz w:val="19"/>
-                <w:szCs w:val="19"/>
-              </w:rPr>
-              <w:t xml:space="preserve">Sprich das Gefühl an, das du dahinter vermutest – erst dann antwortest du.</w:t>
-            </w:r>
-          </w:p>
-          <w:p>
-            <w:pPr>
-              <w:spacing w:after="0" w:before="40"/>
-            </w:pPr>
-            <w:r>
-              <w:rPr>
-                <w:rFonts w:ascii="Calibri" w:cs="Calibri" w:eastAsia="Calibri" w:hAnsi="Calibri"/>
-                <w:b/>
-                <w:bCs/>
-                <w:color w:val="D9534F"/>
-                <w:sz w:val="18"/>
-                <w:szCs w:val="18"/>
-              </w:rPr>
-              <w:t xml:space="preserve">Stolperfalle: </w:t>
-            </w:r>
-            <w:r>
-              <w:rPr>
-                <w:rFonts w:ascii="Calibri" w:cs="Calibri" w:eastAsia="Calibri" w:hAnsi="Calibri"/>
-                <w:color w:val="000000"/>
-                <w:sz w:val="18"/>
-                <w:szCs w:val="18"/>
-              </w:rPr>
-              <w:t xml:space="preserve">kein „Ja, aber …“, keine Rechtfertigung, kein Gegenangriff.</w:t>
-            </w:r>
-          </w:p>
-        </w:tc>
-        <w:tc>
-          <w:tcPr>
-            <w:tcW w:type="dxa" w:w="5003"/>
-            <w:tcBorders>
-              <w:top w:val="none" w:color="FFFFFF" w:sz="0"/>
-              <w:left w:val="none" w:color="FFFFFF" w:sz="0"/>
-              <w:bottom w:val="none" w:color="FFFFFF" w:sz="0"/>
-              <w:right w:val="none" w:color="FFFFFF" w:sz="0"/>
-            </w:tcBorders>
-            <w:tcMar>
-              <w:top w:type="dxa" w:w="60"/>
-              <w:left w:type="dxa" w:w="100"/>
-              <w:bottom w:type="dxa" w:w="60"/>
-              <w:right w:type="dxa" w:w="100"/>
-            </w:tcMar>
-            <w:vAlign w:val="top"/>
-          </w:tcPr>
-          <w:p>
-            <w:pPr>
-              <w:spacing w:after="20" w:before="0"/>
-            </w:pPr>
-            <w:r>
-              <w:rPr>
-                <w:rFonts w:ascii="Calibri" w:cs="Calibri" w:eastAsia="Calibri" w:hAnsi="Calibri"/>
-                <w:b/>
-                <w:bCs/>
-                <w:color w:val="2E9E6B"/>
-                <w:sz w:val="19"/>
-                <w:szCs w:val="19"/>
-              </w:rPr>
-              <w:t xml:space="preserve">Beispiel aus der WG-Küche</w:t>
-            </w:r>
-          </w:p>
-          <w:tbl>
-            <w:tblPr>
-              <w:tblW w:type="dxa" w:w="5003"/>
-              <w:tblBorders>
-                <w:top w:val="single" w:color="auto" w:sz="4"/>
-                <w:left w:val="single" w:color="auto" w:sz="4"/>
-                <w:bottom w:val="single" w:color="auto" w:sz="4"/>
-                <w:right w:val="single" w:color="auto" w:sz="4"/>
-                <w:insideH w:val="single" w:color="auto" w:sz="4"/>
-                <w:insideV w:val="single" w:color="auto" w:sz="4"/>
-              </w:tblBorders>
-            </w:tblPr>
-            <w:tblGrid>
-              <w:gridCol w:w="5003"/>
-            </w:tblGrid>
-            <w:tr>
-              <w:trPr>
-                <w:cantSplit/>
-              </w:trPr>
-              <w:tc>
-                <w:tcPr>
-                  <w:tcW w:type="dxa" w:w="5003"/>
-                  <w:tcBorders>
-                    <w:top w:val="single" w:color="FFFFFF" w:sz="12"/>
-                    <w:left w:val="single" w:color="FFFFFF" w:sz="12"/>
-                    <w:bottom w:val="single" w:color="FFFFFF" w:sz="12"/>
-                    <w:right w:val="single" w:color="FFFFFF" w:sz="12"/>
-                  </w:tcBorders>
-                  <w:shd w:fill="FBECEB" w:color="auto" w:val="clear"/>
-                  <w:tcMar>
-                    <w:top w:type="dxa" w:w="60"/>
-                    <w:left w:type="dxa" w:w="100"/>
-                    <w:bottom w:type="dxa" w:w="60"/>
-                    <w:right w:type="dxa" w:w="100"/>
-                  </w:tcMar>
-                  <w:vAlign w:val="top"/>
-                </w:tcPr>
-                <w:p>
-                  <w:pPr>
-                    <w:spacing w:after="0" w:before="0"/>
-                  </w:pPr>
-                  <w:r>
-                    <w:rPr>
-                      <w:rFonts w:ascii="Calibri" w:cs="Calibri" w:eastAsia="Calibri" w:hAnsi="Calibri"/>
-                      <w:b/>
-                      <w:bCs/>
-                      <w:color w:val="D9534F"/>
-                      <w:sz w:val="15"/>
-                      <w:szCs w:val="15"/>
-                    </w:rPr>
-                    <w:t xml:space="preserve">statt</w:t>
-                  </w:r>
-                </w:p>
-                <w:p>
-                  <w:pPr>
-                    <w:spacing w:after="0" w:before="0"/>
-                  </w:pPr>
-                  <w:r>
-                    <w:rPr>
-                      <w:rFonts w:ascii="Cambria" w:cs="Cambria" w:eastAsia="Cambria" w:hAnsi="Cambria"/>
-                      <w:i/>
-                      <w:iCs/>
-                      <w:color w:val="000000"/>
-                      <w:sz w:val="19"/>
-                      <w:szCs w:val="19"/>
-                    </w:rPr>
-                    <w:t xml:space="preserve">Chill mal, ist doch nur Geschirr.</w:t>
-                  </w:r>
-                </w:p>
-              </w:tc>
-            </w:tr>
-            <w:tr>
-              <w:trPr>
-                <w:cantSplit/>
-              </w:trPr>
-              <w:tc>
-                <w:tcPr>
-                  <w:tcW w:type="dxa" w:w="5003"/>
-                  <w:tcBorders>
-                    <w:top w:val="single" w:color="FFFFFF" w:sz="12"/>
-                    <w:left w:val="single" w:color="FFFFFF" w:sz="12"/>
-                    <w:bottom w:val="single" w:color="FFFFFF" w:sz="12"/>
-                    <w:right w:val="single" w:color="FFFFFF" w:sz="12"/>
-                  </w:tcBorders>
-                  <w:shd w:fill="EAF0FA" w:color="auto" w:val="clear"/>
-                  <w:tcMar>
-                    <w:top w:type="dxa" w:w="60"/>
-                    <w:left w:type="dxa" w:w="100"/>
-                    <w:bottom w:type="dxa" w:w="60"/>
-                    <w:right w:type="dxa" w:w="100"/>
-                  </w:tcMar>
-                  <w:vAlign w:val="top"/>
-                </w:tcPr>
-                <w:p>
-                  <w:pPr>
-                    <w:spacing w:after="0" w:before="0"/>
-                  </w:pPr>
-                  <w:r>
-                    <w:rPr>
-                      <w:rFonts w:ascii="Calibri" w:cs="Calibri" w:eastAsia="Calibri" w:hAnsi="Calibri"/>
-                      <w:b/>
-                      <w:bCs/>
-                      <w:color w:val="2E9E6B"/>
-                      <w:sz w:val="15"/>
-                      <w:szCs w:val="15"/>
-                    </w:rPr>
-                    <w:t xml:space="preserve">besser</w:t>
-                  </w:r>
-                </w:p>
-                <w:p>
-                  <w:pPr>
-                    <w:spacing w:after="0" w:before="0"/>
-                  </w:pPr>
-                  <w:r>
-                    <w:rPr>
-                      <w:rFonts w:ascii="Cambria" w:cs="Cambria" w:eastAsia="Cambria" w:hAnsi="Cambria"/>
-                      <w:i/>
-                      <w:iCs/>
-                      <w:color w:val="000000"/>
-                      <w:sz w:val="19"/>
-                      <w:szCs w:val="19"/>
-                    </w:rPr>
-                    <w:t xml:space="preserve">Du bist genervt, weil du nach der Arbeit einfach kochen willst, oder? Das verstehe ich.</w:t>
-                  </w:r>
-                </w:p>
-              </w:tc>
-            </w:tr>
-          </w:tbl>
-          <w:p/>
+                <w:sz w:val="20"/>
+                <w:szCs w:val="20"/>
+              </w:rPr>
+              <w:t xml:space="preserve">   →   Zeile 4</w:t>
+            </w:r>
+          </w:p>
         </w:tc>
       </w:tr>
     </w:tbl>
     <w:p>
       <w:pPr>
-        <w:keepNext/>
-        <w:spacing w:after="0" w:before="40"/>
+        <w:spacing w:after="40" w:before="80"/>
       </w:pPr>
       <w:r>
         <w:rPr>
@@ -4162,29 +3782,46 @@
           <w:sz w:val="20"/>
           <w:szCs w:val="20"/>
         </w:rPr>
-        <w:t xml:space="preserve">2  Anwenden · </w:t>
-      </w:r>
-      <w:r>
-        <w:rPr>
-          <w:rFonts w:ascii="Calibri" w:cs="Calibri" w:eastAsia="Calibri" w:hAnsi="Calibri"/>
+        <w:t xml:space="preserve">1  Ansehen </w:t>
+      </w:r>
+      <w:r>
+        <w:rPr>
+          <w:rFonts w:ascii="Calibri" w:cs="Calibri" w:eastAsia="Calibri" w:hAnsi="Calibri"/>
+          <w:color w:val="5B6B8C"/>
+          <w:sz w:val="19"/>
+          <w:szCs w:val="19"/>
+        </w:rPr>
+        <w:t xml:space="preserve">(gemeinsam an der Folie) · Ergänze die Formel:</w:t>
+      </w:r>
+    </w:p>
+    <w:p>
+      <w:pPr>
+        <w:spacing w:after="40" w:before="0"/>
+      </w:pPr>
+      <w:r>
+        <w:rPr>
+          <w:rFonts w:ascii="Cambria" w:cs="Cambria" w:eastAsia="Cambria" w:hAnsi="Cambria"/>
           <w:b/>
           <w:bCs/>
-          <w:color w:val="000000"/>
-          <w:sz w:val="20"/>
-          <w:szCs w:val="20"/>
-        </w:rPr>
-        <w:t xml:space="preserve">Schreibe Zeile 4 (Tom antwortet auf Lena) mit Empathie: </w:t>
-      </w:r>
-      <w:r>
-        <w:rPr>
-          <w:rFonts w:ascii="Cambria" w:cs="Cambria" w:eastAsia="Cambria" w:hAnsi="Cambria"/>
-          <w:i/>
-          <w:iCs/>
-          <w:color w:val="000000"/>
-          <w:sz w:val="20"/>
-          <w:szCs w:val="20"/>
-        </w:rPr>
-        <w:t xml:space="preserve">„Ich hatte halt dreimal Training. Nicht jeder hat so viel Freizeit wie du.“</w:t>
+          <w:color w:val="1E2761"/>
+          <w:sz w:val="24"/>
+          <w:szCs w:val="24"/>
+        </w:rPr>
+        <w:t xml:space="preserve">Du meinst also __________? · Das klingt, als ob du __________ bist.</w:t>
+      </w:r>
+    </w:p>
+    <w:p>
+      <w:pPr>
+        <w:spacing w:after="0" w:before="0"/>
+      </w:pPr>
+      <w:r>
+        <w:rPr>
+          <w:rFonts w:ascii="Calibri" w:cs="Calibri" w:eastAsia="Calibri" w:hAnsi="Calibri"/>
+          <w:color w:val="5B6B8C"/>
+          <w:sz w:val="19"/>
+          <w:szCs w:val="19"/>
+        </w:rPr>
+        <w:t xml:space="preserve">Das macht den besseren Satz aus:</w:t>
       </w:r>
     </w:p>
     <w:tbl>
@@ -4240,10 +3877,91 @@
           </w:p>
         </w:tc>
       </w:tr>
+    </w:tbl>
+    <w:p>
+      <w:pPr>
+        <w:keepNext/>
+        <w:spacing w:after="0" w:before="100"/>
+      </w:pPr>
+      <w:r>
+        <w:rPr>
+          <w:rFonts w:ascii="Calibri" w:cs="Calibri" w:eastAsia="Calibri" w:hAnsi="Calibri"/>
+          <w:b/>
+          <w:bCs/>
+          <w:color w:val="2E9E6B"/>
+          <w:sz w:val="20"/>
+          <w:szCs w:val="20"/>
+        </w:rPr>
+        <w:t xml:space="preserve">2  Umformulieren </w:t>
+      </w:r>
+      <w:r>
+        <w:rPr>
+          <w:rFonts w:ascii="Calibri" w:cs="Calibri" w:eastAsia="Calibri" w:hAnsi="Calibri"/>
+          <w:color w:val="5B6B8C"/>
+          <w:sz w:val="19"/>
+          <w:szCs w:val="19"/>
+        </w:rPr>
+        <w:t xml:space="preserve">(allein, 2 Min.) · </w:t>
+      </w:r>
+      <w:r>
+        <w:rPr>
+          <w:rFonts w:ascii="Calibri" w:cs="Calibri" w:eastAsia="Calibri" w:hAnsi="Calibri"/>
+          <w:b/>
+          <w:bCs/>
+          <w:color w:val="000000"/>
+          <w:sz w:val="20"/>
+          <w:szCs w:val="20"/>
+        </w:rPr>
+        <w:t xml:space="preserve">Tom antwortet auf Lena stattdessen: </w:t>
+      </w:r>
+      <w:r>
+        <w:rPr>
+          <w:rFonts w:ascii="Cambria" w:cs="Cambria" w:eastAsia="Cambria" w:hAnsi="Cambria"/>
+          <w:i/>
+          <w:iCs/>
+          <w:color w:val="000000"/>
+          <w:sz w:val="20"/>
+          <w:szCs w:val="20"/>
+        </w:rPr>
+        <w:t xml:space="preserve">„Ich hatte halt dreimal Training. Nicht jeder hat so viel Freizeit wie du.“</w:t>
+      </w:r>
+    </w:p>
+    <w:p>
+      <w:pPr>
+        <w:keepNext/>
+        <w:spacing w:after="0" w:before="0"/>
+      </w:pPr>
+      <w:r>
+        <w:rPr>
+          <w:rFonts w:ascii="Calibri" w:cs="Calibri" w:eastAsia="Calibri" w:hAnsi="Calibri"/>
+          <w:i/>
+          <w:iCs/>
+          <w:color w:val="5B6B8C"/>
+          <w:sz w:val="17"/>
+          <w:szCs w:val="17"/>
+        </w:rPr>
+        <w:t xml:space="preserve">Hilfe, wenn du nicht weiterkommst: „Du bist gerade …, weil …, oder? Das verstehe ich.“</w:t>
+      </w:r>
+    </w:p>
+    <w:tbl>
+      <w:tblPr>
+        <w:tblW w:type="dxa" w:w="10206"/>
+        <w:tblBorders>
+          <w:top w:val="single" w:color="auto" w:sz="4"/>
+          <w:left w:val="single" w:color="auto" w:sz="4"/>
+          <w:bottom w:val="single" w:color="auto" w:sz="4"/>
+          <w:right w:val="single" w:color="auto" w:sz="4"/>
+          <w:insideH w:val="single" w:color="auto" w:sz="4"/>
+          <w:insideV w:val="single" w:color="auto" w:sz="4"/>
+        </w:tblBorders>
+      </w:tblPr>
+      <w:tblGrid>
+        <w:gridCol w:w="10206"/>
+      </w:tblGrid>
       <w:tr>
         <w:trPr>
           <w:cantSplit/>
-          <w:trHeight w:val="440" w:hRule="atLeast"/>
+          <w:trHeight w:val="480" w:hRule="atLeast"/>
         </w:trPr>
         <w:tc>
           <w:tcPr>
@@ -4281,7 +3999,7 @@
       <w:tr>
         <w:trPr>
           <w:cantSplit/>
-          <w:trHeight w:val="440" w:hRule="atLeast"/>
+          <w:trHeight w:val="480" w:hRule="atLeast"/>
         </w:trPr>
         <w:tc>
           <w:tcPr>
@@ -4319,7 +4037,7 @@
       <w:tr>
         <w:trPr>
           <w:cantSplit/>
-          <w:trHeight w:val="440" w:hRule="atLeast"/>
+          <w:trHeight w:val="480" w:hRule="atLeast"/>
         </w:trPr>
         <w:tc>
           <w:tcPr>
@@ -4354,10 +4072,48 @@
           </w:p>
         </w:tc>
       </w:tr>
+      <w:tr>
+        <w:trPr>
+          <w:cantSplit/>
+          <w:trHeight w:val="480" w:hRule="atLeast"/>
+        </w:trPr>
+        <w:tc>
+          <w:tcPr>
+            <w:tcW w:type="dxa" w:w="10206"/>
+            <w:tcBorders>
+              <w:top w:val="none" w:color="FFFFFF" w:sz="0"/>
+              <w:left w:val="none" w:color="FFFFFF" w:sz="0"/>
+              <w:bottom w:val="single" w:color="9AA6C4" w:sz="6"/>
+              <w:right w:val="none" w:color="FFFFFF" w:sz="0"/>
+            </w:tcBorders>
+            <w:tcMar>
+              <w:top w:type="dxa" w:w="60"/>
+              <w:left w:type="dxa" w:w="0"/>
+              <w:bottom w:type="dxa" w:w="60"/>
+              <w:right w:type="dxa" w:w="0"/>
+            </w:tcMar>
+            <w:vAlign w:val="bottom"/>
+          </w:tcPr>
+          <w:p>
+            <w:pPr>
+              <w:spacing w:after="0" w:before="0"/>
+            </w:pPr>
+            <w:r>
+              <w:rPr>
+                <w:rFonts w:ascii="Calibri" w:cs="Calibri" w:eastAsia="Calibri" w:hAnsi="Calibri"/>
+                <w:color w:val="000000"/>
+                <w:sz w:val="22"/>
+                <w:szCs w:val="22"/>
+              </w:rPr>
+              <w:t xml:space="preserve"/>
+            </w:r>
+          </w:p>
+        </w:tc>
+      </w:tr>
     </w:tbl>
     <w:p>
       <w:pPr>
-        <w:spacing w:after="0" w:before="60"/>
+        <w:spacing w:after="20" w:before="60"/>
       </w:pPr>
       <w:r>
         <w:rPr>
@@ -4368,7 +4124,16 @@
           <w:sz w:val="19"/>
           <w:szCs w:val="19"/>
         </w:rPr>
-        <w:t xml:space="preserve">3  Prüfen   </w:t>
+        <w:t xml:space="preserve">3  Prüfen </w:t>
+      </w:r>
+      <w:r>
+        <w:rPr>
+          <w:rFonts w:ascii="Calibri" w:cs="Calibri" w:eastAsia="Calibri" w:hAnsi="Calibri"/>
+          <w:color w:val="5B6B8C"/>
+          <w:sz w:val="18"/>
+          <w:szCs w:val="18"/>
+        </w:rPr>
+        <w:t xml:space="preserve">(Daumenprobe)   </w:t>
       </w:r>
       <w:r>
         <w:rPr>
@@ -4387,6 +4152,31 @@
           <w:szCs w:val="19"/>
         </w:rPr>
         <w:t xml:space="preserve">☐ kein Gegenangriff     </w:t>
+      </w:r>
+    </w:p>
+    <w:p>
+      <w:pPr>
+        <w:spacing w:after="0" w:before="0"/>
+      </w:pPr>
+      <w:r>
+        <w:rPr>
+          <w:rFonts w:ascii="Calibri" w:cs="Calibri" w:eastAsia="Calibri" w:hAnsi="Calibri"/>
+          <w:b/>
+          <w:bCs/>
+          <w:color w:val="D9534F"/>
+          <w:sz w:val="18"/>
+          <w:szCs w:val="18"/>
+        </w:rPr>
+        <w:t xml:space="preserve">Stolperfalle: </w:t>
+      </w:r>
+      <w:r>
+        <w:rPr>
+          <w:rFonts w:ascii="Calibri" w:cs="Calibri" w:eastAsia="Calibri" w:hAnsi="Calibri"/>
+          <w:color w:val="000000"/>
+          <w:sz w:val="18"/>
+          <w:szCs w:val="18"/>
+        </w:rPr>
+        <w:t xml:space="preserve">kein „Ja, aber …“, keine Rechtfertigung vor dem Verstehen.</w:t>
       </w:r>
     </w:p>
     <w:p>
@@ -4403,7 +4193,7 @@
           <w:sz w:val="18"/>
           <w:szCs w:val="18"/>
         </w:rPr>
-        <w:t xml:space="preserve">AUFGABE 3 · TECHNIK-TRAINING · FORTSETZUNG</w:t>
+        <w:t xml:space="preserve">AUFGABE 3 · TECHNIK FÜR TECHNIK · FORTSETZUNG</w:t>
       </w:r>
     </w:p>
     <w:tbl>
@@ -4475,313 +4265,18 @@
                 <w:b/>
                 <w:bCs/>
                 <w:color w:val="FFFFFF"/>
-                <w:sz w:val="19"/>
-                <w:szCs w:val="19"/>
-              </w:rPr>
-              <w:t xml:space="preserve">   ·   Beobachtung → Gefühl → Bedürfnis → Bitte</w:t>
-            </w:r>
-          </w:p>
-        </w:tc>
-      </w:tr>
-    </w:tbl>
-    <w:tbl>
-      <w:tblPr>
-        <w:tblW w:type="dxa" w:w="10206"/>
-        <w:tblBorders>
-          <w:top w:val="single" w:color="auto" w:sz="4"/>
-          <w:left w:val="single" w:color="auto" w:sz="4"/>
-          <w:bottom w:val="single" w:color="auto" w:sz="4"/>
-          <w:right w:val="single" w:color="auto" w:sz="4"/>
-          <w:insideH w:val="single" w:color="auto" w:sz="4"/>
-          <w:insideV w:val="single" w:color="auto" w:sz="4"/>
-        </w:tblBorders>
-      </w:tblPr>
-      <w:tblGrid>
-        <w:gridCol w:w="5203"/>
-        <w:gridCol w:w="5003"/>
-      </w:tblGrid>
-      <w:tr>
-        <w:trPr>
-          <w:cantSplit/>
-        </w:trPr>
-        <w:tc>
-          <w:tcPr>
-            <w:tcW w:type="dxa" w:w="5203"/>
-            <w:tcBorders>
-              <w:top w:val="none" w:color="FFFFFF" w:sz="0"/>
-              <w:left w:val="none" w:color="FFFFFF" w:sz="0"/>
-              <w:bottom w:val="none" w:color="FFFFFF" w:sz="0"/>
-              <w:right w:val="none" w:color="FFFFFF" w:sz="0"/>
-            </w:tcBorders>
-            <w:tcMar>
-              <w:top w:type="dxa" w:w="60"/>
-              <w:left w:type="dxa" w:w="100"/>
-              <w:bottom w:type="dxa" w:w="60"/>
-              <w:right w:type="dxa" w:w="100"/>
-            </w:tcMar>
-            <w:vAlign w:val="top"/>
-          </w:tcPr>
-          <w:p>
-            <w:pPr>
-              <w:spacing w:after="20" w:before="0"/>
-            </w:pPr>
-            <w:r>
-              <w:rPr>
-                <w:rFonts w:ascii="Calibri" w:cs="Calibri" w:eastAsia="Calibri" w:hAnsi="Calibri"/>
-                <w:b/>
-                <w:bCs/>
-                <w:color w:val="E8A33D"/>
-                <w:sz w:val="19"/>
-                <w:szCs w:val="19"/>
-              </w:rPr>
-              <w:t xml:space="preserve">1  Lesen · So geht’s</w:t>
-            </w:r>
-          </w:p>
-          <w:p>
-            <w:pPr>
-              <w:spacing w:after="10" w:before="0"/>
-            </w:pPr>
-            <w:r>
-              <w:rPr>
-                <w:rFonts w:ascii="Calibri" w:cs="Calibri" w:eastAsia="Calibri" w:hAnsi="Calibri"/>
-                <w:b/>
-                <w:bCs/>
-                <w:color w:val="5B6B8C"/>
-                <w:sz w:val="19"/>
-                <w:szCs w:val="19"/>
-              </w:rPr>
-              <w:t xml:space="preserve">•  </w:t>
-            </w:r>
-            <w:r>
-              <w:rPr>
-                <w:rFonts w:ascii="Calibri" w:cs="Calibri" w:eastAsia="Calibri" w:hAnsi="Calibri"/>
-                <w:color w:val="000000"/>
-                <w:sz w:val="19"/>
-                <w:szCs w:val="19"/>
-              </w:rPr>
-              <w:t xml:space="preserve">Sag, was dir wichtig ist (Bedürfnis) – nicht, was der andere falsch macht.</w:t>
-            </w:r>
-          </w:p>
-          <w:p>
-            <w:pPr>
-              <w:spacing w:after="10" w:before="0"/>
-            </w:pPr>
-            <w:r>
-              <w:rPr>
-                <w:rFonts w:ascii="Calibri" w:cs="Calibri" w:eastAsia="Calibri" w:hAnsi="Calibri"/>
-                <w:b/>
-                <w:bCs/>
-                <w:color w:val="5B6B8C"/>
-                <w:sz w:val="19"/>
-                <w:szCs w:val="19"/>
-              </w:rPr>
-              <w:t xml:space="preserve">•  </w:t>
-            </w:r>
-            <w:r>
-              <w:rPr>
-                <w:rFonts w:ascii="Calibri" w:cs="Calibri" w:eastAsia="Calibri" w:hAnsi="Calibri"/>
-                <w:color w:val="000000"/>
-                <w:sz w:val="19"/>
-                <w:szCs w:val="19"/>
-              </w:rPr>
-              <w:t xml:space="preserve">Bitte konkret: wer, was, bis wann? Als Frage, der andere darf Nein sagen.</w:t>
-            </w:r>
-          </w:p>
-          <w:p>
-            <w:pPr>
-              <w:spacing w:after="0" w:before="40"/>
-            </w:pPr>
-            <w:r>
-              <w:rPr>
-                <w:rFonts w:ascii="Calibri" w:cs="Calibri" w:eastAsia="Calibri" w:hAnsi="Calibri"/>
-                <w:b/>
-                <w:bCs/>
-                <w:color w:val="D9534F"/>
-                <w:sz w:val="18"/>
-                <w:szCs w:val="18"/>
-              </w:rPr>
-              <w:t xml:space="preserve">Stolperfalle: </w:t>
-            </w:r>
-            <w:r>
-              <w:rPr>
-                <w:rFonts w:ascii="Calibri" w:cs="Calibri" w:eastAsia="Calibri" w:hAnsi="Calibri"/>
-                <w:color w:val="000000"/>
-                <w:sz w:val="18"/>
-                <w:szCs w:val="18"/>
-              </w:rPr>
-              <w:t xml:space="preserve">„Du musst endlich …“ ist eine Forderung, keine Bitte.</w:t>
-            </w:r>
-          </w:p>
-        </w:tc>
-        <w:tc>
-          <w:tcPr>
-            <w:tcW w:type="dxa" w:w="5003"/>
-            <w:tcBorders>
-              <w:top w:val="none" w:color="FFFFFF" w:sz="0"/>
-              <w:left w:val="none" w:color="FFFFFF" w:sz="0"/>
-              <w:bottom w:val="none" w:color="FFFFFF" w:sz="0"/>
-              <w:right w:val="none" w:color="FFFFFF" w:sz="0"/>
-            </w:tcBorders>
-            <w:tcMar>
-              <w:top w:type="dxa" w:w="60"/>
-              <w:left w:type="dxa" w:w="100"/>
-              <w:bottom w:type="dxa" w:w="60"/>
-              <w:right w:type="dxa" w:w="100"/>
-            </w:tcMar>
-            <w:vAlign w:val="top"/>
-          </w:tcPr>
-          <w:p>
-            <w:pPr>
-              <w:spacing w:after="20" w:before="0"/>
-            </w:pPr>
-            <w:r>
-              <w:rPr>
-                <w:rFonts w:ascii="Calibri" w:cs="Calibri" w:eastAsia="Calibri" w:hAnsi="Calibri"/>
-                <w:b/>
-                <w:bCs/>
-                <w:color w:val="E8A33D"/>
-                <w:sz w:val="19"/>
-                <w:szCs w:val="19"/>
-              </w:rPr>
-              <w:t xml:space="preserve">Beispiel aus der WG-Küche</w:t>
-            </w:r>
-          </w:p>
-          <w:tbl>
-            <w:tblPr>
-              <w:tblW w:type="dxa" w:w="5003"/>
-              <w:tblBorders>
-                <w:top w:val="single" w:color="auto" w:sz="4"/>
-                <w:left w:val="single" w:color="auto" w:sz="4"/>
-                <w:bottom w:val="single" w:color="auto" w:sz="4"/>
-                <w:right w:val="single" w:color="auto" w:sz="4"/>
-                <w:insideH w:val="single" w:color="auto" w:sz="4"/>
-                <w:insideV w:val="single" w:color="auto" w:sz="4"/>
-              </w:tblBorders>
-            </w:tblPr>
-            <w:tblGrid>
-              <w:gridCol w:w="5003"/>
-            </w:tblGrid>
-            <w:tr>
-              <w:trPr>
-                <w:cantSplit/>
-              </w:trPr>
-              <w:tc>
-                <w:tcPr>
-                  <w:tcW w:type="dxa" w:w="5003"/>
-                  <w:tcBorders>
-                    <w:top w:val="single" w:color="FFFFFF" w:sz="12"/>
-                    <w:left w:val="single" w:color="FFFFFF" w:sz="12"/>
-                    <w:bottom w:val="single" w:color="FFFFFF" w:sz="12"/>
-                    <w:right w:val="single" w:color="FFFFFF" w:sz="12"/>
-                  </w:tcBorders>
-                  <w:shd w:fill="FBECEB" w:color="auto" w:val="clear"/>
-                  <w:tcMar>
-                    <w:top w:type="dxa" w:w="60"/>
-                    <w:left w:type="dxa" w:w="100"/>
-                    <w:bottom w:type="dxa" w:w="60"/>
-                    <w:right w:type="dxa" w:w="100"/>
-                  </w:tcMar>
-                  <w:vAlign w:val="top"/>
-                </w:tcPr>
-                <w:p>
-                  <w:pPr>
-                    <w:spacing w:after="0" w:before="0"/>
-                  </w:pPr>
-                  <w:r>
-                    <w:rPr>
-                      <w:rFonts w:ascii="Calibri" w:cs="Calibri" w:eastAsia="Calibri" w:hAnsi="Calibri"/>
-                      <w:b/>
-                      <w:bCs/>
-                      <w:color w:val="D9534F"/>
-                      <w:sz w:val="15"/>
-                      <w:szCs w:val="15"/>
-                    </w:rPr>
-                    <w:t xml:space="preserve">statt</w:t>
-                  </w:r>
-                </w:p>
-                <w:p>
-                  <w:pPr>
-                    <w:spacing w:after="0" w:before="0"/>
-                  </w:pPr>
-                  <w:r>
-                    <w:rPr>
-                      <w:rFonts w:ascii="Cambria" w:cs="Cambria" w:eastAsia="Cambria" w:hAnsi="Cambria"/>
-                      <w:i/>
-                      <w:iCs/>
-                      <w:color w:val="000000"/>
-                      <w:sz w:val="19"/>
-                      <w:szCs w:val="19"/>
-                    </w:rPr>
-                    <w:t xml:space="preserve">Nie machst du was im Haushalt!</w:t>
-                  </w:r>
-                </w:p>
-              </w:tc>
-            </w:tr>
-            <w:tr>
-              <w:trPr>
-                <w:cantSplit/>
-              </w:trPr>
-              <w:tc>
-                <w:tcPr>
-                  <w:tcW w:type="dxa" w:w="5003"/>
-                  <w:tcBorders>
-                    <w:top w:val="single" w:color="FFFFFF" w:sz="12"/>
-                    <w:left w:val="single" w:color="FFFFFF" w:sz="12"/>
-                    <w:bottom w:val="single" w:color="FFFFFF" w:sz="12"/>
-                    <w:right w:val="single" w:color="FFFFFF" w:sz="12"/>
-                  </w:tcBorders>
-                  <w:shd w:fill="EAF0FA" w:color="auto" w:val="clear"/>
-                  <w:tcMar>
-                    <w:top w:type="dxa" w:w="60"/>
-                    <w:left w:type="dxa" w:w="100"/>
-                    <w:bottom w:type="dxa" w:w="60"/>
-                    <w:right w:type="dxa" w:w="100"/>
-                  </w:tcMar>
-                  <w:vAlign w:val="top"/>
-                </w:tcPr>
-                <w:p>
-                  <w:pPr>
-                    <w:spacing w:after="0" w:before="0"/>
-                  </w:pPr>
-                  <w:r>
-                    <w:rPr>
-                      <w:rFonts w:ascii="Calibri" w:cs="Calibri" w:eastAsia="Calibri" w:hAnsi="Calibri"/>
-                      <w:b/>
-                      <w:bCs/>
-                      <w:color w:val="E8A33D"/>
-                      <w:sz w:val="15"/>
-                      <w:szCs w:val="15"/>
-                    </w:rPr>
-                    <w:t xml:space="preserve">besser</w:t>
-                  </w:r>
-                </w:p>
-                <w:p>
-                  <w:pPr>
-                    <w:spacing w:after="0" w:before="0"/>
-                  </w:pPr>
-                  <w:r>
-                    <w:rPr>
-                      <w:rFonts w:ascii="Cambria" w:cs="Cambria" w:eastAsia="Cambria" w:hAnsi="Cambria"/>
-                      <w:i/>
-                      <w:iCs/>
-                      <w:color w:val="000000"/>
-                      <w:sz w:val="19"/>
-                      <w:szCs w:val="19"/>
-                    </w:rPr>
-                    <w:t xml:space="preserve">Mir ist wichtig, dass die Küche abends frei ist. Kannst du dein Geschirr bis 18 Uhr spülen?</w:t>
-                  </w:r>
-                </w:p>
-              </w:tc>
-            </w:tr>
-          </w:tbl>
-          <w:p/>
+                <w:sz w:val="20"/>
+                <w:szCs w:val="20"/>
+              </w:rPr>
+              <w:t xml:space="preserve">   →   Zeile 5</w:t>
+            </w:r>
+          </w:p>
         </w:tc>
       </w:tr>
     </w:tbl>
     <w:p>
       <w:pPr>
-        <w:keepNext/>
-        <w:spacing w:after="0" w:before="40"/>
+        <w:spacing w:after="40" w:before="80"/>
       </w:pPr>
       <w:r>
         <w:rPr>
@@ -4792,29 +4287,46 @@
           <w:sz w:val="20"/>
           <w:szCs w:val="20"/>
         </w:rPr>
-        <w:t xml:space="preserve">2  Anwenden · </w:t>
-      </w:r>
-      <w:r>
-        <w:rPr>
-          <w:rFonts w:ascii="Calibri" w:cs="Calibri" w:eastAsia="Calibri" w:hAnsi="Calibri"/>
+        <w:t xml:space="preserve">1  Ansehen </w:t>
+      </w:r>
+      <w:r>
+        <w:rPr>
+          <w:rFonts w:ascii="Calibri" w:cs="Calibri" w:eastAsia="Calibri" w:hAnsi="Calibri"/>
+          <w:color w:val="5B6B8C"/>
+          <w:sz w:val="19"/>
+          <w:szCs w:val="19"/>
+        </w:rPr>
+        <w:t xml:space="preserve">(gemeinsam an der Folie) · Ergänze die Formel:</w:t>
+      </w:r>
+    </w:p>
+    <w:p>
+      <w:pPr>
+        <w:spacing w:after="40" w:before="0"/>
+      </w:pPr>
+      <w:r>
+        <w:rPr>
+          <w:rFonts w:ascii="Cambria" w:cs="Cambria" w:eastAsia="Cambria" w:hAnsi="Cambria"/>
           <w:b/>
           <w:bCs/>
-          <w:color w:val="000000"/>
-          <w:sz w:val="20"/>
-          <w:szCs w:val="20"/>
-        </w:rPr>
-        <w:t xml:space="preserve">Schreibe Zeile 5 (Lena) als Wunsch mit Bitte: </w:t>
-      </w:r>
-      <w:r>
-        <w:rPr>
-          <w:rFonts w:ascii="Cambria" w:cs="Cambria" w:eastAsia="Cambria" w:hAnsi="Cambria"/>
-          <w:i/>
-          <w:iCs/>
-          <w:color w:val="000000"/>
-          <w:sz w:val="20"/>
-          <w:szCs w:val="20"/>
-        </w:rPr>
-        <w:t xml:space="preserve">„Freizeit? Ich hab die komplette Gliederung gemacht! Immer bleibt alles an mir hängen.“</w:t>
+          <w:color w:val="1E2761"/>
+          <w:sz w:val="24"/>
+          <w:szCs w:val="24"/>
+        </w:rPr>
+        <w:t xml:space="preserve">Beobachtung → __________ → __________ → __________</w:t>
+      </w:r>
+    </w:p>
+    <w:p>
+      <w:pPr>
+        <w:spacing w:after="0" w:before="0"/>
+      </w:pPr>
+      <w:r>
+        <w:rPr>
+          <w:rFonts w:ascii="Calibri" w:cs="Calibri" w:eastAsia="Calibri" w:hAnsi="Calibri"/>
+          <w:color w:val="5B6B8C"/>
+          <w:sz w:val="19"/>
+          <w:szCs w:val="19"/>
+        </w:rPr>
+        <w:t xml:space="preserve">Das macht den besseren Satz aus:</w:t>
       </w:r>
     </w:p>
     <w:tbl>
@@ -4870,10 +4382,91 @@
           </w:p>
         </w:tc>
       </w:tr>
+    </w:tbl>
+    <w:p>
+      <w:pPr>
+        <w:keepNext/>
+        <w:spacing w:after="0" w:before="100"/>
+      </w:pPr>
+      <w:r>
+        <w:rPr>
+          <w:rFonts w:ascii="Calibri" w:cs="Calibri" w:eastAsia="Calibri" w:hAnsi="Calibri"/>
+          <w:b/>
+          <w:bCs/>
+          <w:color w:val="E8A33D"/>
+          <w:sz w:val="20"/>
+          <w:szCs w:val="20"/>
+        </w:rPr>
+        <w:t xml:space="preserve">2  Umformulieren </w:t>
+      </w:r>
+      <w:r>
+        <w:rPr>
+          <w:rFonts w:ascii="Calibri" w:cs="Calibri" w:eastAsia="Calibri" w:hAnsi="Calibri"/>
+          <w:color w:val="5B6B8C"/>
+          <w:sz w:val="19"/>
+          <w:szCs w:val="19"/>
+        </w:rPr>
+        <w:t xml:space="preserve">(allein, 2 Min.) · </w:t>
+      </w:r>
+      <w:r>
+        <w:rPr>
+          <w:rFonts w:ascii="Calibri" w:cs="Calibri" w:eastAsia="Calibri" w:hAnsi="Calibri"/>
+          <w:b/>
+          <w:bCs/>
+          <w:color w:val="000000"/>
+          <w:sz w:val="20"/>
+          <w:szCs w:val="20"/>
+        </w:rPr>
+        <w:t xml:space="preserve">Lena sagt stattdessen: </w:t>
+      </w:r>
+      <w:r>
+        <w:rPr>
+          <w:rFonts w:ascii="Cambria" w:cs="Cambria" w:eastAsia="Cambria" w:hAnsi="Cambria"/>
+          <w:i/>
+          <w:iCs/>
+          <w:color w:val="000000"/>
+          <w:sz w:val="20"/>
+          <w:szCs w:val="20"/>
+        </w:rPr>
+        <w:t xml:space="preserve">„Freizeit? Ich hab die komplette Gliederung gemacht! Immer bleibt alles an mir hängen.“</w:t>
+      </w:r>
+    </w:p>
+    <w:p>
+      <w:pPr>
+        <w:keepNext/>
+        <w:spacing w:after="0" w:before="0"/>
+      </w:pPr>
+      <w:r>
+        <w:rPr>
+          <w:rFonts w:ascii="Calibri" w:cs="Calibri" w:eastAsia="Calibri" w:hAnsi="Calibri"/>
+          <w:i/>
+          <w:iCs/>
+          <w:color w:val="5B6B8C"/>
+          <w:sz w:val="17"/>
+          <w:szCs w:val="17"/>
+        </w:rPr>
+        <w:t xml:space="preserve">Hilfe, wenn du nicht weiterkommst: „Mir ist wichtig, dass … Kannst du … bis …?“</w:t>
+      </w:r>
+    </w:p>
+    <w:tbl>
+      <w:tblPr>
+        <w:tblW w:type="dxa" w:w="10206"/>
+        <w:tblBorders>
+          <w:top w:val="single" w:color="auto" w:sz="4"/>
+          <w:left w:val="single" w:color="auto" w:sz="4"/>
+          <w:bottom w:val="single" w:color="auto" w:sz="4"/>
+          <w:right w:val="single" w:color="auto" w:sz="4"/>
+          <w:insideH w:val="single" w:color="auto" w:sz="4"/>
+          <w:insideV w:val="single" w:color="auto" w:sz="4"/>
+        </w:tblBorders>
+      </w:tblPr>
+      <w:tblGrid>
+        <w:gridCol w:w="10206"/>
+      </w:tblGrid>
       <w:tr>
         <w:trPr>
           <w:cantSplit/>
-          <w:trHeight w:val="440" w:hRule="atLeast"/>
+          <w:trHeight w:val="480" w:hRule="atLeast"/>
         </w:trPr>
         <w:tc>
           <w:tcPr>
@@ -4911,7 +4504,7 @@
       <w:tr>
         <w:trPr>
           <w:cantSplit/>
-          <w:trHeight w:val="440" w:hRule="atLeast"/>
+          <w:trHeight w:val="480" w:hRule="atLeast"/>
         </w:trPr>
         <w:tc>
           <w:tcPr>
@@ -4949,7 +4542,7 @@
       <w:tr>
         <w:trPr>
           <w:cantSplit/>
-          <w:trHeight w:val="440" w:hRule="atLeast"/>
+          <w:trHeight w:val="480" w:hRule="atLeast"/>
         </w:trPr>
         <w:tc>
           <w:tcPr>
@@ -4984,10 +4577,48 @@
           </w:p>
         </w:tc>
       </w:tr>
+      <w:tr>
+        <w:trPr>
+          <w:cantSplit/>
+          <w:trHeight w:val="480" w:hRule="atLeast"/>
+        </w:trPr>
+        <w:tc>
+          <w:tcPr>
+            <w:tcW w:type="dxa" w:w="10206"/>
+            <w:tcBorders>
+              <w:top w:val="none" w:color="FFFFFF" w:sz="0"/>
+              <w:left w:val="none" w:color="FFFFFF" w:sz="0"/>
+              <w:bottom w:val="single" w:color="9AA6C4" w:sz="6"/>
+              <w:right w:val="none" w:color="FFFFFF" w:sz="0"/>
+            </w:tcBorders>
+            <w:tcMar>
+              <w:top w:type="dxa" w:w="60"/>
+              <w:left w:type="dxa" w:w="0"/>
+              <w:bottom w:type="dxa" w:w="60"/>
+              <w:right w:type="dxa" w:w="0"/>
+            </w:tcMar>
+            <w:vAlign w:val="bottom"/>
+          </w:tcPr>
+          <w:p>
+            <w:pPr>
+              <w:spacing w:after="0" w:before="0"/>
+            </w:pPr>
+            <w:r>
+              <w:rPr>
+                <w:rFonts w:ascii="Calibri" w:cs="Calibri" w:eastAsia="Calibri" w:hAnsi="Calibri"/>
+                <w:color w:val="000000"/>
+                <w:sz w:val="22"/>
+                <w:szCs w:val="22"/>
+              </w:rPr>
+              <w:t xml:space="preserve"/>
+            </w:r>
+          </w:p>
+        </w:tc>
+      </w:tr>
     </w:tbl>
     <w:p>
       <w:pPr>
-        <w:spacing w:after="0" w:before="60"/>
+        <w:spacing w:after="20" w:before="60"/>
       </w:pPr>
       <w:r>
         <w:rPr>
@@ -4998,7 +4629,16 @@
           <w:sz w:val="19"/>
           <w:szCs w:val="19"/>
         </w:rPr>
-        <w:t xml:space="preserve">3  Prüfen   </w:t>
+        <w:t xml:space="preserve">3  Prüfen </w:t>
+      </w:r>
+      <w:r>
+        <w:rPr>
+          <w:rFonts w:ascii="Calibri" w:cs="Calibri" w:eastAsia="Calibri" w:hAnsi="Calibri"/>
+          <w:color w:val="5B6B8C"/>
+          <w:sz w:val="18"/>
+          <w:szCs w:val="18"/>
+        </w:rPr>
+        <w:t xml:space="preserve">(Daumenprobe)   </w:t>
       </w:r>
       <w:r>
         <w:rPr>
@@ -5021,7 +4661,32 @@
     </w:p>
     <w:p>
       <w:pPr>
-        <w:spacing w:after="160" w:before="0"/>
+        <w:spacing w:after="0" w:before="0"/>
+      </w:pPr>
+      <w:r>
+        <w:rPr>
+          <w:rFonts w:ascii="Calibri" w:cs="Calibri" w:eastAsia="Calibri" w:hAnsi="Calibri"/>
+          <w:b/>
+          <w:bCs/>
+          <w:color w:val="D9534F"/>
+          <w:sz w:val="18"/>
+          <w:szCs w:val="18"/>
+        </w:rPr>
+        <w:t xml:space="preserve">Stolperfalle: </w:t>
+      </w:r>
+      <w:r>
+        <w:rPr>
+          <w:rFonts w:ascii="Calibri" w:cs="Calibri" w:eastAsia="Calibri" w:hAnsi="Calibri"/>
+          <w:color w:val="000000"/>
+          <w:sz w:val="18"/>
+          <w:szCs w:val="18"/>
+        </w:rPr>
+        <w:t xml:space="preserve">„Du musst endlich …“ ist eine Forderung, keine Bitte.</w:t>
+      </w:r>
+    </w:p>
+    <w:p>
+      <w:pPr>
+        <w:spacing w:after="200" w:before="0"/>
       </w:pPr>
       <w:r>
         <w:rPr>
@@ -5102,313 +4767,18 @@
                 <w:b/>
                 <w:bCs/>
                 <w:color w:val="FFFFFF"/>
-                <w:sz w:val="19"/>
-                <w:szCs w:val="19"/>
-              </w:rPr>
-              <w:t xml:space="preserve">   ·   Stopp – wie reden wir gerade miteinander?</w:t>
-            </w:r>
-          </w:p>
-        </w:tc>
-      </w:tr>
-    </w:tbl>
-    <w:tbl>
-      <w:tblPr>
-        <w:tblW w:type="dxa" w:w="10206"/>
-        <w:tblBorders>
-          <w:top w:val="single" w:color="auto" w:sz="4"/>
-          <w:left w:val="single" w:color="auto" w:sz="4"/>
-          <w:bottom w:val="single" w:color="auto" w:sz="4"/>
-          <w:right w:val="single" w:color="auto" w:sz="4"/>
-          <w:insideH w:val="single" w:color="auto" w:sz="4"/>
-          <w:insideV w:val="single" w:color="auto" w:sz="4"/>
-        </w:tblBorders>
-      </w:tblPr>
-      <w:tblGrid>
-        <w:gridCol w:w="5203"/>
-        <w:gridCol w:w="5003"/>
-      </w:tblGrid>
-      <w:tr>
-        <w:trPr>
-          <w:cantSplit/>
-        </w:trPr>
-        <w:tc>
-          <w:tcPr>
-            <w:tcW w:type="dxa" w:w="5203"/>
-            <w:tcBorders>
-              <w:top w:val="none" w:color="FFFFFF" w:sz="0"/>
-              <w:left w:val="none" w:color="FFFFFF" w:sz="0"/>
-              <w:bottom w:val="none" w:color="FFFFFF" w:sz="0"/>
-              <w:right w:val="none" w:color="FFFFFF" w:sz="0"/>
-            </w:tcBorders>
-            <w:tcMar>
-              <w:top w:type="dxa" w:w="60"/>
-              <w:left w:type="dxa" w:w="100"/>
-              <w:bottom w:type="dxa" w:w="60"/>
-              <w:right w:type="dxa" w:w="100"/>
-            </w:tcMar>
-            <w:vAlign w:val="top"/>
-          </w:tcPr>
-          <w:p>
-            <w:pPr>
-              <w:spacing w:after="20" w:before="0"/>
-            </w:pPr>
-            <w:r>
-              <w:rPr>
-                <w:rFonts w:ascii="Calibri" w:cs="Calibri" w:eastAsia="Calibri" w:hAnsi="Calibri"/>
-                <w:b/>
-                <w:bCs/>
-                <w:color w:val="8E5BB5"/>
-                <w:sz w:val="19"/>
-                <w:szCs w:val="19"/>
-              </w:rPr>
-              <w:t xml:space="preserve">1  Lesen · So geht’s</w:t>
-            </w:r>
-          </w:p>
-          <w:p>
-            <w:pPr>
-              <w:spacing w:after="10" w:before="0"/>
-            </w:pPr>
-            <w:r>
-              <w:rPr>
-                <w:rFonts w:ascii="Calibri" w:cs="Calibri" w:eastAsia="Calibri" w:hAnsi="Calibri"/>
-                <w:b/>
-                <w:bCs/>
-                <w:color w:val="5B6B8C"/>
-                <w:sz w:val="19"/>
-                <w:szCs w:val="19"/>
-              </w:rPr>
-              <w:t xml:space="preserve">•  </w:t>
-            </w:r>
-            <w:r>
-              <w:rPr>
-                <w:rFonts w:ascii="Calibri" w:cs="Calibri" w:eastAsia="Calibri" w:hAnsi="Calibri"/>
-                <w:color w:val="000000"/>
-                <w:sz w:val="19"/>
-                <w:szCs w:val="19"/>
-              </w:rPr>
-              <w:t xml:space="preserve">Tritt aus dem Streit heraus und benenne, was gerade im Gespräch passiert.</w:t>
-            </w:r>
-          </w:p>
-          <w:p>
-            <w:pPr>
-              <w:spacing w:after="10" w:before="0"/>
-            </w:pPr>
-            <w:r>
-              <w:rPr>
-                <w:rFonts w:ascii="Calibri" w:cs="Calibri" w:eastAsia="Calibri" w:hAnsi="Calibri"/>
-                <w:b/>
-                <w:bCs/>
-                <w:color w:val="5B6B8C"/>
-                <w:sz w:val="19"/>
-                <w:szCs w:val="19"/>
-              </w:rPr>
-              <w:t xml:space="preserve">•  </w:t>
-            </w:r>
-            <w:r>
-              <w:rPr>
-                <w:rFonts w:ascii="Calibri" w:cs="Calibri" w:eastAsia="Calibri" w:hAnsi="Calibri"/>
-                <w:color w:val="000000"/>
-                <w:sz w:val="19"/>
-                <w:szCs w:val="19"/>
-              </w:rPr>
-              <w:t xml:space="preserve">Erinnere an das gemeinsame Ziel und schlage einen Neustart vor.</w:t>
-            </w:r>
-          </w:p>
-          <w:p>
-            <w:pPr>
-              <w:spacing w:after="0" w:before="40"/>
-            </w:pPr>
-            <w:r>
-              <w:rPr>
-                <w:rFonts w:ascii="Calibri" w:cs="Calibri" w:eastAsia="Calibri" w:hAnsi="Calibri"/>
-                <w:b/>
-                <w:bCs/>
-                <w:color w:val="D9534F"/>
-                <w:sz w:val="18"/>
-                <w:szCs w:val="18"/>
-              </w:rPr>
-              <w:t xml:space="preserve">Stolperfalle: </w:t>
-            </w:r>
-            <w:r>
-              <w:rPr>
-                <w:rFonts w:ascii="Calibri" w:cs="Calibri" w:eastAsia="Calibri" w:hAnsi="Calibri"/>
-                <w:color w:val="000000"/>
-                <w:sz w:val="18"/>
-                <w:szCs w:val="18"/>
-              </w:rPr>
-              <w:t xml:space="preserve">kein neuer Vorwurf („Du redest immer so gemein …“).</w:t>
-            </w:r>
-          </w:p>
-        </w:tc>
-        <w:tc>
-          <w:tcPr>
-            <w:tcW w:type="dxa" w:w="5003"/>
-            <w:tcBorders>
-              <w:top w:val="none" w:color="FFFFFF" w:sz="0"/>
-              <w:left w:val="none" w:color="FFFFFF" w:sz="0"/>
-              <w:bottom w:val="none" w:color="FFFFFF" w:sz="0"/>
-              <w:right w:val="none" w:color="FFFFFF" w:sz="0"/>
-            </w:tcBorders>
-            <w:tcMar>
-              <w:top w:type="dxa" w:w="60"/>
-              <w:left w:type="dxa" w:w="100"/>
-              <w:bottom w:type="dxa" w:w="60"/>
-              <w:right w:type="dxa" w:w="100"/>
-            </w:tcMar>
-            <w:vAlign w:val="top"/>
-          </w:tcPr>
-          <w:p>
-            <w:pPr>
-              <w:spacing w:after="20" w:before="0"/>
-            </w:pPr>
-            <w:r>
-              <w:rPr>
-                <w:rFonts w:ascii="Calibri" w:cs="Calibri" w:eastAsia="Calibri" w:hAnsi="Calibri"/>
-                <w:b/>
-                <w:bCs/>
-                <w:color w:val="8E5BB5"/>
-                <w:sz w:val="19"/>
-                <w:szCs w:val="19"/>
-              </w:rPr>
-              <w:t xml:space="preserve">Beispiel aus der WG-Küche</w:t>
-            </w:r>
-          </w:p>
-          <w:tbl>
-            <w:tblPr>
-              <w:tblW w:type="dxa" w:w="5003"/>
-              <w:tblBorders>
-                <w:top w:val="single" w:color="auto" w:sz="4"/>
-                <w:left w:val="single" w:color="auto" w:sz="4"/>
-                <w:bottom w:val="single" w:color="auto" w:sz="4"/>
-                <w:right w:val="single" w:color="auto" w:sz="4"/>
-                <w:insideH w:val="single" w:color="auto" w:sz="4"/>
-                <w:insideV w:val="single" w:color="auto" w:sz="4"/>
-              </w:tblBorders>
-            </w:tblPr>
-            <w:tblGrid>
-              <w:gridCol w:w="5003"/>
-            </w:tblGrid>
-            <w:tr>
-              <w:trPr>
-                <w:cantSplit/>
-              </w:trPr>
-              <w:tc>
-                <w:tcPr>
-                  <w:tcW w:type="dxa" w:w="5003"/>
-                  <w:tcBorders>
-                    <w:top w:val="single" w:color="FFFFFF" w:sz="12"/>
-                    <w:left w:val="single" w:color="FFFFFF" w:sz="12"/>
-                    <w:bottom w:val="single" w:color="FFFFFF" w:sz="12"/>
-                    <w:right w:val="single" w:color="FFFFFF" w:sz="12"/>
-                  </w:tcBorders>
-                  <w:shd w:fill="FBECEB" w:color="auto" w:val="clear"/>
-                  <w:tcMar>
-                    <w:top w:type="dxa" w:w="60"/>
-                    <w:left w:type="dxa" w:w="100"/>
-                    <w:bottom w:type="dxa" w:w="60"/>
-                    <w:right w:type="dxa" w:w="100"/>
-                  </w:tcMar>
-                  <w:vAlign w:val="top"/>
-                </w:tcPr>
-                <w:p>
-                  <w:pPr>
-                    <w:spacing w:after="0" w:before="0"/>
-                  </w:pPr>
-                  <w:r>
-                    <w:rPr>
-                      <w:rFonts w:ascii="Calibri" w:cs="Calibri" w:eastAsia="Calibri" w:hAnsi="Calibri"/>
-                      <w:b/>
-                      <w:bCs/>
-                      <w:color w:val="D9534F"/>
-                      <w:sz w:val="15"/>
-                      <w:szCs w:val="15"/>
-                    </w:rPr>
-                    <w:t xml:space="preserve">statt</w:t>
-                  </w:r>
-                </w:p>
-                <w:p>
-                  <w:pPr>
-                    <w:spacing w:after="0" w:before="0"/>
-                  </w:pPr>
-                  <w:r>
-                    <w:rPr>
-                      <w:rFonts w:ascii="Cambria" w:cs="Cambria" w:eastAsia="Cambria" w:hAnsi="Cambria"/>
-                      <w:i/>
-                      <w:iCs/>
-                      <w:color w:val="000000"/>
-                      <w:sz w:val="19"/>
-                      <w:szCs w:val="19"/>
-                    </w:rPr>
-                    <w:t xml:space="preserve">Toll. Wirklich super. Danke auch.</w:t>
-                  </w:r>
-                </w:p>
-              </w:tc>
-            </w:tr>
-            <w:tr>
-              <w:trPr>
-                <w:cantSplit/>
-              </w:trPr>
-              <w:tc>
-                <w:tcPr>
-                  <w:tcW w:type="dxa" w:w="5003"/>
-                  <w:tcBorders>
-                    <w:top w:val="single" w:color="FFFFFF" w:sz="12"/>
-                    <w:left w:val="single" w:color="FFFFFF" w:sz="12"/>
-                    <w:bottom w:val="single" w:color="FFFFFF" w:sz="12"/>
-                    <w:right w:val="single" w:color="FFFFFF" w:sz="12"/>
-                  </w:tcBorders>
-                  <w:shd w:fill="EAF0FA" w:color="auto" w:val="clear"/>
-                  <w:tcMar>
-                    <w:top w:type="dxa" w:w="60"/>
-                    <w:left w:type="dxa" w:w="100"/>
-                    <w:bottom w:type="dxa" w:w="60"/>
-                    <w:right w:type="dxa" w:w="100"/>
-                  </w:tcMar>
-                  <w:vAlign w:val="top"/>
-                </w:tcPr>
-                <w:p>
-                  <w:pPr>
-                    <w:spacing w:after="0" w:before="0"/>
-                  </w:pPr>
-                  <w:r>
-                    <w:rPr>
-                      <w:rFonts w:ascii="Calibri" w:cs="Calibri" w:eastAsia="Calibri" w:hAnsi="Calibri"/>
-                      <w:b/>
-                      <w:bCs/>
-                      <w:color w:val="8E5BB5"/>
-                      <w:sz w:val="15"/>
-                      <w:szCs w:val="15"/>
-                    </w:rPr>
-                    <w:t xml:space="preserve">besser</w:t>
-                  </w:r>
-                </w:p>
-                <w:p>
-                  <w:pPr>
-                    <w:spacing w:after="0" w:before="0"/>
-                  </w:pPr>
-                  <w:r>
-                    <w:rPr>
-                      <w:rFonts w:ascii="Cambria" w:cs="Cambria" w:eastAsia="Cambria" w:hAnsi="Cambria"/>
-                      <w:i/>
-                      <w:iCs/>
-                      <w:color w:val="000000"/>
-                      <w:sz w:val="19"/>
-                      <w:szCs w:val="19"/>
-                    </w:rPr>
-                    <w:t xml:space="preserve">Stopp, wir zicken uns gerade nur an. Eigentlich wollen wir doch beide, dass es in der WG entspannt ist – lass uns einen Plan machen.</w:t>
-                  </w:r>
-                </w:p>
-              </w:tc>
-            </w:tr>
-          </w:tbl>
-          <w:p/>
+                <w:sz w:val="20"/>
+                <w:szCs w:val="20"/>
+              </w:rPr>
+              <w:t xml:space="preserve">   →   Zeile 7</w:t>
+            </w:r>
+          </w:p>
         </w:tc>
       </w:tr>
     </w:tbl>
     <w:p>
       <w:pPr>
-        <w:keepNext/>
-        <w:spacing w:after="0" w:before="40"/>
+        <w:spacing w:after="40" w:before="80"/>
       </w:pPr>
       <w:r>
         <w:rPr>
@@ -5419,29 +4789,46 @@
           <w:sz w:val="20"/>
           <w:szCs w:val="20"/>
         </w:rPr>
-        <w:t xml:space="preserve">2  Anwenden · </w:t>
-      </w:r>
-      <w:r>
-        <w:rPr>
-          <w:rFonts w:ascii="Calibri" w:cs="Calibri" w:eastAsia="Calibri" w:hAnsi="Calibri"/>
+        <w:t xml:space="preserve">1  Ansehen </w:t>
+      </w:r>
+      <w:r>
+        <w:rPr>
+          <w:rFonts w:ascii="Calibri" w:cs="Calibri" w:eastAsia="Calibri" w:hAnsi="Calibri"/>
+          <w:color w:val="5B6B8C"/>
+          <w:sz w:val="19"/>
+          <w:szCs w:val="19"/>
+        </w:rPr>
+        <w:t xml:space="preserve">(gemeinsam an der Folie) · Ergänze die Formel:</w:t>
+      </w:r>
+    </w:p>
+    <w:p>
+      <w:pPr>
+        <w:spacing w:after="40" w:before="0"/>
+      </w:pPr>
+      <w:r>
+        <w:rPr>
+          <w:rFonts w:ascii="Cambria" w:cs="Cambria" w:eastAsia="Cambria" w:hAnsi="Cambria"/>
           <w:b/>
           <w:bCs/>
-          <w:color w:val="000000"/>
-          <w:sz w:val="20"/>
-          <w:szCs w:val="20"/>
-        </w:rPr>
-        <w:t xml:space="preserve">Schreibe Zeile 7 (Lena) als Metakommunikation: </w:t>
-      </w:r>
-      <w:r>
-        <w:rPr>
-          <w:rFonts w:ascii="Cambria" w:cs="Cambria" w:eastAsia="Cambria" w:hAnsi="Cambria"/>
-          <w:i/>
-          <w:iCs/>
-          <w:color w:val="000000"/>
-          <w:sz w:val="20"/>
-          <w:szCs w:val="20"/>
-        </w:rPr>
-        <w:t xml:space="preserve">„Super. Genau das hab ich von dir erwartet.“</w:t>
+          <w:color w:val="1E2761"/>
+          <w:sz w:val="24"/>
+          <w:szCs w:val="24"/>
+        </w:rPr>
+        <w:t xml:space="preserve">Stopp – ich merke, wir __________. Eigentlich wollen wir beide __________.</w:t>
+      </w:r>
+    </w:p>
+    <w:p>
+      <w:pPr>
+        <w:spacing w:after="0" w:before="0"/>
+      </w:pPr>
+      <w:r>
+        <w:rPr>
+          <w:rFonts w:ascii="Calibri" w:cs="Calibri" w:eastAsia="Calibri" w:hAnsi="Calibri"/>
+          <w:color w:val="5B6B8C"/>
+          <w:sz w:val="19"/>
+          <w:szCs w:val="19"/>
+        </w:rPr>
+        <w:t xml:space="preserve">Das macht den besseren Satz aus:</w:t>
       </w:r>
     </w:p>
     <w:tbl>
@@ -5497,10 +4884,91 @@
           </w:p>
         </w:tc>
       </w:tr>
+    </w:tbl>
+    <w:p>
+      <w:pPr>
+        <w:keepNext/>
+        <w:spacing w:after="0" w:before="100"/>
+      </w:pPr>
+      <w:r>
+        <w:rPr>
+          <w:rFonts w:ascii="Calibri" w:cs="Calibri" w:eastAsia="Calibri" w:hAnsi="Calibri"/>
+          <w:b/>
+          <w:bCs/>
+          <w:color w:val="8E5BB5"/>
+          <w:sz w:val="20"/>
+          <w:szCs w:val="20"/>
+        </w:rPr>
+        <w:t xml:space="preserve">2  Umformulieren </w:t>
+      </w:r>
+      <w:r>
+        <w:rPr>
+          <w:rFonts w:ascii="Calibri" w:cs="Calibri" w:eastAsia="Calibri" w:hAnsi="Calibri"/>
+          <w:color w:val="5B6B8C"/>
+          <w:sz w:val="19"/>
+          <w:szCs w:val="19"/>
+        </w:rPr>
+        <w:t xml:space="preserve">(allein, 2 Min.) · </w:t>
+      </w:r>
+      <w:r>
+        <w:rPr>
+          <w:rFonts w:ascii="Calibri" w:cs="Calibri" w:eastAsia="Calibri" w:hAnsi="Calibri"/>
+          <w:b/>
+          <w:bCs/>
+          <w:color w:val="000000"/>
+          <w:sz w:val="20"/>
+          <w:szCs w:val="20"/>
+        </w:rPr>
+        <w:t xml:space="preserve">Lena sagt stattdessen: </w:t>
+      </w:r>
+      <w:r>
+        <w:rPr>
+          <w:rFonts w:ascii="Cambria" w:cs="Cambria" w:eastAsia="Cambria" w:hAnsi="Cambria"/>
+          <w:i/>
+          <w:iCs/>
+          <w:color w:val="000000"/>
+          <w:sz w:val="20"/>
+          <w:szCs w:val="20"/>
+        </w:rPr>
+        <w:t xml:space="preserve">„Super. Genau das hab ich von dir erwartet.“</w:t>
+      </w:r>
+    </w:p>
+    <w:p>
+      <w:pPr>
+        <w:keepNext/>
+        <w:spacing w:after="0" w:before="0"/>
+      </w:pPr>
+      <w:r>
+        <w:rPr>
+          <w:rFonts w:ascii="Calibri" w:cs="Calibri" w:eastAsia="Calibri" w:hAnsi="Calibri"/>
+          <w:i/>
+          <w:iCs/>
+          <w:color w:val="5B6B8C"/>
+          <w:sz w:val="17"/>
+          <w:szCs w:val="17"/>
+        </w:rPr>
+        <w:t xml:space="preserve">Hilfe, wenn du nicht weiterkommst: „Moment, ich merke, wir … Eigentlich wollen wir doch …“</w:t>
+      </w:r>
+    </w:p>
+    <w:tbl>
+      <w:tblPr>
+        <w:tblW w:type="dxa" w:w="10206"/>
+        <w:tblBorders>
+          <w:top w:val="single" w:color="auto" w:sz="4"/>
+          <w:left w:val="single" w:color="auto" w:sz="4"/>
+          <w:bottom w:val="single" w:color="auto" w:sz="4"/>
+          <w:right w:val="single" w:color="auto" w:sz="4"/>
+          <w:insideH w:val="single" w:color="auto" w:sz="4"/>
+          <w:insideV w:val="single" w:color="auto" w:sz="4"/>
+        </w:tblBorders>
+      </w:tblPr>
+      <w:tblGrid>
+        <w:gridCol w:w="10206"/>
+      </w:tblGrid>
       <w:tr>
         <w:trPr>
           <w:cantSplit/>
-          <w:trHeight w:val="440" w:hRule="atLeast"/>
+          <w:trHeight w:val="480" w:hRule="atLeast"/>
         </w:trPr>
         <w:tc>
           <w:tcPr>
@@ -5538,7 +5006,7 @@
       <w:tr>
         <w:trPr>
           <w:cantSplit/>
-          <w:trHeight w:val="440" w:hRule="atLeast"/>
+          <w:trHeight w:val="480" w:hRule="atLeast"/>
         </w:trPr>
         <w:tc>
           <w:tcPr>
@@ -5576,7 +5044,7 @@
       <w:tr>
         <w:trPr>
           <w:cantSplit/>
-          <w:trHeight w:val="440" w:hRule="atLeast"/>
+          <w:trHeight w:val="480" w:hRule="atLeast"/>
         </w:trPr>
         <w:tc>
           <w:tcPr>
@@ -5611,10 +5079,48 @@
           </w:p>
         </w:tc>
       </w:tr>
+      <w:tr>
+        <w:trPr>
+          <w:cantSplit/>
+          <w:trHeight w:val="480" w:hRule="atLeast"/>
+        </w:trPr>
+        <w:tc>
+          <w:tcPr>
+            <w:tcW w:type="dxa" w:w="10206"/>
+            <w:tcBorders>
+              <w:top w:val="none" w:color="FFFFFF" w:sz="0"/>
+              <w:left w:val="none" w:color="FFFFFF" w:sz="0"/>
+              <w:bottom w:val="single" w:color="9AA6C4" w:sz="6"/>
+              <w:right w:val="none" w:color="FFFFFF" w:sz="0"/>
+            </w:tcBorders>
+            <w:tcMar>
+              <w:top w:type="dxa" w:w="60"/>
+              <w:left w:type="dxa" w:w="0"/>
+              <w:bottom w:type="dxa" w:w="60"/>
+              <w:right w:type="dxa" w:w="0"/>
+            </w:tcMar>
+            <w:vAlign w:val="bottom"/>
+          </w:tcPr>
+          <w:p>
+            <w:pPr>
+              <w:spacing w:after="0" w:before="0"/>
+            </w:pPr>
+            <w:r>
+              <w:rPr>
+                <w:rFonts w:ascii="Calibri" w:cs="Calibri" w:eastAsia="Calibri" w:hAnsi="Calibri"/>
+                <w:color w:val="000000"/>
+                <w:sz w:val="22"/>
+                <w:szCs w:val="22"/>
+              </w:rPr>
+              <w:t xml:space="preserve"/>
+            </w:r>
+          </w:p>
+        </w:tc>
+      </w:tr>
     </w:tbl>
     <w:p>
       <w:pPr>
-        <w:spacing w:after="0" w:before="60"/>
+        <w:spacing w:after="20" w:before="60"/>
       </w:pPr>
       <w:r>
         <w:rPr>
@@ -5625,7 +5131,16 @@
           <w:sz w:val="19"/>
           <w:szCs w:val="19"/>
         </w:rPr>
-        <w:t xml:space="preserve">3  Prüfen   </w:t>
+        <w:t xml:space="preserve">3  Prüfen </w:t>
+      </w:r>
+      <w:r>
+        <w:rPr>
+          <w:rFonts w:ascii="Calibri" w:cs="Calibri" w:eastAsia="Calibri" w:hAnsi="Calibri"/>
+          <w:color w:val="5B6B8C"/>
+          <w:sz w:val="18"/>
+          <w:szCs w:val="18"/>
+        </w:rPr>
+        <w:t xml:space="preserve">(Daumenprobe)   </w:t>
       </w:r>
       <w:r>
         <w:rPr>
@@ -5648,7 +5163,32 @@
     </w:p>
     <w:p>
       <w:pPr>
-        <w:spacing w:after="120" w:before="0"/>
+        <w:spacing w:after="0" w:before="0"/>
+      </w:pPr>
+      <w:r>
+        <w:rPr>
+          <w:rFonts w:ascii="Calibri" w:cs="Calibri" w:eastAsia="Calibri" w:hAnsi="Calibri"/>
+          <w:b/>
+          <w:bCs/>
+          <w:color w:val="D9534F"/>
+          <w:sz w:val="18"/>
+          <w:szCs w:val="18"/>
+        </w:rPr>
+        <w:t xml:space="preserve">Stolperfalle: </w:t>
+      </w:r>
+      <w:r>
+        <w:rPr>
+          <w:rFonts w:ascii="Calibri" w:cs="Calibri" w:eastAsia="Calibri" w:hAnsi="Calibri"/>
+          <w:color w:val="000000"/>
+          <w:sz w:val="18"/>
+          <w:szCs w:val="18"/>
+        </w:rPr>
+        <w:t xml:space="preserve">kein neuer Vorwurf („Du redest immer so gemein …“).</w:t>
+      </w:r>
+    </w:p>
+    <w:p>
+      <w:pPr>
+        <w:spacing w:after="160" w:before="0"/>
       </w:pPr>
       <w:r>
         <w:rPr>
@@ -5908,7 +5448,7 @@
           <w:sz w:val="22"/>
           <w:szCs w:val="22"/>
         </w:rPr>
-        <w:t xml:space="preserve"> aus – am besten eine, die ihr so oder ähnlich schon erlebt habt. Euer Technik-Training (S. 3–4) hilft bei Version B.</w:t>
+        <w:t xml:space="preserve"> aus – am besten eine, die ihr so oder ähnlich schon erlebt habt. Euer Werkzeugkasten (S. 3–4) hilft bei Version B.</w:t>
       </w:r>
     </w:p>
     <w:p>

</xml_diff>

<commit_message>
Deutsch 11: M1-Umschreiben pro Technik als eigener, klar markierter Schritt
Co-Authored-By: Claude Opus 5.5 <noreply@anthropic.com>
Claude-Session: https://claude.ai/code/session_01Kzh1oWiqhC6W8oSNq8mKnj
</commit_message>
<xml_diff>
--- a/Deutsch_11/Kommunikationsstoerungen_loesen/Arbeitsblatt_Kommunikationsstoerungen_loesen.docx
+++ b/Deutsch_11/Kommunikationsstoerungen_loesen/Arbeitsblatt_Kommunikationsstoerungen_loesen.docx
@@ -3157,7 +3157,7 @@
           <w:sz w:val="22"/>
           <w:szCs w:val="22"/>
         </w:rPr>
-        <w:t xml:space="preserve">2 Umformulieren</w:t>
+        <w:t xml:space="preserve">2 ✍ M1 umschreiben</w:t>
       </w:r>
       <w:r>
         <w:rPr>
@@ -3379,7 +3379,271 @@
     <w:p>
       <w:pPr>
         <w:keepNext/>
-        <w:spacing w:after="0" w:before="100"/>
+        <w:spacing w:after="40" w:before="120"/>
+      </w:pPr>
+      <w:r>
+        <w:rPr>
+          <w:rFonts w:ascii="Calibri" w:cs="Calibri" w:eastAsia="Calibri" w:hAnsi="Calibri"/>
+          <w:b/>
+          <w:bCs/>
+          <w:color w:val="3F7CC4"/>
+          <w:sz w:val="22"/>
+          <w:szCs w:val="22"/>
+        </w:rPr>
+        <w:t xml:space="preserve">2  ✍ M1 umschreiben </w:t>
+      </w:r>
+      <w:r>
+        <w:rPr>
+          <w:rFonts w:ascii="Calibri" w:cs="Calibri" w:eastAsia="Calibri" w:hAnsi="Calibri"/>
+          <w:color w:val="5B6B8C"/>
+          <w:sz w:val="19"/>
+          <w:szCs w:val="19"/>
+        </w:rPr>
+        <w:t xml:space="preserve">(allein, 2 Min.)</w:t>
+      </w:r>
+    </w:p>
+    <w:tbl>
+      <w:tblPr>
+        <w:tblW w:type="dxa" w:w="10206"/>
+        <w:tblBorders>
+          <w:top w:val="single" w:color="auto" w:sz="4"/>
+          <w:left w:val="single" w:color="auto" w:sz="4"/>
+          <w:bottom w:val="single" w:color="auto" w:sz="4"/>
+          <w:right w:val="single" w:color="auto" w:sz="4"/>
+          <w:insideH w:val="single" w:color="auto" w:sz="4"/>
+          <w:insideV w:val="single" w:color="auto" w:sz="4"/>
+        </w:tblBorders>
+      </w:tblPr>
+      <w:tblGrid>
+        <w:gridCol w:w="700"/>
+        <w:gridCol w:w="1100"/>
+        <w:gridCol w:w="8406"/>
+      </w:tblGrid>
+      <w:tr>
+        <w:trPr>
+          <w:cantSplit/>
+        </w:trPr>
+        <w:tc>
+          <w:tcPr>
+            <w:tcW w:type="dxa" w:w="700"/>
+            <w:tcBorders>
+              <w:top w:val="single" w:color="B9C6E8" w:sz="6"/>
+              <w:left w:val="single" w:color="B9C6E8" w:sz="6"/>
+              <w:bottom w:val="single" w:color="B9C6E8" w:sz="6"/>
+              <w:right w:val="single" w:color="B9C6E8" w:sz="6"/>
+            </w:tcBorders>
+            <w:shd w:fill="F4F7FD" w:color="auto" w:val="clear"/>
+            <w:tcMar>
+              <w:top w:type="dxa" w:w="30"/>
+              <w:left w:type="dxa" w:w="100"/>
+              <w:bottom w:type="dxa" w:w="30"/>
+              <w:right w:type="dxa" w:w="100"/>
+            </w:tcMar>
+            <w:vAlign w:val="center"/>
+          </w:tcPr>
+          <w:p>
+            <w:pPr>
+              <w:spacing w:after="0" w:before="0"/>
+              <w:jc w:val="center"/>
+            </w:pPr>
+            <w:r>
+              <w:rPr>
+                <w:rFonts w:ascii="Calibri" w:cs="Calibri" w:eastAsia="Calibri" w:hAnsi="Calibri"/>
+                <w:b/>
+                <w:bCs/>
+                <w:color w:val="5B6B8C"/>
+                <w:sz w:val="18"/>
+                <w:szCs w:val="18"/>
+              </w:rPr>
+              <w:t xml:space="preserve">2</w:t>
+            </w:r>
+          </w:p>
+        </w:tc>
+        <w:tc>
+          <w:tcPr>
+            <w:tcW w:type="dxa" w:w="1100"/>
+            <w:tcBorders>
+              <w:top w:val="single" w:color="B9C6E8" w:sz="6"/>
+              <w:left w:val="single" w:color="B9C6E8" w:sz="6"/>
+              <w:bottom w:val="single" w:color="B9C6E8" w:sz="6"/>
+              <w:right w:val="single" w:color="B9C6E8" w:sz="6"/>
+            </w:tcBorders>
+            <w:shd w:fill="F4F7FD" w:color="auto" w:val="clear"/>
+            <w:tcMar>
+              <w:top w:type="dxa" w:w="30"/>
+              <w:left w:type="dxa" w:w="100"/>
+              <w:bottom w:type="dxa" w:w="30"/>
+              <w:right w:type="dxa" w:w="100"/>
+            </w:tcMar>
+            <w:vAlign w:val="center"/>
+          </w:tcPr>
+          <w:p>
+            <w:pPr>
+              <w:spacing w:after="0" w:before="0"/>
+            </w:pPr>
+            <w:r>
+              <w:rPr>
+                <w:rFonts w:ascii="Calibri" w:cs="Calibri" w:eastAsia="Calibri" w:hAnsi="Calibri"/>
+                <w:b/>
+                <w:bCs/>
+                <w:color w:val="5B6B8C"/>
+                <w:sz w:val="18"/>
+                <w:szCs w:val="18"/>
+              </w:rPr>
+              <w:t xml:space="preserve">Tom</w:t>
+            </w:r>
+          </w:p>
+        </w:tc>
+        <w:tc>
+          <w:tcPr>
+            <w:tcW w:type="dxa" w:w="8406"/>
+            <w:tcBorders>
+              <w:top w:val="single" w:color="B9C6E8" w:sz="6"/>
+              <w:left w:val="single" w:color="B9C6E8" w:sz="6"/>
+              <w:bottom w:val="single" w:color="B9C6E8" w:sz="6"/>
+              <w:right w:val="single" w:color="B9C6E8" w:sz="6"/>
+            </w:tcBorders>
+            <w:shd w:fill="F4F7FD" w:color="auto" w:val="clear"/>
+            <w:tcMar>
+              <w:top w:type="dxa" w:w="30"/>
+              <w:left w:type="dxa" w:w="100"/>
+              <w:bottom w:type="dxa" w:w="30"/>
+              <w:right w:type="dxa" w:w="100"/>
+            </w:tcMar>
+            <w:vAlign w:val="center"/>
+          </w:tcPr>
+          <w:p>
+            <w:pPr>
+              <w:spacing w:after="0" w:before="0"/>
+            </w:pPr>
+            <w:r>
+              <w:rPr>
+                <w:rFonts w:ascii="Cambria" w:cs="Cambria" w:eastAsia="Cambria" w:hAnsi="Cambria"/>
+                <w:color w:val="5B6B8C"/>
+                <w:sz w:val="19"/>
+                <w:szCs w:val="19"/>
+              </w:rPr>
+              <w:t xml:space="preserve">Fast. Den Rest mach ich heute Abend.</w:t>
+            </w:r>
+          </w:p>
+        </w:tc>
+      </w:tr>
+      <w:tr>
+        <w:trPr>
+          <w:cantSplit/>
+        </w:trPr>
+        <w:tc>
+          <w:tcPr>
+            <w:tcW w:type="dxa" w:w="700"/>
+            <w:tcBorders>
+              <w:top w:val="single" w:color="B9C6E8" w:sz="6"/>
+              <w:left w:val="single" w:color="B9C6E8" w:sz="6"/>
+              <w:bottom w:val="single" w:color="B9C6E8" w:sz="6"/>
+              <w:right w:val="single" w:color="B9C6E8" w:sz="6"/>
+            </w:tcBorders>
+            <w:shd w:fill="FBECEB" w:color="auto" w:val="clear"/>
+            <w:tcMar>
+              <w:top w:type="dxa" w:w="40"/>
+              <w:left w:type="dxa" w:w="100"/>
+              <w:bottom w:type="dxa" w:w="40"/>
+              <w:right w:type="dxa" w:w="100"/>
+            </w:tcMar>
+            <w:vAlign w:val="center"/>
+          </w:tcPr>
+          <w:p>
+            <w:pPr>
+              <w:spacing w:after="0" w:before="0"/>
+              <w:jc w:val="center"/>
+            </w:pPr>
+            <w:r>
+              <w:rPr>
+                <w:rFonts w:ascii="Calibri" w:cs="Calibri" w:eastAsia="Calibri" w:hAnsi="Calibri"/>
+                <w:b/>
+                <w:bCs/>
+                <w:color w:val="D9534F"/>
+                <w:sz w:val="20"/>
+                <w:szCs w:val="20"/>
+              </w:rPr>
+              <w:t xml:space="preserve">3 ↯</w:t>
+            </w:r>
+          </w:p>
+        </w:tc>
+        <w:tc>
+          <w:tcPr>
+            <w:tcW w:type="dxa" w:w="1100"/>
+            <w:tcBorders>
+              <w:top w:val="single" w:color="B9C6E8" w:sz="6"/>
+              <w:left w:val="single" w:color="B9C6E8" w:sz="6"/>
+              <w:bottom w:val="single" w:color="B9C6E8" w:sz="6"/>
+              <w:right w:val="single" w:color="B9C6E8" w:sz="6"/>
+            </w:tcBorders>
+            <w:shd w:fill="FBECEB" w:color="auto" w:val="clear"/>
+            <w:tcMar>
+              <w:top w:type="dxa" w:w="40"/>
+              <w:left w:type="dxa" w:w="100"/>
+              <w:bottom w:type="dxa" w:w="40"/>
+              <w:right w:type="dxa" w:w="100"/>
+            </w:tcMar>
+            <w:vAlign w:val="center"/>
+          </w:tcPr>
+          <w:p>
+            <w:pPr>
+              <w:spacing w:after="0" w:before="0"/>
+            </w:pPr>
+            <w:r>
+              <w:rPr>
+                <w:rFonts w:ascii="Calibri" w:cs="Calibri" w:eastAsia="Calibri" w:hAnsi="Calibri"/>
+                <w:b/>
+                <w:bCs/>
+                <w:color w:val="D9534F"/>
+                <w:sz w:val="20"/>
+                <w:szCs w:val="20"/>
+              </w:rPr>
+              <w:t xml:space="preserve">Lena</w:t>
+            </w:r>
+          </w:p>
+        </w:tc>
+        <w:tc>
+          <w:tcPr>
+            <w:tcW w:type="dxa" w:w="8406"/>
+            <w:tcBorders>
+              <w:top w:val="single" w:color="B9C6E8" w:sz="6"/>
+              <w:left w:val="single" w:color="B9C6E8" w:sz="6"/>
+              <w:bottom w:val="single" w:color="B9C6E8" w:sz="6"/>
+              <w:right w:val="single" w:color="B9C6E8" w:sz="6"/>
+            </w:tcBorders>
+            <w:shd w:fill="FBECEB" w:color="auto" w:val="clear"/>
+            <w:tcMar>
+              <w:top w:type="dxa" w:w="40"/>
+              <w:left w:type="dxa" w:w="100"/>
+              <w:bottom w:type="dxa" w:w="40"/>
+              <w:right w:type="dxa" w:w="100"/>
+            </w:tcMar>
+            <w:vAlign w:val="center"/>
+          </w:tcPr>
+          <w:p>
+            <w:pPr>
+              <w:spacing w:after="0" w:before="0"/>
+            </w:pPr>
+            <w:r>
+              <w:rPr>
+                <w:rFonts w:ascii="Cambria" w:cs="Cambria" w:eastAsia="Cambria" w:hAnsi="Cambria"/>
+                <w:b/>
+                <w:bCs/>
+                <w:color w:val="000000"/>
+                <w:sz w:val="20"/>
+                <w:szCs w:val="20"/>
+              </w:rPr>
+              <w:t xml:space="preserve">Heute Abend? Du hattest eine ganze Woche Zeit.</w:t>
+            </w:r>
+          </w:p>
+        </w:tc>
+      </w:tr>
+    </w:tbl>
+    <w:p>
+      <w:pPr>
+        <w:keepNext/>
+        <w:spacing w:after="0" w:before="80"/>
       </w:pPr>
       <w:r>
         <w:rPr>
@@ -3390,45 +3654,8 @@
           <w:sz w:val="20"/>
           <w:szCs w:val="20"/>
         </w:rPr>
-        <w:t xml:space="preserve">2  Umformulieren </w:t>
-      </w:r>
-      <w:r>
-        <w:rPr>
-          <w:rFonts w:ascii="Calibri" w:cs="Calibri" w:eastAsia="Calibri" w:hAnsi="Calibri"/>
-          <w:color w:val="5B6B8C"/>
-          <w:sz w:val="19"/>
-          <w:szCs w:val="19"/>
-        </w:rPr>
-        <w:t xml:space="preserve">(allein, 2 Min.) · </w:t>
-      </w:r>
-      <w:r>
-        <w:rPr>
-          <w:rFonts w:ascii="Calibri" w:cs="Calibri" w:eastAsia="Calibri" w:hAnsi="Calibri"/>
-          <w:b/>
-          <w:bCs/>
-          <w:color w:val="000000"/>
-          <w:sz w:val="20"/>
-          <w:szCs w:val="20"/>
-        </w:rPr>
-        <w:t xml:space="preserve">Lena sagt stattdessen: </w:t>
-      </w:r>
-      <w:r>
-        <w:rPr>
-          <w:rFonts w:ascii="Cambria" w:cs="Cambria" w:eastAsia="Cambria" w:hAnsi="Cambria"/>
-          <w:i/>
-          <w:iCs/>
-          <w:color w:val="000000"/>
-          <w:sz w:val="20"/>
-          <w:szCs w:val="20"/>
-        </w:rPr>
-        <w:t xml:space="preserve">„Heute Abend? Du hattest eine ganze Woche Zeit.“</w:t>
-      </w:r>
-    </w:p>
-    <w:p>
-      <w:pPr>
-        <w:keepNext/>
-        <w:spacing w:after="0" w:before="0"/>
-      </w:pPr>
+        <w:t xml:space="preserve">Lena sagt stattdessen:</w:t>
+      </w:r>
       <w:r>
         <w:rPr>
           <w:rFonts w:ascii="Calibri" w:cs="Calibri" w:eastAsia="Calibri" w:hAnsi="Calibri"/>
@@ -3438,7 +3665,7 @@
           <w:sz w:val="17"/>
           <w:szCs w:val="17"/>
         </w:rPr>
-        <w:t xml:space="preserve">Hilfe, wenn du nicht weiterkommst: „Heute Abend? Ehrlich gesagt werde ich nervös, wenn …, weil …“</w:t>
+        <w:t xml:space="preserve">   Hilfe: „Heute Abend? Ehrlich gesagt werde ich nervös, wenn …, weil …“</w:t>
       </w:r>
     </w:p>
     <w:tbl>
@@ -3881,7 +4108,271 @@
     <w:p>
       <w:pPr>
         <w:keepNext/>
-        <w:spacing w:after="0" w:before="100"/>
+        <w:spacing w:after="40" w:before="120"/>
+      </w:pPr>
+      <w:r>
+        <w:rPr>
+          <w:rFonts w:ascii="Calibri" w:cs="Calibri" w:eastAsia="Calibri" w:hAnsi="Calibri"/>
+          <w:b/>
+          <w:bCs/>
+          <w:color w:val="2E9E6B"/>
+          <w:sz w:val="22"/>
+          <w:szCs w:val="22"/>
+        </w:rPr>
+        <w:t xml:space="preserve">2  ✍ M1 umschreiben </w:t>
+      </w:r>
+      <w:r>
+        <w:rPr>
+          <w:rFonts w:ascii="Calibri" w:cs="Calibri" w:eastAsia="Calibri" w:hAnsi="Calibri"/>
+          <w:color w:val="5B6B8C"/>
+          <w:sz w:val="19"/>
+          <w:szCs w:val="19"/>
+        </w:rPr>
+        <w:t xml:space="preserve">(allein, 2 Min.)</w:t>
+      </w:r>
+    </w:p>
+    <w:tbl>
+      <w:tblPr>
+        <w:tblW w:type="dxa" w:w="10206"/>
+        <w:tblBorders>
+          <w:top w:val="single" w:color="auto" w:sz="4"/>
+          <w:left w:val="single" w:color="auto" w:sz="4"/>
+          <w:bottom w:val="single" w:color="auto" w:sz="4"/>
+          <w:right w:val="single" w:color="auto" w:sz="4"/>
+          <w:insideH w:val="single" w:color="auto" w:sz="4"/>
+          <w:insideV w:val="single" w:color="auto" w:sz="4"/>
+        </w:tblBorders>
+      </w:tblPr>
+      <w:tblGrid>
+        <w:gridCol w:w="700"/>
+        <w:gridCol w:w="1100"/>
+        <w:gridCol w:w="8406"/>
+      </w:tblGrid>
+      <w:tr>
+        <w:trPr>
+          <w:cantSplit/>
+        </w:trPr>
+        <w:tc>
+          <w:tcPr>
+            <w:tcW w:type="dxa" w:w="700"/>
+            <w:tcBorders>
+              <w:top w:val="single" w:color="B9C6E8" w:sz="6"/>
+              <w:left w:val="single" w:color="B9C6E8" w:sz="6"/>
+              <w:bottom w:val="single" w:color="B9C6E8" w:sz="6"/>
+              <w:right w:val="single" w:color="B9C6E8" w:sz="6"/>
+            </w:tcBorders>
+            <w:shd w:fill="F4F7FD" w:color="auto" w:val="clear"/>
+            <w:tcMar>
+              <w:top w:type="dxa" w:w="30"/>
+              <w:left w:type="dxa" w:w="100"/>
+              <w:bottom w:type="dxa" w:w="30"/>
+              <w:right w:type="dxa" w:w="100"/>
+            </w:tcMar>
+            <w:vAlign w:val="center"/>
+          </w:tcPr>
+          <w:p>
+            <w:pPr>
+              <w:spacing w:after="0" w:before="0"/>
+              <w:jc w:val="center"/>
+            </w:pPr>
+            <w:r>
+              <w:rPr>
+                <w:rFonts w:ascii="Calibri" w:cs="Calibri" w:eastAsia="Calibri" w:hAnsi="Calibri"/>
+                <w:b/>
+                <w:bCs/>
+                <w:color w:val="5B6B8C"/>
+                <w:sz w:val="18"/>
+                <w:szCs w:val="18"/>
+              </w:rPr>
+              <w:t xml:space="preserve">3</w:t>
+            </w:r>
+          </w:p>
+        </w:tc>
+        <w:tc>
+          <w:tcPr>
+            <w:tcW w:type="dxa" w:w="1100"/>
+            <w:tcBorders>
+              <w:top w:val="single" w:color="B9C6E8" w:sz="6"/>
+              <w:left w:val="single" w:color="B9C6E8" w:sz="6"/>
+              <w:bottom w:val="single" w:color="B9C6E8" w:sz="6"/>
+              <w:right w:val="single" w:color="B9C6E8" w:sz="6"/>
+            </w:tcBorders>
+            <w:shd w:fill="F4F7FD" w:color="auto" w:val="clear"/>
+            <w:tcMar>
+              <w:top w:type="dxa" w:w="30"/>
+              <w:left w:type="dxa" w:w="100"/>
+              <w:bottom w:type="dxa" w:w="30"/>
+              <w:right w:type="dxa" w:w="100"/>
+            </w:tcMar>
+            <w:vAlign w:val="center"/>
+          </w:tcPr>
+          <w:p>
+            <w:pPr>
+              <w:spacing w:after="0" w:before="0"/>
+            </w:pPr>
+            <w:r>
+              <w:rPr>
+                <w:rFonts w:ascii="Calibri" w:cs="Calibri" w:eastAsia="Calibri" w:hAnsi="Calibri"/>
+                <w:b/>
+                <w:bCs/>
+                <w:color w:val="5B6B8C"/>
+                <w:sz w:val="18"/>
+                <w:szCs w:val="18"/>
+              </w:rPr>
+              <w:t xml:space="preserve">Lena</w:t>
+            </w:r>
+          </w:p>
+        </w:tc>
+        <w:tc>
+          <w:tcPr>
+            <w:tcW w:type="dxa" w:w="8406"/>
+            <w:tcBorders>
+              <w:top w:val="single" w:color="B9C6E8" w:sz="6"/>
+              <w:left w:val="single" w:color="B9C6E8" w:sz="6"/>
+              <w:bottom w:val="single" w:color="B9C6E8" w:sz="6"/>
+              <w:right w:val="single" w:color="B9C6E8" w:sz="6"/>
+            </w:tcBorders>
+            <w:shd w:fill="F4F7FD" w:color="auto" w:val="clear"/>
+            <w:tcMar>
+              <w:top w:type="dxa" w:w="30"/>
+              <w:left w:type="dxa" w:w="100"/>
+              <w:bottom w:type="dxa" w:w="30"/>
+              <w:right w:type="dxa" w:w="100"/>
+            </w:tcMar>
+            <w:vAlign w:val="center"/>
+          </w:tcPr>
+          <w:p>
+            <w:pPr>
+              <w:spacing w:after="0" w:before="0"/>
+            </w:pPr>
+            <w:r>
+              <w:rPr>
+                <w:rFonts w:ascii="Cambria" w:cs="Cambria" w:eastAsia="Cambria" w:hAnsi="Cambria"/>
+                <w:color w:val="5B6B8C"/>
+                <w:sz w:val="19"/>
+                <w:szCs w:val="19"/>
+              </w:rPr>
+              <w:t xml:space="preserve">Heute Abend? Du hattest eine ganze Woche Zeit.</w:t>
+            </w:r>
+          </w:p>
+        </w:tc>
+      </w:tr>
+      <w:tr>
+        <w:trPr>
+          <w:cantSplit/>
+        </w:trPr>
+        <w:tc>
+          <w:tcPr>
+            <w:tcW w:type="dxa" w:w="700"/>
+            <w:tcBorders>
+              <w:top w:val="single" w:color="B9C6E8" w:sz="6"/>
+              <w:left w:val="single" w:color="B9C6E8" w:sz="6"/>
+              <w:bottom w:val="single" w:color="B9C6E8" w:sz="6"/>
+              <w:right w:val="single" w:color="B9C6E8" w:sz="6"/>
+            </w:tcBorders>
+            <w:shd w:fill="FBECEB" w:color="auto" w:val="clear"/>
+            <w:tcMar>
+              <w:top w:type="dxa" w:w="40"/>
+              <w:left w:type="dxa" w:w="100"/>
+              <w:bottom w:type="dxa" w:w="40"/>
+              <w:right w:type="dxa" w:w="100"/>
+            </w:tcMar>
+            <w:vAlign w:val="center"/>
+          </w:tcPr>
+          <w:p>
+            <w:pPr>
+              <w:spacing w:after="0" w:before="0"/>
+              <w:jc w:val="center"/>
+            </w:pPr>
+            <w:r>
+              <w:rPr>
+                <w:rFonts w:ascii="Calibri" w:cs="Calibri" w:eastAsia="Calibri" w:hAnsi="Calibri"/>
+                <w:b/>
+                <w:bCs/>
+                <w:color w:val="D9534F"/>
+                <w:sz w:val="20"/>
+                <w:szCs w:val="20"/>
+              </w:rPr>
+              <w:t xml:space="preserve">4 ↯</w:t>
+            </w:r>
+          </w:p>
+        </w:tc>
+        <w:tc>
+          <w:tcPr>
+            <w:tcW w:type="dxa" w:w="1100"/>
+            <w:tcBorders>
+              <w:top w:val="single" w:color="B9C6E8" w:sz="6"/>
+              <w:left w:val="single" w:color="B9C6E8" w:sz="6"/>
+              <w:bottom w:val="single" w:color="B9C6E8" w:sz="6"/>
+              <w:right w:val="single" w:color="B9C6E8" w:sz="6"/>
+            </w:tcBorders>
+            <w:shd w:fill="FBECEB" w:color="auto" w:val="clear"/>
+            <w:tcMar>
+              <w:top w:type="dxa" w:w="40"/>
+              <w:left w:type="dxa" w:w="100"/>
+              <w:bottom w:type="dxa" w:w="40"/>
+              <w:right w:type="dxa" w:w="100"/>
+            </w:tcMar>
+            <w:vAlign w:val="center"/>
+          </w:tcPr>
+          <w:p>
+            <w:pPr>
+              <w:spacing w:after="0" w:before="0"/>
+            </w:pPr>
+            <w:r>
+              <w:rPr>
+                <w:rFonts w:ascii="Calibri" w:cs="Calibri" w:eastAsia="Calibri" w:hAnsi="Calibri"/>
+                <w:b/>
+                <w:bCs/>
+                <w:color w:val="D9534F"/>
+                <w:sz w:val="20"/>
+                <w:szCs w:val="20"/>
+              </w:rPr>
+              <w:t xml:space="preserve">Tom</w:t>
+            </w:r>
+          </w:p>
+        </w:tc>
+        <w:tc>
+          <w:tcPr>
+            <w:tcW w:type="dxa" w:w="8406"/>
+            <w:tcBorders>
+              <w:top w:val="single" w:color="B9C6E8" w:sz="6"/>
+              <w:left w:val="single" w:color="B9C6E8" w:sz="6"/>
+              <w:bottom w:val="single" w:color="B9C6E8" w:sz="6"/>
+              <w:right w:val="single" w:color="B9C6E8" w:sz="6"/>
+            </w:tcBorders>
+            <w:shd w:fill="FBECEB" w:color="auto" w:val="clear"/>
+            <w:tcMar>
+              <w:top w:type="dxa" w:w="40"/>
+              <w:left w:type="dxa" w:w="100"/>
+              <w:bottom w:type="dxa" w:w="40"/>
+              <w:right w:type="dxa" w:w="100"/>
+            </w:tcMar>
+            <w:vAlign w:val="center"/>
+          </w:tcPr>
+          <w:p>
+            <w:pPr>
+              <w:spacing w:after="0" w:before="0"/>
+            </w:pPr>
+            <w:r>
+              <w:rPr>
+                <w:rFonts w:ascii="Cambria" w:cs="Cambria" w:eastAsia="Cambria" w:hAnsi="Cambria"/>
+                <w:b/>
+                <w:bCs/>
+                <w:color w:val="000000"/>
+                <w:sz w:val="20"/>
+                <w:szCs w:val="20"/>
+              </w:rPr>
+              <w:t xml:space="preserve">Ich hatte halt dreimal Training. Nicht jeder hat so viel Freizeit wie du.</w:t>
+            </w:r>
+          </w:p>
+        </w:tc>
+      </w:tr>
+    </w:tbl>
+    <w:p>
+      <w:pPr>
+        <w:keepNext/>
+        <w:spacing w:after="0" w:before="80"/>
       </w:pPr>
       <w:r>
         <w:rPr>
@@ -3892,45 +4383,8 @@
           <w:sz w:val="20"/>
           <w:szCs w:val="20"/>
         </w:rPr>
-        <w:t xml:space="preserve">2  Umformulieren </w:t>
-      </w:r>
-      <w:r>
-        <w:rPr>
-          <w:rFonts w:ascii="Calibri" w:cs="Calibri" w:eastAsia="Calibri" w:hAnsi="Calibri"/>
-          <w:color w:val="5B6B8C"/>
-          <w:sz w:val="19"/>
-          <w:szCs w:val="19"/>
-        </w:rPr>
-        <w:t xml:space="preserve">(allein, 2 Min.) · </w:t>
-      </w:r>
-      <w:r>
-        <w:rPr>
-          <w:rFonts w:ascii="Calibri" w:cs="Calibri" w:eastAsia="Calibri" w:hAnsi="Calibri"/>
-          <w:b/>
-          <w:bCs/>
-          <w:color w:val="000000"/>
-          <w:sz w:val="20"/>
-          <w:szCs w:val="20"/>
-        </w:rPr>
-        <w:t xml:space="preserve">Tom antwortet auf Lena stattdessen: </w:t>
-      </w:r>
-      <w:r>
-        <w:rPr>
-          <w:rFonts w:ascii="Cambria" w:cs="Cambria" w:eastAsia="Cambria" w:hAnsi="Cambria"/>
-          <w:i/>
-          <w:iCs/>
-          <w:color w:val="000000"/>
-          <w:sz w:val="20"/>
-          <w:szCs w:val="20"/>
-        </w:rPr>
-        <w:t xml:space="preserve">„Ich hatte halt dreimal Training. Nicht jeder hat so viel Freizeit wie du.“</w:t>
-      </w:r>
-    </w:p>
-    <w:p>
-      <w:pPr>
-        <w:keepNext/>
-        <w:spacing w:after="0" w:before="0"/>
-      </w:pPr>
+        <w:t xml:space="preserve">Tom sagt stattdessen:</w:t>
+      </w:r>
       <w:r>
         <w:rPr>
           <w:rFonts w:ascii="Calibri" w:cs="Calibri" w:eastAsia="Calibri" w:hAnsi="Calibri"/>
@@ -3940,7 +4394,7 @@
           <w:sz w:val="17"/>
           <w:szCs w:val="17"/>
         </w:rPr>
-        <w:t xml:space="preserve">Hilfe, wenn du nicht weiterkommst: „Du bist gerade …, weil …, oder? Das verstehe ich.“</w:t>
+        <w:t xml:space="preserve">   Hilfe: „Du bist gerade …, weil …, oder? Das verstehe ich.“</w:t>
       </w:r>
     </w:p>
     <w:tbl>
@@ -4386,7 +4840,271 @@
     <w:p>
       <w:pPr>
         <w:keepNext/>
-        <w:spacing w:after="0" w:before="100"/>
+        <w:spacing w:after="40" w:before="120"/>
+      </w:pPr>
+      <w:r>
+        <w:rPr>
+          <w:rFonts w:ascii="Calibri" w:cs="Calibri" w:eastAsia="Calibri" w:hAnsi="Calibri"/>
+          <w:b/>
+          <w:bCs/>
+          <w:color w:val="E8A33D"/>
+          <w:sz w:val="22"/>
+          <w:szCs w:val="22"/>
+        </w:rPr>
+        <w:t xml:space="preserve">2  ✍ M1 umschreiben </w:t>
+      </w:r>
+      <w:r>
+        <w:rPr>
+          <w:rFonts w:ascii="Calibri" w:cs="Calibri" w:eastAsia="Calibri" w:hAnsi="Calibri"/>
+          <w:color w:val="5B6B8C"/>
+          <w:sz w:val="19"/>
+          <w:szCs w:val="19"/>
+        </w:rPr>
+        <w:t xml:space="preserve">(allein, 2 Min.)</w:t>
+      </w:r>
+    </w:p>
+    <w:tbl>
+      <w:tblPr>
+        <w:tblW w:type="dxa" w:w="10206"/>
+        <w:tblBorders>
+          <w:top w:val="single" w:color="auto" w:sz="4"/>
+          <w:left w:val="single" w:color="auto" w:sz="4"/>
+          <w:bottom w:val="single" w:color="auto" w:sz="4"/>
+          <w:right w:val="single" w:color="auto" w:sz="4"/>
+          <w:insideH w:val="single" w:color="auto" w:sz="4"/>
+          <w:insideV w:val="single" w:color="auto" w:sz="4"/>
+        </w:tblBorders>
+      </w:tblPr>
+      <w:tblGrid>
+        <w:gridCol w:w="700"/>
+        <w:gridCol w:w="1100"/>
+        <w:gridCol w:w="8406"/>
+      </w:tblGrid>
+      <w:tr>
+        <w:trPr>
+          <w:cantSplit/>
+        </w:trPr>
+        <w:tc>
+          <w:tcPr>
+            <w:tcW w:type="dxa" w:w="700"/>
+            <w:tcBorders>
+              <w:top w:val="single" w:color="B9C6E8" w:sz="6"/>
+              <w:left w:val="single" w:color="B9C6E8" w:sz="6"/>
+              <w:bottom w:val="single" w:color="B9C6E8" w:sz="6"/>
+              <w:right w:val="single" w:color="B9C6E8" w:sz="6"/>
+            </w:tcBorders>
+            <w:shd w:fill="F4F7FD" w:color="auto" w:val="clear"/>
+            <w:tcMar>
+              <w:top w:type="dxa" w:w="30"/>
+              <w:left w:type="dxa" w:w="100"/>
+              <w:bottom w:type="dxa" w:w="30"/>
+              <w:right w:type="dxa" w:w="100"/>
+            </w:tcMar>
+            <w:vAlign w:val="center"/>
+          </w:tcPr>
+          <w:p>
+            <w:pPr>
+              <w:spacing w:after="0" w:before="0"/>
+              <w:jc w:val="center"/>
+            </w:pPr>
+            <w:r>
+              <w:rPr>
+                <w:rFonts w:ascii="Calibri" w:cs="Calibri" w:eastAsia="Calibri" w:hAnsi="Calibri"/>
+                <w:b/>
+                <w:bCs/>
+                <w:color w:val="5B6B8C"/>
+                <w:sz w:val="18"/>
+                <w:szCs w:val="18"/>
+              </w:rPr>
+              <w:t xml:space="preserve">4</w:t>
+            </w:r>
+          </w:p>
+        </w:tc>
+        <w:tc>
+          <w:tcPr>
+            <w:tcW w:type="dxa" w:w="1100"/>
+            <w:tcBorders>
+              <w:top w:val="single" w:color="B9C6E8" w:sz="6"/>
+              <w:left w:val="single" w:color="B9C6E8" w:sz="6"/>
+              <w:bottom w:val="single" w:color="B9C6E8" w:sz="6"/>
+              <w:right w:val="single" w:color="B9C6E8" w:sz="6"/>
+            </w:tcBorders>
+            <w:shd w:fill="F4F7FD" w:color="auto" w:val="clear"/>
+            <w:tcMar>
+              <w:top w:type="dxa" w:w="30"/>
+              <w:left w:type="dxa" w:w="100"/>
+              <w:bottom w:type="dxa" w:w="30"/>
+              <w:right w:type="dxa" w:w="100"/>
+            </w:tcMar>
+            <w:vAlign w:val="center"/>
+          </w:tcPr>
+          <w:p>
+            <w:pPr>
+              <w:spacing w:after="0" w:before="0"/>
+            </w:pPr>
+            <w:r>
+              <w:rPr>
+                <w:rFonts w:ascii="Calibri" w:cs="Calibri" w:eastAsia="Calibri" w:hAnsi="Calibri"/>
+                <w:b/>
+                <w:bCs/>
+                <w:color w:val="5B6B8C"/>
+                <w:sz w:val="18"/>
+                <w:szCs w:val="18"/>
+              </w:rPr>
+              <w:t xml:space="preserve">Tom</w:t>
+            </w:r>
+          </w:p>
+        </w:tc>
+        <w:tc>
+          <w:tcPr>
+            <w:tcW w:type="dxa" w:w="8406"/>
+            <w:tcBorders>
+              <w:top w:val="single" w:color="B9C6E8" w:sz="6"/>
+              <w:left w:val="single" w:color="B9C6E8" w:sz="6"/>
+              <w:bottom w:val="single" w:color="B9C6E8" w:sz="6"/>
+              <w:right w:val="single" w:color="B9C6E8" w:sz="6"/>
+            </w:tcBorders>
+            <w:shd w:fill="F4F7FD" w:color="auto" w:val="clear"/>
+            <w:tcMar>
+              <w:top w:type="dxa" w:w="30"/>
+              <w:left w:type="dxa" w:w="100"/>
+              <w:bottom w:type="dxa" w:w="30"/>
+              <w:right w:type="dxa" w:w="100"/>
+            </w:tcMar>
+            <w:vAlign w:val="center"/>
+          </w:tcPr>
+          <w:p>
+            <w:pPr>
+              <w:spacing w:after="0" w:before="0"/>
+            </w:pPr>
+            <w:r>
+              <w:rPr>
+                <w:rFonts w:ascii="Cambria" w:cs="Cambria" w:eastAsia="Cambria" w:hAnsi="Cambria"/>
+                <w:color w:val="5B6B8C"/>
+                <w:sz w:val="19"/>
+                <w:szCs w:val="19"/>
+              </w:rPr>
+              <w:t xml:space="preserve">Ich hatte halt dreimal Training. Nicht jeder hat so viel Freizeit wie du.</w:t>
+            </w:r>
+          </w:p>
+        </w:tc>
+      </w:tr>
+      <w:tr>
+        <w:trPr>
+          <w:cantSplit/>
+        </w:trPr>
+        <w:tc>
+          <w:tcPr>
+            <w:tcW w:type="dxa" w:w="700"/>
+            <w:tcBorders>
+              <w:top w:val="single" w:color="B9C6E8" w:sz="6"/>
+              <w:left w:val="single" w:color="B9C6E8" w:sz="6"/>
+              <w:bottom w:val="single" w:color="B9C6E8" w:sz="6"/>
+              <w:right w:val="single" w:color="B9C6E8" w:sz="6"/>
+            </w:tcBorders>
+            <w:shd w:fill="FBECEB" w:color="auto" w:val="clear"/>
+            <w:tcMar>
+              <w:top w:type="dxa" w:w="40"/>
+              <w:left w:type="dxa" w:w="100"/>
+              <w:bottom w:type="dxa" w:w="40"/>
+              <w:right w:type="dxa" w:w="100"/>
+            </w:tcMar>
+            <w:vAlign w:val="center"/>
+          </w:tcPr>
+          <w:p>
+            <w:pPr>
+              <w:spacing w:after="0" w:before="0"/>
+              <w:jc w:val="center"/>
+            </w:pPr>
+            <w:r>
+              <w:rPr>
+                <w:rFonts w:ascii="Calibri" w:cs="Calibri" w:eastAsia="Calibri" w:hAnsi="Calibri"/>
+                <w:b/>
+                <w:bCs/>
+                <w:color w:val="D9534F"/>
+                <w:sz w:val="20"/>
+                <w:szCs w:val="20"/>
+              </w:rPr>
+              <w:t xml:space="preserve">5 ↯</w:t>
+            </w:r>
+          </w:p>
+        </w:tc>
+        <w:tc>
+          <w:tcPr>
+            <w:tcW w:type="dxa" w:w="1100"/>
+            <w:tcBorders>
+              <w:top w:val="single" w:color="B9C6E8" w:sz="6"/>
+              <w:left w:val="single" w:color="B9C6E8" w:sz="6"/>
+              <w:bottom w:val="single" w:color="B9C6E8" w:sz="6"/>
+              <w:right w:val="single" w:color="B9C6E8" w:sz="6"/>
+            </w:tcBorders>
+            <w:shd w:fill="FBECEB" w:color="auto" w:val="clear"/>
+            <w:tcMar>
+              <w:top w:type="dxa" w:w="40"/>
+              <w:left w:type="dxa" w:w="100"/>
+              <w:bottom w:type="dxa" w:w="40"/>
+              <w:right w:type="dxa" w:w="100"/>
+            </w:tcMar>
+            <w:vAlign w:val="center"/>
+          </w:tcPr>
+          <w:p>
+            <w:pPr>
+              <w:spacing w:after="0" w:before="0"/>
+            </w:pPr>
+            <w:r>
+              <w:rPr>
+                <w:rFonts w:ascii="Calibri" w:cs="Calibri" w:eastAsia="Calibri" w:hAnsi="Calibri"/>
+                <w:b/>
+                <w:bCs/>
+                <w:color w:val="D9534F"/>
+                <w:sz w:val="20"/>
+                <w:szCs w:val="20"/>
+              </w:rPr>
+              <w:t xml:space="preserve">Lena</w:t>
+            </w:r>
+          </w:p>
+        </w:tc>
+        <w:tc>
+          <w:tcPr>
+            <w:tcW w:type="dxa" w:w="8406"/>
+            <w:tcBorders>
+              <w:top w:val="single" w:color="B9C6E8" w:sz="6"/>
+              <w:left w:val="single" w:color="B9C6E8" w:sz="6"/>
+              <w:bottom w:val="single" w:color="B9C6E8" w:sz="6"/>
+              <w:right w:val="single" w:color="B9C6E8" w:sz="6"/>
+            </w:tcBorders>
+            <w:shd w:fill="FBECEB" w:color="auto" w:val="clear"/>
+            <w:tcMar>
+              <w:top w:type="dxa" w:w="40"/>
+              <w:left w:type="dxa" w:w="100"/>
+              <w:bottom w:type="dxa" w:w="40"/>
+              <w:right w:type="dxa" w:w="100"/>
+            </w:tcMar>
+            <w:vAlign w:val="center"/>
+          </w:tcPr>
+          <w:p>
+            <w:pPr>
+              <w:spacing w:after="0" w:before="0"/>
+            </w:pPr>
+            <w:r>
+              <w:rPr>
+                <w:rFonts w:ascii="Cambria" w:cs="Cambria" w:eastAsia="Cambria" w:hAnsi="Cambria"/>
+                <w:b/>
+                <w:bCs/>
+                <w:color w:val="000000"/>
+                <w:sz w:val="20"/>
+                <w:szCs w:val="20"/>
+              </w:rPr>
+              <w:t xml:space="preserve">Freizeit? Ich hab die komplette Gliederung gemacht! Immer bleibt alles an mir hängen.</w:t>
+            </w:r>
+          </w:p>
+        </w:tc>
+      </w:tr>
+    </w:tbl>
+    <w:p>
+      <w:pPr>
+        <w:keepNext/>
+        <w:spacing w:after="0" w:before="80"/>
       </w:pPr>
       <w:r>
         <w:rPr>
@@ -4397,45 +5115,8 @@
           <w:sz w:val="20"/>
           <w:szCs w:val="20"/>
         </w:rPr>
-        <w:t xml:space="preserve">2  Umformulieren </w:t>
-      </w:r>
-      <w:r>
-        <w:rPr>
-          <w:rFonts w:ascii="Calibri" w:cs="Calibri" w:eastAsia="Calibri" w:hAnsi="Calibri"/>
-          <w:color w:val="5B6B8C"/>
-          <w:sz w:val="19"/>
-          <w:szCs w:val="19"/>
-        </w:rPr>
-        <w:t xml:space="preserve">(allein, 2 Min.) · </w:t>
-      </w:r>
-      <w:r>
-        <w:rPr>
-          <w:rFonts w:ascii="Calibri" w:cs="Calibri" w:eastAsia="Calibri" w:hAnsi="Calibri"/>
-          <w:b/>
-          <w:bCs/>
-          <w:color w:val="000000"/>
-          <w:sz w:val="20"/>
-          <w:szCs w:val="20"/>
-        </w:rPr>
-        <w:t xml:space="preserve">Lena sagt stattdessen: </w:t>
-      </w:r>
-      <w:r>
-        <w:rPr>
-          <w:rFonts w:ascii="Cambria" w:cs="Cambria" w:eastAsia="Cambria" w:hAnsi="Cambria"/>
-          <w:i/>
-          <w:iCs/>
-          <w:color w:val="000000"/>
-          <w:sz w:val="20"/>
-          <w:szCs w:val="20"/>
-        </w:rPr>
-        <w:t xml:space="preserve">„Freizeit? Ich hab die komplette Gliederung gemacht! Immer bleibt alles an mir hängen.“</w:t>
-      </w:r>
-    </w:p>
-    <w:p>
-      <w:pPr>
-        <w:keepNext/>
-        <w:spacing w:after="0" w:before="0"/>
-      </w:pPr>
+        <w:t xml:space="preserve">Lena sagt stattdessen:</w:t>
+      </w:r>
       <w:r>
         <w:rPr>
           <w:rFonts w:ascii="Calibri" w:cs="Calibri" w:eastAsia="Calibri" w:hAnsi="Calibri"/>
@@ -4445,7 +5126,7 @@
           <w:sz w:val="17"/>
           <w:szCs w:val="17"/>
         </w:rPr>
-        <w:t xml:space="preserve">Hilfe, wenn du nicht weiterkommst: „Mir ist wichtig, dass … Kannst du … bis …?“</w:t>
+        <w:t xml:space="preserve">   Hilfe: „Mir ist wichtig, dass … Kannst du … bis …?“</w:t>
       </w:r>
     </w:p>
     <w:tbl>
@@ -4888,7 +5569,271 @@
     <w:p>
       <w:pPr>
         <w:keepNext/>
-        <w:spacing w:after="0" w:before="100"/>
+        <w:spacing w:after="40" w:before="120"/>
+      </w:pPr>
+      <w:r>
+        <w:rPr>
+          <w:rFonts w:ascii="Calibri" w:cs="Calibri" w:eastAsia="Calibri" w:hAnsi="Calibri"/>
+          <w:b/>
+          <w:bCs/>
+          <w:color w:val="8E5BB5"/>
+          <w:sz w:val="22"/>
+          <w:szCs w:val="22"/>
+        </w:rPr>
+        <w:t xml:space="preserve">2  ✍ M1 umschreiben </w:t>
+      </w:r>
+      <w:r>
+        <w:rPr>
+          <w:rFonts w:ascii="Calibri" w:cs="Calibri" w:eastAsia="Calibri" w:hAnsi="Calibri"/>
+          <w:color w:val="5B6B8C"/>
+          <w:sz w:val="19"/>
+          <w:szCs w:val="19"/>
+        </w:rPr>
+        <w:t xml:space="preserve">(allein, 2 Min.)</w:t>
+      </w:r>
+    </w:p>
+    <w:tbl>
+      <w:tblPr>
+        <w:tblW w:type="dxa" w:w="10206"/>
+        <w:tblBorders>
+          <w:top w:val="single" w:color="auto" w:sz="4"/>
+          <w:left w:val="single" w:color="auto" w:sz="4"/>
+          <w:bottom w:val="single" w:color="auto" w:sz="4"/>
+          <w:right w:val="single" w:color="auto" w:sz="4"/>
+          <w:insideH w:val="single" w:color="auto" w:sz="4"/>
+          <w:insideV w:val="single" w:color="auto" w:sz="4"/>
+        </w:tblBorders>
+      </w:tblPr>
+      <w:tblGrid>
+        <w:gridCol w:w="700"/>
+        <w:gridCol w:w="1100"/>
+        <w:gridCol w:w="8406"/>
+      </w:tblGrid>
+      <w:tr>
+        <w:trPr>
+          <w:cantSplit/>
+        </w:trPr>
+        <w:tc>
+          <w:tcPr>
+            <w:tcW w:type="dxa" w:w="700"/>
+            <w:tcBorders>
+              <w:top w:val="single" w:color="B9C6E8" w:sz="6"/>
+              <w:left w:val="single" w:color="B9C6E8" w:sz="6"/>
+              <w:bottom w:val="single" w:color="B9C6E8" w:sz="6"/>
+              <w:right w:val="single" w:color="B9C6E8" w:sz="6"/>
+            </w:tcBorders>
+            <w:shd w:fill="F4F7FD" w:color="auto" w:val="clear"/>
+            <w:tcMar>
+              <w:top w:type="dxa" w:w="30"/>
+              <w:left w:type="dxa" w:w="100"/>
+              <w:bottom w:type="dxa" w:w="30"/>
+              <w:right w:type="dxa" w:w="100"/>
+            </w:tcMar>
+            <w:vAlign w:val="center"/>
+          </w:tcPr>
+          <w:p>
+            <w:pPr>
+              <w:spacing w:after="0" w:before="0"/>
+              <w:jc w:val="center"/>
+            </w:pPr>
+            <w:r>
+              <w:rPr>
+                <w:rFonts w:ascii="Calibri" w:cs="Calibri" w:eastAsia="Calibri" w:hAnsi="Calibri"/>
+                <w:b/>
+                <w:bCs/>
+                <w:color w:val="5B6B8C"/>
+                <w:sz w:val="18"/>
+                <w:szCs w:val="18"/>
+              </w:rPr>
+              <w:t xml:space="preserve">6</w:t>
+            </w:r>
+          </w:p>
+        </w:tc>
+        <w:tc>
+          <w:tcPr>
+            <w:tcW w:type="dxa" w:w="1100"/>
+            <w:tcBorders>
+              <w:top w:val="single" w:color="B9C6E8" w:sz="6"/>
+              <w:left w:val="single" w:color="B9C6E8" w:sz="6"/>
+              <w:bottom w:val="single" w:color="B9C6E8" w:sz="6"/>
+              <w:right w:val="single" w:color="B9C6E8" w:sz="6"/>
+            </w:tcBorders>
+            <w:shd w:fill="F4F7FD" w:color="auto" w:val="clear"/>
+            <w:tcMar>
+              <w:top w:type="dxa" w:w="30"/>
+              <w:left w:type="dxa" w:w="100"/>
+              <w:bottom w:type="dxa" w:w="30"/>
+              <w:right w:type="dxa" w:w="100"/>
+            </w:tcMar>
+            <w:vAlign w:val="center"/>
+          </w:tcPr>
+          <w:p>
+            <w:pPr>
+              <w:spacing w:after="0" w:before="0"/>
+            </w:pPr>
+            <w:r>
+              <w:rPr>
+                <w:rFonts w:ascii="Calibri" w:cs="Calibri" w:eastAsia="Calibri" w:hAnsi="Calibri"/>
+                <w:b/>
+                <w:bCs/>
+                <w:color w:val="5B6B8C"/>
+                <w:sz w:val="18"/>
+                <w:szCs w:val="18"/>
+              </w:rPr>
+              <w:t xml:space="preserve">Tom</w:t>
+            </w:r>
+          </w:p>
+        </w:tc>
+        <w:tc>
+          <w:tcPr>
+            <w:tcW w:type="dxa" w:w="8406"/>
+            <w:tcBorders>
+              <w:top w:val="single" w:color="B9C6E8" w:sz="6"/>
+              <w:left w:val="single" w:color="B9C6E8" w:sz="6"/>
+              <w:bottom w:val="single" w:color="B9C6E8" w:sz="6"/>
+              <w:right w:val="single" w:color="B9C6E8" w:sz="6"/>
+            </w:tcBorders>
+            <w:shd w:fill="F4F7FD" w:color="auto" w:val="clear"/>
+            <w:tcMar>
+              <w:top w:type="dxa" w:w="30"/>
+              <w:left w:type="dxa" w:w="100"/>
+              <w:bottom w:type="dxa" w:w="30"/>
+              <w:right w:type="dxa" w:w="100"/>
+            </w:tcMar>
+            <w:vAlign w:val="center"/>
+          </w:tcPr>
+          <w:p>
+            <w:pPr>
+              <w:spacing w:after="0" w:before="0"/>
+            </w:pPr>
+            <w:r>
+              <w:rPr>
+                <w:rFonts w:ascii="Cambria" w:cs="Cambria" w:eastAsia="Cambria" w:hAnsi="Cambria"/>
+                <w:color w:val="5B6B8C"/>
+                <w:sz w:val="19"/>
+                <w:szCs w:val="19"/>
+              </w:rPr>
+              <w:t xml:space="preserve">Dann mach’s doch allein, wenn du eh alles besser kannst.</w:t>
+            </w:r>
+          </w:p>
+        </w:tc>
+      </w:tr>
+      <w:tr>
+        <w:trPr>
+          <w:cantSplit/>
+        </w:trPr>
+        <w:tc>
+          <w:tcPr>
+            <w:tcW w:type="dxa" w:w="700"/>
+            <w:tcBorders>
+              <w:top w:val="single" w:color="B9C6E8" w:sz="6"/>
+              <w:left w:val="single" w:color="B9C6E8" w:sz="6"/>
+              <w:bottom w:val="single" w:color="B9C6E8" w:sz="6"/>
+              <w:right w:val="single" w:color="B9C6E8" w:sz="6"/>
+            </w:tcBorders>
+            <w:shd w:fill="FBECEB" w:color="auto" w:val="clear"/>
+            <w:tcMar>
+              <w:top w:type="dxa" w:w="40"/>
+              <w:left w:type="dxa" w:w="100"/>
+              <w:bottom w:type="dxa" w:w="40"/>
+              <w:right w:type="dxa" w:w="100"/>
+            </w:tcMar>
+            <w:vAlign w:val="center"/>
+          </w:tcPr>
+          <w:p>
+            <w:pPr>
+              <w:spacing w:after="0" w:before="0"/>
+              <w:jc w:val="center"/>
+            </w:pPr>
+            <w:r>
+              <w:rPr>
+                <w:rFonts w:ascii="Calibri" w:cs="Calibri" w:eastAsia="Calibri" w:hAnsi="Calibri"/>
+                <w:b/>
+                <w:bCs/>
+                <w:color w:val="D9534F"/>
+                <w:sz w:val="20"/>
+                <w:szCs w:val="20"/>
+              </w:rPr>
+              <w:t xml:space="preserve">7 ↯</w:t>
+            </w:r>
+          </w:p>
+        </w:tc>
+        <w:tc>
+          <w:tcPr>
+            <w:tcW w:type="dxa" w:w="1100"/>
+            <w:tcBorders>
+              <w:top w:val="single" w:color="B9C6E8" w:sz="6"/>
+              <w:left w:val="single" w:color="B9C6E8" w:sz="6"/>
+              <w:bottom w:val="single" w:color="B9C6E8" w:sz="6"/>
+              <w:right w:val="single" w:color="B9C6E8" w:sz="6"/>
+            </w:tcBorders>
+            <w:shd w:fill="FBECEB" w:color="auto" w:val="clear"/>
+            <w:tcMar>
+              <w:top w:type="dxa" w:w="40"/>
+              <w:left w:type="dxa" w:w="100"/>
+              <w:bottom w:type="dxa" w:w="40"/>
+              <w:right w:type="dxa" w:w="100"/>
+            </w:tcMar>
+            <w:vAlign w:val="center"/>
+          </w:tcPr>
+          <w:p>
+            <w:pPr>
+              <w:spacing w:after="0" w:before="0"/>
+            </w:pPr>
+            <w:r>
+              <w:rPr>
+                <w:rFonts w:ascii="Calibri" w:cs="Calibri" w:eastAsia="Calibri" w:hAnsi="Calibri"/>
+                <w:b/>
+                <w:bCs/>
+                <w:color w:val="D9534F"/>
+                <w:sz w:val="20"/>
+                <w:szCs w:val="20"/>
+              </w:rPr>
+              <w:t xml:space="preserve">Lena</w:t>
+            </w:r>
+          </w:p>
+        </w:tc>
+        <w:tc>
+          <w:tcPr>
+            <w:tcW w:type="dxa" w:w="8406"/>
+            <w:tcBorders>
+              <w:top w:val="single" w:color="B9C6E8" w:sz="6"/>
+              <w:left w:val="single" w:color="B9C6E8" w:sz="6"/>
+              <w:bottom w:val="single" w:color="B9C6E8" w:sz="6"/>
+              <w:right w:val="single" w:color="B9C6E8" w:sz="6"/>
+            </w:tcBorders>
+            <w:shd w:fill="FBECEB" w:color="auto" w:val="clear"/>
+            <w:tcMar>
+              <w:top w:type="dxa" w:w="40"/>
+              <w:left w:type="dxa" w:w="100"/>
+              <w:bottom w:type="dxa" w:w="40"/>
+              <w:right w:type="dxa" w:w="100"/>
+            </w:tcMar>
+            <w:vAlign w:val="center"/>
+          </w:tcPr>
+          <w:p>
+            <w:pPr>
+              <w:spacing w:after="0" w:before="0"/>
+            </w:pPr>
+            <w:r>
+              <w:rPr>
+                <w:rFonts w:ascii="Cambria" w:cs="Cambria" w:eastAsia="Cambria" w:hAnsi="Cambria"/>
+                <w:b/>
+                <w:bCs/>
+                <w:color w:val="000000"/>
+                <w:sz w:val="20"/>
+                <w:szCs w:val="20"/>
+              </w:rPr>
+              <w:t xml:space="preserve">Super. Genau das hab ich von dir erwartet.</w:t>
+            </w:r>
+          </w:p>
+        </w:tc>
+      </w:tr>
+    </w:tbl>
+    <w:p>
+      <w:pPr>
+        <w:keepNext/>
+        <w:spacing w:after="0" w:before="80"/>
       </w:pPr>
       <w:r>
         <w:rPr>
@@ -4899,45 +5844,8 @@
           <w:sz w:val="20"/>
           <w:szCs w:val="20"/>
         </w:rPr>
-        <w:t xml:space="preserve">2  Umformulieren </w:t>
-      </w:r>
-      <w:r>
-        <w:rPr>
-          <w:rFonts w:ascii="Calibri" w:cs="Calibri" w:eastAsia="Calibri" w:hAnsi="Calibri"/>
-          <w:color w:val="5B6B8C"/>
-          <w:sz w:val="19"/>
-          <w:szCs w:val="19"/>
-        </w:rPr>
-        <w:t xml:space="preserve">(allein, 2 Min.) · </w:t>
-      </w:r>
-      <w:r>
-        <w:rPr>
-          <w:rFonts w:ascii="Calibri" w:cs="Calibri" w:eastAsia="Calibri" w:hAnsi="Calibri"/>
-          <w:b/>
-          <w:bCs/>
-          <w:color w:val="000000"/>
-          <w:sz w:val="20"/>
-          <w:szCs w:val="20"/>
-        </w:rPr>
-        <w:t xml:space="preserve">Lena sagt stattdessen: </w:t>
-      </w:r>
-      <w:r>
-        <w:rPr>
-          <w:rFonts w:ascii="Cambria" w:cs="Cambria" w:eastAsia="Cambria" w:hAnsi="Cambria"/>
-          <w:i/>
-          <w:iCs/>
-          <w:color w:val="000000"/>
-          <w:sz w:val="20"/>
-          <w:szCs w:val="20"/>
-        </w:rPr>
-        <w:t xml:space="preserve">„Super. Genau das hab ich von dir erwartet.“</w:t>
-      </w:r>
-    </w:p>
-    <w:p>
-      <w:pPr>
-        <w:keepNext/>
-        <w:spacing w:after="0" w:before="0"/>
-      </w:pPr>
+        <w:t xml:space="preserve">Lena sagt stattdessen:</w:t>
+      </w:r>
       <w:r>
         <w:rPr>
           <w:rFonts w:ascii="Calibri" w:cs="Calibri" w:eastAsia="Calibri" w:hAnsi="Calibri"/>
@@ -4947,7 +5855,7 @@
           <w:sz w:val="17"/>
           <w:szCs w:val="17"/>
         </w:rPr>
-        <w:t xml:space="preserve">Hilfe, wenn du nicht weiterkommst: „Moment, ich merke, wir … Eigentlich wollen wir doch …“</w:t>
+        <w:t xml:space="preserve">   Hilfe: „Moment, ich merke, wir … Eigentlich wollen wir doch …“</w:t>
       </w:r>
     </w:p>
     <w:tbl>

</xml_diff>